<commit_message>
add AWS SAM notrs
</commit_message>
<xml_diff>
--- a/AWS/SAM/Notes.docx
+++ b/AWS/SAM/Notes.docx
@@ -105,27 +105,15 @@
           <w:szCs w:val="22"/>
         </w:rPr>
       </w:pPr>
-      <w:proofErr w:type="gramStart"/>
-      <w:r>
-        <w:rPr>
-          <w:b/>
-          <w:bCs/>
-          <w:color w:val="000000" w:themeColor="text1"/>
-          <w:sz w:val="22"/>
-          <w:szCs w:val="22"/>
-        </w:rPr>
-        <w:t>AWS::serverless::</w:t>
-      </w:r>
-      <w:proofErr w:type="gramEnd"/>
-      <w:r>
-        <w:rPr>
-          <w:b/>
-          <w:bCs/>
-          <w:color w:val="000000" w:themeColor="text1"/>
-          <w:sz w:val="22"/>
-          <w:szCs w:val="22"/>
-        </w:rPr>
-        <w:t>Function</w:t>
+      <w:r>
+        <w:rPr>
+          <w:b/>
+          <w:bCs/>
+          <w:color w:val="000000" w:themeColor="text1"/>
+          <w:sz w:val="22"/>
+          <w:szCs w:val="22"/>
+        </w:rPr>
+        <w:t>AWS::serverless::Function</w:t>
       </w:r>
       <w:r>
         <w:rPr>
@@ -183,27 +171,15 @@
           <w:szCs w:val="22"/>
         </w:rPr>
       </w:pPr>
-      <w:proofErr w:type="gramStart"/>
-      <w:r>
-        <w:rPr>
-          <w:b/>
-          <w:bCs/>
-          <w:color w:val="000000" w:themeColor="text1"/>
-          <w:sz w:val="22"/>
-          <w:szCs w:val="22"/>
-        </w:rPr>
-        <w:t>AWS::serverless::</w:t>
-      </w:r>
-      <w:proofErr w:type="gramEnd"/>
-      <w:r>
-        <w:rPr>
-          <w:b/>
-          <w:bCs/>
-          <w:color w:val="000000" w:themeColor="text1"/>
-          <w:sz w:val="22"/>
-          <w:szCs w:val="22"/>
-        </w:rPr>
-        <w:t>Api</w:t>
+      <w:r>
+        <w:rPr>
+          <w:b/>
+          <w:bCs/>
+          <w:color w:val="000000" w:themeColor="text1"/>
+          <w:sz w:val="22"/>
+          <w:szCs w:val="22"/>
+        </w:rPr>
+        <w:t>AWS::serverless::Api</w:t>
       </w:r>
       <w:r>
         <w:rPr>
@@ -277,7 +253,6 @@
           <w:szCs w:val="22"/>
         </w:rPr>
       </w:pPr>
-      <w:proofErr w:type="gramStart"/>
       <w:r>
         <w:rPr>
           <w:b/>
@@ -289,7 +264,6 @@
         <w:t>AWS::serverless::</w:t>
       </w:r>
       <w:proofErr w:type="spellStart"/>
-      <w:proofErr w:type="gramEnd"/>
       <w:r>
         <w:rPr>
           <w:b/>
@@ -331,25 +305,7 @@
           <w:sz w:val="22"/>
           <w:szCs w:val="22"/>
         </w:rPr>
-        <w:t xml:space="preserve">This is also an API Gateway API, but it's </w:t>
-      </w:r>
-      <w:proofErr w:type="gramStart"/>
-      <w:r>
-        <w:rPr>
-          <w:color w:val="000000" w:themeColor="text1"/>
-          <w:sz w:val="22"/>
-          <w:szCs w:val="22"/>
-        </w:rPr>
-        <w:t>an HTTP</w:t>
-      </w:r>
-      <w:proofErr w:type="gramEnd"/>
-      <w:r>
-        <w:rPr>
-          <w:color w:val="000000" w:themeColor="text1"/>
-          <w:sz w:val="22"/>
-          <w:szCs w:val="22"/>
-        </w:rPr>
-        <w:t xml:space="preserve"> API rather than a REST API.</w:t>
+        <w:t>This is also an API Gateway API, but it's an HTTP API rather than a REST API.</w:t>
       </w:r>
     </w:p>
     <w:p>
@@ -365,7 +321,6 @@
           <w:szCs w:val="22"/>
         </w:rPr>
       </w:pPr>
-      <w:proofErr w:type="gramStart"/>
       <w:r>
         <w:rPr>
           <w:b/>
@@ -377,7 +332,6 @@
         <w:t>AWS::serverless::</w:t>
       </w:r>
       <w:proofErr w:type="spellStart"/>
-      <w:proofErr w:type="gramEnd"/>
       <w:r>
         <w:rPr>
           <w:b/>
@@ -429,25 +383,7 @@
           <w:sz w:val="22"/>
           <w:szCs w:val="22"/>
         </w:rPr>
-        <w:t xml:space="preserve"> is intentionally a simplified SAM resource. If you need more advanced DynamoDB configuration, you'd normally use </w:t>
-      </w:r>
-      <w:proofErr w:type="gramStart"/>
-      <w:r>
-        <w:rPr>
-          <w:color w:val="000000" w:themeColor="text1"/>
-          <w:sz w:val="22"/>
-          <w:szCs w:val="22"/>
-        </w:rPr>
-        <w:t>AWS::DynamoDB::</w:t>
-      </w:r>
-      <w:proofErr w:type="gramEnd"/>
-      <w:r>
-        <w:rPr>
-          <w:color w:val="000000" w:themeColor="text1"/>
-          <w:sz w:val="22"/>
-          <w:szCs w:val="22"/>
-        </w:rPr>
-        <w:t>Table directly.</w:t>
+        <w:t xml:space="preserve"> is intentionally a simplified SAM resource. If you need more advanced DynamoDB configuration, you'd normally use AWS::DynamoDB::Table directly.</w:t>
       </w:r>
     </w:p>
     <w:p>
@@ -463,27 +399,15 @@
           <w:szCs w:val="22"/>
         </w:rPr>
       </w:pPr>
-      <w:proofErr w:type="gramStart"/>
-      <w:r>
-        <w:rPr>
-          <w:b/>
-          <w:bCs/>
-          <w:color w:val="000000" w:themeColor="text1"/>
-          <w:sz w:val="22"/>
-          <w:szCs w:val="22"/>
-        </w:rPr>
-        <w:t>AWS::serverless::</w:t>
-      </w:r>
-      <w:proofErr w:type="gramEnd"/>
-      <w:r>
-        <w:rPr>
-          <w:b/>
-          <w:bCs/>
-          <w:color w:val="000000" w:themeColor="text1"/>
-          <w:sz w:val="22"/>
-          <w:szCs w:val="22"/>
-        </w:rPr>
-        <w:t>Application</w:t>
+      <w:r>
+        <w:rPr>
+          <w:b/>
+          <w:bCs/>
+          <w:color w:val="000000" w:themeColor="text1"/>
+          <w:sz w:val="22"/>
+          <w:szCs w:val="22"/>
+        </w:rPr>
+        <w:t>AWS::serverless::Application</w:t>
       </w:r>
       <w:r>
         <w:rPr>
@@ -531,7 +455,6 @@
           <w:szCs w:val="22"/>
         </w:rPr>
       </w:pPr>
-      <w:proofErr w:type="gramStart"/>
       <w:r>
         <w:rPr>
           <w:b/>
@@ -543,7 +466,6 @@
         <w:t>AWS::serverless::</w:t>
       </w:r>
       <w:proofErr w:type="spellStart"/>
-      <w:proofErr w:type="gramEnd"/>
       <w:r>
         <w:rPr>
           <w:b/>
@@ -601,18 +523,8 @@
           <w:sz w:val="22"/>
           <w:szCs w:val="22"/>
         </w:rPr>
-        <w:t xml:space="preserve">The important distinction </w:t>
-      </w:r>
-      <w:proofErr w:type="gramStart"/>
-      <w:r>
-        <w:rPr>
-          <w:color w:val="000000" w:themeColor="text1"/>
-          <w:sz w:val="22"/>
-          <w:szCs w:val="22"/>
-        </w:rPr>
-        <w:t>is:</w:t>
-      </w:r>
-      <w:proofErr w:type="gramEnd"/>
+        <w:t>The important distinction is:</w:t>
+      </w:r>
       <w:r>
         <w:rPr>
           <w:color w:val="000000" w:themeColor="text1"/>
@@ -627,23 +539,7 @@
           <w:sz w:val="22"/>
           <w:szCs w:val="22"/>
         </w:rPr>
-        <w:t>Lambda does a task.</w:t>
-      </w:r>
-      <w:r>
-        <w:rPr>
-          <w:color w:val="000000" w:themeColor="text1"/>
-          <w:sz w:val="22"/>
-          <w:szCs w:val="22"/>
-        </w:rPr>
-        <w:t xml:space="preserve"> </w:t>
-      </w:r>
-      <w:r>
-        <w:rPr>
-          <w:color w:val="000000" w:themeColor="text1"/>
-          <w:sz w:val="22"/>
-          <w:szCs w:val="22"/>
-        </w:rPr>
-        <w:t>Step Functions coordinates tasks.</w:t>
+        <w:t>Lambda does a task. Step Functions coordinates tasks.</w:t>
       </w:r>
     </w:p>
     <w:p>
@@ -659,7 +555,6 @@
           <w:szCs w:val="22"/>
         </w:rPr>
       </w:pPr>
-      <w:proofErr w:type="gramStart"/>
       <w:r>
         <w:rPr>
           <w:b/>
@@ -671,7 +566,6 @@
         <w:t>AWS::serverless::</w:t>
       </w:r>
       <w:proofErr w:type="spellStart"/>
-      <w:proofErr w:type="gramEnd"/>
       <w:r>
         <w:rPr>
           <w:b/>
@@ -720,6 +614,45 @@
           <w:szCs w:val="22"/>
         </w:rPr>
         <w:t>A Lambda Layer is a reusable package of common code/dependencies, rather than a collection of Lambda resources.</w:t>
+      </w:r>
+    </w:p>
+    <w:p>
+      <w:pPr>
+        <w:pStyle w:val="NormalWeb"/>
+        <w:ind w:left="360"/>
+        <w:rPr>
+          <w:rFonts w:asciiTheme="minorHAnsi" w:eastAsiaTheme="minorHAnsi" w:hAnsiTheme="minorHAnsi" w:cstheme="minorBidi"/>
+          <w:b/>
+          <w:bCs/>
+          <w:color w:val="000000" w:themeColor="text1"/>
+          <w:kern w:val="2"/>
+          <w:u w:val="single"/>
+          <w14:ligatures w14:val="standardContextual"/>
+        </w:rPr>
+      </w:pPr>
+      <w:r>
+        <w:rPr>
+          <w:rFonts w:asciiTheme="minorHAnsi" w:eastAsiaTheme="minorHAnsi" w:hAnsiTheme="minorHAnsi" w:cstheme="minorBidi"/>
+          <w:b/>
+          <w:bCs/>
+          <w:color w:val="000000" w:themeColor="text1"/>
+          <w:kern w:val="2"/>
+          <w:u w:val="single"/>
+          <w14:ligatures w14:val="standardContextual"/>
+        </w:rPr>
+        <w:t xml:space="preserve">SAM Policies IAM explain it from the </w:t>
+      </w:r>
+      <w:r>
+        <w:rPr>
+          <w:rFonts w:asciiTheme="minorHAnsi" w:eastAsiaTheme="minorHAnsi" w:hAnsiTheme="minorHAnsi" w:cstheme="minorBidi"/>
+          <w:b/>
+          <w:bCs/>
+          <w:color w:val="000000" w:themeColor="text1"/>
+          <w:kern w:val="2"/>
+          <w:u w:val="single"/>
+          <w14:ligatures w14:val="standardContextual"/>
+        </w:rPr>
+        <w:t>beginning:</w:t>
       </w:r>
     </w:p>
     <w:p>
@@ -727,7 +660,7 @@
         <w:pStyle w:val="NormalWeb"/>
         <w:numPr>
           <w:ilvl w:val="0"/>
-          <w:numId w:val="3"/>
+          <w:numId w:val="4"/>
         </w:numPr>
         <w:rPr>
           <w:rFonts w:asciiTheme="minorHAnsi" w:eastAsiaTheme="minorHAnsi" w:hAnsiTheme="minorHAnsi" w:cstheme="minorBidi"/>
@@ -747,89 +680,480 @@
           <w:szCs w:val="22"/>
           <w14:ligatures w14:val="standardContextual"/>
         </w:rPr>
-        <w:t xml:space="preserve">SAM Policies IAM explain it from the </w:t>
-      </w:r>
-      <w:proofErr w:type="spellStart"/>
-      <w:r>
-        <w:rPr>
-          <w:rFonts w:asciiTheme="minorHAnsi" w:eastAsiaTheme="minorHAnsi" w:hAnsiTheme="minorHAnsi" w:cstheme="minorBidi"/>
-          <w:color w:val="000000" w:themeColor="text1"/>
-          <w:kern w:val="2"/>
-          <w:sz w:val="22"/>
-          <w:szCs w:val="22"/>
-          <w14:ligatures w14:val="standardContextual"/>
-        </w:rPr>
-        <w:t>begining</w:t>
-      </w:r>
-      <w:proofErr w:type="spellEnd"/>
-    </w:p>
+        <w:t>IAM = Identity and Access Management.</w:t>
+      </w:r>
+    </w:p>
+    <w:p>
+      <w:pPr>
+        <w:pStyle w:val="ListParagraph"/>
+        <w:numPr>
+          <w:ilvl w:val="0"/>
+          <w:numId w:val="4"/>
+        </w:numPr>
+      </w:pPr>
+      <w:r>
+        <w:t>T</w:t>
+      </w:r>
+      <w:r>
+        <w:t>he four IAM concepts you should know first</w:t>
+      </w:r>
+    </w:p>
+    <w:p>
+      <w:pPr>
+        <w:pStyle w:val="ListParagraph"/>
+        <w:numPr>
+          <w:ilvl w:val="0"/>
+          <w:numId w:val="4"/>
+        </w:numPr>
+      </w:pPr>
+      <w:r>
+        <w:t>We focus</w:t>
+      </w:r>
+      <w:r>
+        <w:t xml:space="preserve"> on these</w:t>
+      </w:r>
+      <w:r>
+        <w:t xml:space="preserve">: </w:t>
+      </w:r>
+      <w:r>
+        <w:t>Principal</w:t>
+      </w:r>
+      <w:r>
+        <w:t xml:space="preserve"> -&gt;</w:t>
+      </w:r>
+      <w:r>
+        <w:t>Policy</w:t>
+      </w:r>
+      <w:r>
+        <w:t xml:space="preserve"> -&gt;</w:t>
+      </w:r>
+      <w:r>
+        <w:t>Permission</w:t>
+      </w:r>
+      <w:r>
+        <w:t xml:space="preserve">-&gt; </w:t>
+      </w:r>
+      <w:r>
+        <w:t>Resource</w:t>
+      </w:r>
+    </w:p>
+    <w:tbl>
+      <w:tblPr>
+        <w:tblW w:w="6088" w:type="dxa"/>
+        <w:tblCellSpacing w:w="15" w:type="dxa"/>
+        <w:tblInd w:w="913" w:type="dxa"/>
+        <w:tblCellMar>
+          <w:top w:w="15" w:type="dxa"/>
+          <w:left w:w="15" w:type="dxa"/>
+          <w:bottom w:w="15" w:type="dxa"/>
+          <w:right w:w="15" w:type="dxa"/>
+        </w:tblCellMar>
+        <w:tblLook w:val="04A0" w:firstRow="1" w:lastRow="0" w:firstColumn="1" w:lastColumn="0" w:noHBand="0" w:noVBand="1"/>
+      </w:tblPr>
+      <w:tblGrid>
+        <w:gridCol w:w="2049"/>
+        <w:gridCol w:w="4039"/>
+      </w:tblGrid>
+      <w:tr>
+        <w:trPr>
+          <w:trHeight w:val="306"/>
+          <w:tblHeader/>
+          <w:tblCellSpacing w:w="15" w:type="dxa"/>
+        </w:trPr>
+        <w:tc>
+          <w:tcPr>
+            <w:tcW w:w="0" w:type="auto"/>
+            <w:vAlign w:val="center"/>
+            <w:hideMark/>
+          </w:tcPr>
+          <w:p>
+            <w:pPr>
+              <w:pStyle w:val="NormalWeb"/>
+              <w:ind w:left="360"/>
+              <w:rPr>
+                <w:rFonts w:asciiTheme="minorHAnsi" w:eastAsiaTheme="minorHAnsi" w:hAnsiTheme="minorHAnsi" w:cstheme="minorBidi"/>
+                <w:b/>
+                <w:bCs/>
+                <w:kern w:val="2"/>
+                <w14:ligatures w14:val="standardContextual"/>
+              </w:rPr>
+            </w:pPr>
+            <w:r>
+              <w:rPr>
+                <w:rFonts w:asciiTheme="minorHAnsi" w:eastAsiaTheme="minorHAnsi" w:hAnsiTheme="minorHAnsi" w:cstheme="minorBidi"/>
+                <w:b/>
+                <w:bCs/>
+                <w:kern w:val="2"/>
+                <w14:ligatures w14:val="standardContextual"/>
+              </w:rPr>
+              <w:t>AWS concept</w:t>
+            </w:r>
+          </w:p>
+        </w:tc>
+        <w:tc>
+          <w:tcPr>
+            <w:tcW w:w="0" w:type="auto"/>
+            <w:vAlign w:val="center"/>
+            <w:hideMark/>
+          </w:tcPr>
+          <w:p>
+            <w:pPr>
+              <w:pStyle w:val="NormalWeb"/>
+              <w:ind w:left="360"/>
+              <w:rPr>
+                <w:rFonts w:asciiTheme="minorHAnsi" w:eastAsiaTheme="minorHAnsi" w:hAnsiTheme="minorHAnsi" w:cstheme="minorBidi"/>
+                <w:b/>
+                <w:bCs/>
+                <w:kern w:val="2"/>
+                <w14:ligatures w14:val="standardContextual"/>
+              </w:rPr>
+            </w:pPr>
+            <w:r>
+              <w:rPr>
+                <w:rFonts w:asciiTheme="minorHAnsi" w:eastAsiaTheme="minorHAnsi" w:hAnsiTheme="minorHAnsi" w:cstheme="minorBidi"/>
+                <w:b/>
+                <w:bCs/>
+                <w:kern w:val="2"/>
+                <w14:ligatures w14:val="standardContextual"/>
+              </w:rPr>
+              <w:t>Real-life example</w:t>
+            </w:r>
+          </w:p>
+        </w:tc>
+      </w:tr>
+      <w:tr>
+        <w:trPr>
+          <w:trHeight w:val="306"/>
+          <w:tblCellSpacing w:w="15" w:type="dxa"/>
+        </w:trPr>
+        <w:tc>
+          <w:tcPr>
+            <w:tcW w:w="0" w:type="auto"/>
+            <w:vAlign w:val="center"/>
+            <w:hideMark/>
+          </w:tcPr>
+          <w:p>
+            <w:pPr>
+              <w:pStyle w:val="NormalWeb"/>
+              <w:ind w:left="360"/>
+              <w:rPr>
+                <w:rFonts w:asciiTheme="minorHAnsi" w:eastAsiaTheme="minorHAnsi" w:hAnsiTheme="minorHAnsi" w:cstheme="minorBidi"/>
+                <w:kern w:val="2"/>
+                <w14:ligatures w14:val="standardContextual"/>
+              </w:rPr>
+            </w:pPr>
+            <w:r>
+              <w:rPr>
+                <w:rFonts w:asciiTheme="minorHAnsi" w:eastAsiaTheme="minorHAnsi" w:hAnsiTheme="minorHAnsi" w:cstheme="minorBidi"/>
+                <w:kern w:val="2"/>
+                <w14:ligatures w14:val="standardContextual"/>
+              </w:rPr>
+              <w:t>Identity</w:t>
+            </w:r>
+          </w:p>
+        </w:tc>
+        <w:tc>
+          <w:tcPr>
+            <w:tcW w:w="0" w:type="auto"/>
+            <w:vAlign w:val="center"/>
+            <w:hideMark/>
+          </w:tcPr>
+          <w:p>
+            <w:pPr>
+              <w:pStyle w:val="NormalWeb"/>
+              <w:ind w:left="360"/>
+              <w:rPr>
+                <w:rFonts w:asciiTheme="minorHAnsi" w:eastAsiaTheme="minorHAnsi" w:hAnsiTheme="minorHAnsi" w:cstheme="minorBidi"/>
+                <w:kern w:val="2"/>
+                <w14:ligatures w14:val="standardContextual"/>
+              </w:rPr>
+            </w:pPr>
+            <w:r>
+              <w:rPr>
+                <w:rFonts w:asciiTheme="minorHAnsi" w:eastAsiaTheme="minorHAnsi" w:hAnsiTheme="minorHAnsi" w:cstheme="minorBidi"/>
+                <w:kern w:val="2"/>
+                <w14:ligatures w14:val="standardContextual"/>
+              </w:rPr>
+              <w:t>Waiter</w:t>
+            </w:r>
+          </w:p>
+        </w:tc>
+      </w:tr>
+      <w:tr>
+        <w:trPr>
+          <w:trHeight w:val="306"/>
+          <w:tblCellSpacing w:w="15" w:type="dxa"/>
+        </w:trPr>
+        <w:tc>
+          <w:tcPr>
+            <w:tcW w:w="0" w:type="auto"/>
+            <w:vAlign w:val="center"/>
+            <w:hideMark/>
+          </w:tcPr>
+          <w:p>
+            <w:pPr>
+              <w:pStyle w:val="NormalWeb"/>
+              <w:ind w:left="360"/>
+              <w:rPr>
+                <w:rFonts w:asciiTheme="minorHAnsi" w:eastAsiaTheme="minorHAnsi" w:hAnsiTheme="minorHAnsi" w:cstheme="minorBidi"/>
+                <w:kern w:val="2"/>
+                <w14:ligatures w14:val="standardContextual"/>
+              </w:rPr>
+            </w:pPr>
+            <w:r>
+              <w:rPr>
+                <w:rFonts w:asciiTheme="minorHAnsi" w:eastAsiaTheme="minorHAnsi" w:hAnsiTheme="minorHAnsi" w:cstheme="minorBidi"/>
+                <w:kern w:val="2"/>
+                <w14:ligatures w14:val="standardContextual"/>
+              </w:rPr>
+              <w:t>Resource</w:t>
+            </w:r>
+          </w:p>
+        </w:tc>
+        <w:tc>
+          <w:tcPr>
+            <w:tcW w:w="0" w:type="auto"/>
+            <w:vAlign w:val="center"/>
+            <w:hideMark/>
+          </w:tcPr>
+          <w:p>
+            <w:pPr>
+              <w:pStyle w:val="NormalWeb"/>
+              <w:ind w:left="360"/>
+              <w:rPr>
+                <w:rFonts w:asciiTheme="minorHAnsi" w:eastAsiaTheme="minorHAnsi" w:hAnsiTheme="minorHAnsi" w:cstheme="minorBidi"/>
+                <w:kern w:val="2"/>
+                <w14:ligatures w14:val="standardContextual"/>
+              </w:rPr>
+            </w:pPr>
+            <w:r>
+              <w:rPr>
+                <w:rFonts w:asciiTheme="minorHAnsi" w:eastAsiaTheme="minorHAnsi" w:hAnsiTheme="minorHAnsi" w:cstheme="minorBidi"/>
+                <w:kern w:val="2"/>
+                <w14:ligatures w14:val="standardContextual"/>
+              </w:rPr>
+              <w:t>Order book</w:t>
+            </w:r>
+          </w:p>
+        </w:tc>
+      </w:tr>
+      <w:tr>
+        <w:trPr>
+          <w:trHeight w:val="318"/>
+          <w:tblCellSpacing w:w="15" w:type="dxa"/>
+        </w:trPr>
+        <w:tc>
+          <w:tcPr>
+            <w:tcW w:w="0" w:type="auto"/>
+            <w:vAlign w:val="center"/>
+            <w:hideMark/>
+          </w:tcPr>
+          <w:p>
+            <w:pPr>
+              <w:pStyle w:val="NormalWeb"/>
+              <w:ind w:left="360"/>
+              <w:rPr>
+                <w:rFonts w:asciiTheme="minorHAnsi" w:eastAsiaTheme="minorHAnsi" w:hAnsiTheme="minorHAnsi" w:cstheme="minorBidi"/>
+                <w:kern w:val="2"/>
+                <w14:ligatures w14:val="standardContextual"/>
+              </w:rPr>
+            </w:pPr>
+            <w:r>
+              <w:rPr>
+                <w:rFonts w:asciiTheme="minorHAnsi" w:eastAsiaTheme="minorHAnsi" w:hAnsiTheme="minorHAnsi" w:cstheme="minorBidi"/>
+                <w:kern w:val="2"/>
+                <w14:ligatures w14:val="standardContextual"/>
+              </w:rPr>
+              <w:t>Action</w:t>
+            </w:r>
+          </w:p>
+        </w:tc>
+        <w:tc>
+          <w:tcPr>
+            <w:tcW w:w="0" w:type="auto"/>
+            <w:vAlign w:val="center"/>
+            <w:hideMark/>
+          </w:tcPr>
+          <w:p>
+            <w:pPr>
+              <w:pStyle w:val="NormalWeb"/>
+              <w:ind w:left="360"/>
+              <w:rPr>
+                <w:rFonts w:asciiTheme="minorHAnsi" w:eastAsiaTheme="minorHAnsi" w:hAnsiTheme="minorHAnsi" w:cstheme="minorBidi"/>
+                <w:kern w:val="2"/>
+                <w14:ligatures w14:val="standardContextual"/>
+              </w:rPr>
+            </w:pPr>
+            <w:r>
+              <w:rPr>
+                <w:rFonts w:asciiTheme="minorHAnsi" w:eastAsiaTheme="minorHAnsi" w:hAnsiTheme="minorHAnsi" w:cstheme="minorBidi"/>
+                <w:kern w:val="2"/>
+                <w14:ligatures w14:val="standardContextual"/>
+              </w:rPr>
+              <w:t>Add an order</w:t>
+            </w:r>
+          </w:p>
+        </w:tc>
+      </w:tr>
+      <w:tr>
+        <w:trPr>
+          <w:trHeight w:val="306"/>
+          <w:tblCellSpacing w:w="15" w:type="dxa"/>
+        </w:trPr>
+        <w:tc>
+          <w:tcPr>
+            <w:tcW w:w="0" w:type="auto"/>
+            <w:vAlign w:val="center"/>
+            <w:hideMark/>
+          </w:tcPr>
+          <w:p>
+            <w:pPr>
+              <w:pStyle w:val="NormalWeb"/>
+              <w:ind w:left="360"/>
+              <w:rPr>
+                <w:rFonts w:asciiTheme="minorHAnsi" w:eastAsiaTheme="minorHAnsi" w:hAnsiTheme="minorHAnsi" w:cstheme="minorBidi"/>
+                <w:kern w:val="2"/>
+                <w14:ligatures w14:val="standardContextual"/>
+              </w:rPr>
+            </w:pPr>
+            <w:r>
+              <w:rPr>
+                <w:rFonts w:asciiTheme="minorHAnsi" w:eastAsiaTheme="minorHAnsi" w:hAnsiTheme="minorHAnsi" w:cstheme="minorBidi"/>
+                <w:kern w:val="2"/>
+                <w14:ligatures w14:val="standardContextual"/>
+              </w:rPr>
+              <w:t>Policy</w:t>
+            </w:r>
+          </w:p>
+        </w:tc>
+        <w:tc>
+          <w:tcPr>
+            <w:tcW w:w="0" w:type="auto"/>
+            <w:vAlign w:val="center"/>
+            <w:hideMark/>
+          </w:tcPr>
+          <w:p>
+            <w:pPr>
+              <w:pStyle w:val="NormalWeb"/>
+              <w:ind w:left="360"/>
+              <w:rPr>
+                <w:rFonts w:asciiTheme="minorHAnsi" w:eastAsiaTheme="minorHAnsi" w:hAnsiTheme="minorHAnsi" w:cstheme="minorBidi"/>
+                <w:kern w:val="2"/>
+                <w14:ligatures w14:val="standardContextual"/>
+              </w:rPr>
+            </w:pPr>
+            <w:r>
+              <w:rPr>
+                <w:rFonts w:asciiTheme="minorHAnsi" w:eastAsiaTheme="minorHAnsi" w:hAnsiTheme="minorHAnsi" w:cstheme="minorBidi"/>
+                <w:kern w:val="2"/>
+                <w14:ligatures w14:val="standardContextual"/>
+              </w:rPr>
+              <w:t>Rules for what the waiter can do</w:t>
+            </w:r>
+          </w:p>
+        </w:tc>
+      </w:tr>
+      <w:tr>
+        <w:trPr>
+          <w:trHeight w:val="200"/>
+          <w:tblCellSpacing w:w="15" w:type="dxa"/>
+        </w:trPr>
+        <w:tc>
+          <w:tcPr>
+            <w:tcW w:w="0" w:type="auto"/>
+            <w:vAlign w:val="center"/>
+            <w:hideMark/>
+          </w:tcPr>
+          <w:p>
+            <w:pPr>
+              <w:pStyle w:val="NormalWeb"/>
+              <w:ind w:left="360"/>
+              <w:rPr>
+                <w:rFonts w:asciiTheme="minorHAnsi" w:eastAsiaTheme="minorHAnsi" w:hAnsiTheme="minorHAnsi" w:cstheme="minorBidi"/>
+                <w:kern w:val="2"/>
+                <w14:ligatures w14:val="standardContextual"/>
+              </w:rPr>
+            </w:pPr>
+            <w:r>
+              <w:rPr>
+                <w:rFonts w:asciiTheme="minorHAnsi" w:eastAsiaTheme="minorHAnsi" w:hAnsiTheme="minorHAnsi" w:cstheme="minorBidi"/>
+                <w:kern w:val="2"/>
+                <w14:ligatures w14:val="standardContextual"/>
+              </w:rPr>
+              <w:t>Permission</w:t>
+            </w:r>
+          </w:p>
+        </w:tc>
+        <w:tc>
+          <w:tcPr>
+            <w:tcW w:w="0" w:type="auto"/>
+            <w:vAlign w:val="center"/>
+            <w:hideMark/>
+          </w:tcPr>
+          <w:p>
+            <w:pPr>
+              <w:pStyle w:val="NormalWeb"/>
+              <w:ind w:left="360"/>
+              <w:rPr>
+                <w:rFonts w:asciiTheme="minorHAnsi" w:eastAsiaTheme="minorHAnsi" w:hAnsiTheme="minorHAnsi" w:cstheme="minorBidi"/>
+                <w:kern w:val="2"/>
+                <w14:ligatures w14:val="standardContextual"/>
+              </w:rPr>
+            </w:pPr>
+            <w:r>
+              <w:rPr>
+                <w:rFonts w:asciiTheme="minorHAnsi" w:eastAsiaTheme="minorHAnsi" w:hAnsiTheme="minorHAnsi" w:cstheme="minorBidi"/>
+                <w:kern w:val="2"/>
+                <w14:ligatures w14:val="standardContextual"/>
+              </w:rPr>
+              <w:t>“Waiter can add orders”</w:t>
+            </w:r>
+          </w:p>
+        </w:tc>
+      </w:tr>
+    </w:tbl>
     <w:p>
       <w:pPr>
         <w:pStyle w:val="NormalWeb"/>
         <w:numPr>
           <w:ilvl w:val="0"/>
-          <w:numId w:val="3"/>
+          <w:numId w:val="4"/>
         </w:numPr>
         <w:rPr>
           <w:rFonts w:asciiTheme="minorHAnsi" w:eastAsiaTheme="minorHAnsi" w:hAnsiTheme="minorHAnsi" w:cstheme="minorBidi"/>
-          <w:color w:val="000000" w:themeColor="text1"/>
-          <w:kern w:val="2"/>
-          <w:sz w:val="22"/>
-          <w:szCs w:val="22"/>
-          <w14:ligatures w14:val="standardContextual"/>
-        </w:rPr>
-      </w:pPr>
-      <w:r>
-        <w:rPr>
-          <w:rFonts w:asciiTheme="minorHAnsi" w:eastAsiaTheme="minorHAnsi" w:hAnsiTheme="minorHAnsi" w:cstheme="minorBidi"/>
-          <w:color w:val="000000" w:themeColor="text1"/>
-          <w:kern w:val="2"/>
-          <w:sz w:val="22"/>
-          <w:szCs w:val="22"/>
-          <w14:ligatures w14:val="standardContextual"/>
-        </w:rPr>
-        <w:t xml:space="preserve">AWS SAM </w:t>
-      </w:r>
-      <w:proofErr w:type="spellStart"/>
-      <w:r>
-        <w:rPr>
-          <w:rFonts w:asciiTheme="minorHAnsi" w:eastAsiaTheme="minorHAnsi" w:hAnsiTheme="minorHAnsi" w:cstheme="minorBidi"/>
-          <w:color w:val="000000" w:themeColor="text1"/>
-          <w:kern w:val="2"/>
-          <w:sz w:val="22"/>
-          <w:szCs w:val="22"/>
-          <w14:ligatures w14:val="standardContextual"/>
-        </w:rPr>
-        <w:t>globals</w:t>
-      </w:r>
-      <w:proofErr w:type="spellEnd"/>
+          <w:kern w:val="2"/>
+          <w14:ligatures w14:val="standardContextual"/>
+        </w:rPr>
+      </w:pPr>
+      <w:r>
+        <w:rPr>
+          <w:rFonts w:asciiTheme="minorHAnsi" w:eastAsiaTheme="minorHAnsi" w:hAnsiTheme="minorHAnsi" w:cstheme="minorBidi"/>
+          <w:kern w:val="2"/>
+          <w14:ligatures w14:val="standardContextual"/>
+        </w:rPr>
+        <w:t>An IAM policy is basically a JSON document containing permissions.</w:t>
+      </w:r>
     </w:p>
     <w:p>
       <w:pPr>
         <w:pStyle w:val="NormalWeb"/>
         <w:numPr>
           <w:ilvl w:val="0"/>
-          <w:numId w:val="3"/>
+          <w:numId w:val="4"/>
         </w:numPr>
         <w:rPr>
           <w:rFonts w:asciiTheme="minorHAnsi" w:eastAsiaTheme="minorHAnsi" w:hAnsiTheme="minorHAnsi" w:cstheme="minorBidi"/>
-          <w:color w:val="000000" w:themeColor="text1"/>
-          <w:kern w:val="2"/>
-          <w:sz w:val="22"/>
-          <w:szCs w:val="22"/>
-          <w14:ligatures w14:val="standardContextual"/>
-        </w:rPr>
-      </w:pPr>
-      <w:r>
-        <w:rPr>
-          <w:rFonts w:asciiTheme="minorHAnsi" w:eastAsiaTheme="minorHAnsi" w:hAnsiTheme="minorHAnsi" w:cstheme="minorBidi"/>
-          <w:color w:val="000000" w:themeColor="text1"/>
-          <w:kern w:val="2"/>
-          <w:sz w:val="22"/>
-          <w:szCs w:val="22"/>
-          <w14:ligatures w14:val="standardContextual"/>
-        </w:rPr>
-        <w:t>parameters</w:t>
+          <w:kern w:val="2"/>
+          <w14:ligatures w14:val="standardContextual"/>
+        </w:rPr>
+      </w:pPr>
+      <w:r>
+        <w:rPr>
+          <w:rFonts w:asciiTheme="minorHAnsi" w:eastAsiaTheme="minorHAnsi" w:hAnsiTheme="minorHAnsi" w:cstheme="minorBidi"/>
+          <w:kern w:val="2"/>
+          <w14:ligatures w14:val="standardContextual"/>
+        </w:rPr>
+        <w:t>Action tells AWS what operation is allowed.</w:t>
       </w:r>
     </w:p>
     <w:p>
@@ -837,27 +1161,21 @@
         <w:pStyle w:val="NormalWeb"/>
         <w:numPr>
           <w:ilvl w:val="0"/>
-          <w:numId w:val="3"/>
+          <w:numId w:val="4"/>
         </w:numPr>
         <w:rPr>
           <w:rFonts w:asciiTheme="minorHAnsi" w:eastAsiaTheme="minorHAnsi" w:hAnsiTheme="minorHAnsi" w:cstheme="minorBidi"/>
-          <w:color w:val="000000" w:themeColor="text1"/>
-          <w:kern w:val="2"/>
-          <w:sz w:val="22"/>
-          <w:szCs w:val="22"/>
-          <w14:ligatures w14:val="standardContextual"/>
-        </w:rPr>
-      </w:pPr>
-      <w:r>
-        <w:rPr>
-          <w:rFonts w:asciiTheme="minorHAnsi" w:eastAsiaTheme="minorHAnsi" w:hAnsiTheme="minorHAnsi" w:cstheme="minorBidi"/>
-          <w:color w:val="000000" w:themeColor="text1"/>
-          <w:kern w:val="2"/>
-          <w:sz w:val="22"/>
-          <w:szCs w:val="22"/>
-          <w14:ligatures w14:val="standardContextual"/>
-        </w:rPr>
-        <w:t xml:space="preserve">using different values for the same template based on which stage we are at </w:t>
+          <w:kern w:val="2"/>
+          <w14:ligatures w14:val="standardContextual"/>
+        </w:rPr>
+      </w:pPr>
+      <w:r>
+        <w:rPr>
+          <w:rFonts w:asciiTheme="minorHAnsi" w:eastAsiaTheme="minorHAnsi" w:hAnsiTheme="minorHAnsi" w:cstheme="minorBidi"/>
+          <w:kern w:val="2"/>
+          <w14:ligatures w14:val="standardContextual"/>
+        </w:rPr>
+        <w:t>In SAM we write in the policies what is allowed and what not</w:t>
       </w:r>
     </w:p>
     <w:p>
@@ -865,27 +1183,39 @@
         <w:pStyle w:val="NormalWeb"/>
         <w:numPr>
           <w:ilvl w:val="0"/>
-          <w:numId w:val="3"/>
+          <w:numId w:val="4"/>
         </w:numPr>
         <w:rPr>
           <w:rFonts w:asciiTheme="minorHAnsi" w:eastAsiaTheme="minorHAnsi" w:hAnsiTheme="minorHAnsi" w:cstheme="minorBidi"/>
-          <w:color w:val="000000" w:themeColor="text1"/>
-          <w:kern w:val="2"/>
-          <w:sz w:val="22"/>
-          <w:szCs w:val="22"/>
-          <w14:ligatures w14:val="standardContextual"/>
-        </w:rPr>
-      </w:pPr>
-      <w:r>
-        <w:rPr>
-          <w:rFonts w:asciiTheme="minorHAnsi" w:eastAsiaTheme="minorHAnsi" w:hAnsiTheme="minorHAnsi" w:cstheme="minorBidi"/>
-          <w:color w:val="000000" w:themeColor="text1"/>
-          <w:kern w:val="2"/>
-          <w:sz w:val="22"/>
-          <w:szCs w:val="22"/>
-          <w14:ligatures w14:val="standardContextual"/>
-        </w:rPr>
-        <w:t>parameters inline</w:t>
+          <w:kern w:val="2"/>
+          <w14:ligatures w14:val="standardContextual"/>
+        </w:rPr>
+      </w:pPr>
+      <w:r>
+        <w:rPr>
+          <w:rFonts w:asciiTheme="minorHAnsi" w:eastAsiaTheme="minorHAnsi" w:hAnsiTheme="minorHAnsi" w:cstheme="minorBidi"/>
+          <w:kern w:val="2"/>
+          <w14:ligatures w14:val="standardContextual"/>
+        </w:rPr>
+        <w:t xml:space="preserve">In SAM we don’t write the JSON IAM policy ourselves there is a predefined way to do it and SAM handles the </w:t>
+      </w:r>
+      <w:proofErr w:type="spellStart"/>
+      <w:r>
+        <w:rPr>
+          <w:rFonts w:asciiTheme="minorHAnsi" w:eastAsiaTheme="minorHAnsi" w:hAnsiTheme="minorHAnsi" w:cstheme="minorBidi"/>
+          <w:kern w:val="2"/>
+          <w14:ligatures w14:val="standardContextual"/>
+        </w:rPr>
+        <w:t>cloudwatch</w:t>
+      </w:r>
+      <w:proofErr w:type="spellEnd"/>
+      <w:r>
+        <w:rPr>
+          <w:rFonts w:asciiTheme="minorHAnsi" w:eastAsiaTheme="minorHAnsi" w:hAnsiTheme="minorHAnsi" w:cstheme="minorBidi"/>
+          <w:kern w:val="2"/>
+          <w14:ligatures w14:val="standardContextual"/>
+        </w:rPr>
+        <w:t xml:space="preserve"> JSON and details itself</w:t>
       </w:r>
     </w:p>
     <w:p>
@@ -893,27 +1223,510 @@
         <w:pStyle w:val="NormalWeb"/>
         <w:numPr>
           <w:ilvl w:val="0"/>
-          <w:numId w:val="3"/>
+          <w:numId w:val="4"/>
         </w:numPr>
         <w:rPr>
           <w:rFonts w:asciiTheme="minorHAnsi" w:eastAsiaTheme="minorHAnsi" w:hAnsiTheme="minorHAnsi" w:cstheme="minorBidi"/>
-          <w:color w:val="000000" w:themeColor="text1"/>
-          <w:kern w:val="2"/>
-          <w:sz w:val="22"/>
-          <w:szCs w:val="22"/>
-          <w14:ligatures w14:val="standardContextual"/>
-        </w:rPr>
-      </w:pPr>
-      <w:r>
-        <w:rPr>
-          <w:rFonts w:asciiTheme="minorHAnsi" w:eastAsiaTheme="minorHAnsi" w:hAnsiTheme="minorHAnsi" w:cstheme="minorBidi"/>
-          <w:color w:val="000000" w:themeColor="text1"/>
-          <w:kern w:val="2"/>
-          <w:sz w:val="22"/>
-          <w:szCs w:val="22"/>
-          <w14:ligatures w14:val="standardContextual"/>
-        </w:rPr>
-        <w:t>AWS CLI</w:t>
+          <w:kern w:val="2"/>
+          <w14:ligatures w14:val="standardContextual"/>
+        </w:rPr>
+      </w:pPr>
+      <w:r>
+        <w:rPr>
+          <w:rFonts w:asciiTheme="minorHAnsi" w:eastAsiaTheme="minorHAnsi" w:hAnsiTheme="minorHAnsi" w:cstheme="minorBidi"/>
+          <w:kern w:val="2"/>
+          <w14:ligatures w14:val="standardContextual"/>
+        </w:rPr>
+        <w:lastRenderedPageBreak/>
+        <w:t>IAM Role = identity/job position</w:t>
+      </w:r>
+      <w:r>
+        <w:rPr>
+          <w:rFonts w:asciiTheme="minorHAnsi" w:eastAsiaTheme="minorHAnsi" w:hAnsiTheme="minorHAnsi" w:cstheme="minorBidi"/>
+          <w:kern w:val="2"/>
+          <w14:ligatures w14:val="standardContextual"/>
+        </w:rPr>
+        <w:t xml:space="preserve">. </w:t>
+      </w:r>
+      <w:r>
+        <w:rPr>
+          <w:rFonts w:asciiTheme="minorHAnsi" w:eastAsiaTheme="minorHAnsi" w:hAnsiTheme="minorHAnsi" w:cstheme="minorBidi"/>
+          <w:kern w:val="2"/>
+          <w14:ligatures w14:val="standardContextual"/>
+        </w:rPr>
+        <w:t>IAM Policy = rules attached to that position</w:t>
+      </w:r>
+    </w:p>
+    <w:p>
+      <w:pPr>
+        <w:pStyle w:val="ListParagraph"/>
+        <w:numPr>
+          <w:ilvl w:val="0"/>
+          <w:numId w:val="4"/>
+        </w:numPr>
+      </w:pPr>
+      <w:r>
+        <w:t>The three things I want you to remember</w:t>
+      </w:r>
+    </w:p>
+    <w:p>
+      <w:pPr>
+        <w:pStyle w:val="ListParagraph"/>
+        <w:numPr>
+          <w:ilvl w:val="0"/>
+          <w:numId w:val="4"/>
+        </w:numPr>
+        <w:spacing w:before="100" w:beforeAutospacing="1" w:after="100" w:afterAutospacing="1" w:line="240" w:lineRule="auto"/>
+      </w:pPr>
+      <w:r>
+        <w:t>When you see this:</w:t>
+      </w:r>
+    </w:p>
+    <w:p>
+      <w:pPr>
+        <w:pStyle w:val="ListParagraph"/>
+        <w:tabs>
+          <w:tab w:val="left" w:pos="916"/>
+          <w:tab w:val="left" w:pos="1832"/>
+          <w:tab w:val="left" w:pos="2748"/>
+          <w:tab w:val="left" w:pos="3664"/>
+          <w:tab w:val="left" w:pos="4580"/>
+          <w:tab w:val="left" w:pos="5496"/>
+          <w:tab w:val="left" w:pos="6412"/>
+          <w:tab w:val="left" w:pos="7328"/>
+          <w:tab w:val="left" w:pos="8244"/>
+          <w:tab w:val="left" w:pos="9160"/>
+          <w:tab w:val="left" w:pos="10076"/>
+          <w:tab w:val="left" w:pos="10992"/>
+          <w:tab w:val="left" w:pos="11908"/>
+          <w:tab w:val="left" w:pos="12824"/>
+          <w:tab w:val="left" w:pos="13740"/>
+          <w:tab w:val="left" w:pos="14656"/>
+        </w:tabs>
+        <w:spacing w:after="0" w:line="240" w:lineRule="auto"/>
+        <w:ind w:left="1080"/>
+      </w:pPr>
+      <w:r>
+        <w:t>Policies:</w:t>
+      </w:r>
+      <w:r>
+        <w:t xml:space="preserve"> </w:t>
+      </w:r>
+      <w:r>
+        <w:t>think:</w:t>
+      </w:r>
+      <w:r>
+        <w:t xml:space="preserve"> </w:t>
+      </w:r>
+      <w:r>
+        <w:t>“What is this Lambda allowed to do?”</w:t>
+      </w:r>
+    </w:p>
+    <w:p>
+      <w:pPr>
+        <w:pStyle w:val="ListParagraph"/>
+        <w:spacing w:before="100" w:beforeAutospacing="1" w:after="100" w:afterAutospacing="1" w:line="240" w:lineRule="auto"/>
+        <w:ind w:left="1080"/>
+      </w:pPr>
+      <w:r>
+        <w:t>When you see:</w:t>
+      </w:r>
+      <w:r>
+        <w:t xml:space="preserve"> </w:t>
+      </w:r>
+      <w:r>
+        <w:t>Action:</w:t>
+      </w:r>
+      <w:r>
+        <w:t xml:space="preserve"> </w:t>
+      </w:r>
+      <w:r>
+        <w:t>think:</w:t>
+      </w:r>
+      <w:r>
+        <w:t xml:space="preserve"> </w:t>
+      </w:r>
+      <w:r>
+        <w:t>“What operation?”</w:t>
+      </w:r>
+    </w:p>
+    <w:p>
+      <w:pPr>
+        <w:pStyle w:val="ListParagraph"/>
+        <w:spacing w:before="100" w:beforeAutospacing="1" w:after="100" w:afterAutospacing="1" w:line="240" w:lineRule="auto"/>
+        <w:ind w:left="1080"/>
+      </w:pPr>
+      <w:r>
+        <w:t>When you see:</w:t>
+      </w:r>
+      <w:r>
+        <w:t xml:space="preserve"> </w:t>
+      </w:r>
+      <w:r>
+        <w:t>Resource:</w:t>
+      </w:r>
+      <w:r>
+        <w:t xml:space="preserve"> </w:t>
+      </w:r>
+      <w:r>
+        <w:t>think:</w:t>
+      </w:r>
+      <w:r>
+        <w:t xml:space="preserve"> </w:t>
+      </w:r>
+      <w:r>
+        <w:t>“On which AWS resource?”</w:t>
+      </w:r>
+    </w:p>
+    <w:p>
+      <w:pPr>
+        <w:pStyle w:val="NormalWeb"/>
+        <w:ind w:left="360"/>
+        <w:rPr>
+          <w:rFonts w:asciiTheme="minorHAnsi" w:eastAsiaTheme="minorHAnsi" w:hAnsiTheme="minorHAnsi" w:cstheme="minorBidi"/>
+          <w:b/>
+          <w:bCs/>
+          <w:color w:val="000000" w:themeColor="text1"/>
+          <w:kern w:val="2"/>
+          <w:u w:val="single"/>
+          <w14:ligatures w14:val="standardContextual"/>
+        </w:rPr>
+      </w:pPr>
+      <w:r>
+        <w:rPr>
+          <w:rFonts w:asciiTheme="minorHAnsi" w:eastAsiaTheme="minorHAnsi" w:hAnsiTheme="minorHAnsi" w:cstheme="minorBidi"/>
+          <w:b/>
+          <w:bCs/>
+          <w:color w:val="000000" w:themeColor="text1"/>
+          <w:kern w:val="2"/>
+          <w:u w:val="single"/>
+          <w14:ligatures w14:val="standardContextual"/>
+        </w:rPr>
+        <w:t xml:space="preserve">AWS SAM </w:t>
+      </w:r>
+      <w:proofErr w:type="spellStart"/>
+      <w:r>
+        <w:rPr>
+          <w:rFonts w:asciiTheme="minorHAnsi" w:eastAsiaTheme="minorHAnsi" w:hAnsiTheme="minorHAnsi" w:cstheme="minorBidi"/>
+          <w:b/>
+          <w:bCs/>
+          <w:color w:val="000000" w:themeColor="text1"/>
+          <w:kern w:val="2"/>
+          <w:u w:val="single"/>
+          <w14:ligatures w14:val="standardContextual"/>
+        </w:rPr>
+        <w:t>globals</w:t>
+      </w:r>
+      <w:proofErr w:type="spellEnd"/>
+      <w:r>
+        <w:rPr>
+          <w:rFonts w:asciiTheme="minorHAnsi" w:eastAsiaTheme="minorHAnsi" w:hAnsiTheme="minorHAnsi" w:cstheme="minorBidi"/>
+          <w:b/>
+          <w:bCs/>
+          <w:color w:val="000000" w:themeColor="text1"/>
+          <w:kern w:val="2"/>
+          <w:u w:val="single"/>
+          <w14:ligatures w14:val="standardContextual"/>
+        </w:rPr>
+        <w:t>:</w:t>
+      </w:r>
+    </w:p>
+    <w:p>
+      <w:pPr>
+        <w:pStyle w:val="ListParagraph"/>
+        <w:numPr>
+          <w:ilvl w:val="0"/>
+          <w:numId w:val="6"/>
+        </w:numPr>
+        <w:spacing w:before="100" w:beforeAutospacing="1" w:after="100" w:afterAutospacing="1" w:line="240" w:lineRule="auto"/>
+      </w:pPr>
+      <w:r>
+        <w:t>it lets you define common settings once and automatically apply them to many resources.</w:t>
+      </w:r>
+    </w:p>
+    <w:p>
+      <w:pPr>
+        <w:pStyle w:val="HTMLPreformatted"/>
+        <w:ind w:left="720"/>
+        <w:rPr>
+          <w:rFonts w:asciiTheme="minorHAnsi" w:eastAsiaTheme="minorHAnsi" w:hAnsiTheme="minorHAnsi" w:cstheme="minorBidi"/>
+          <w:kern w:val="2"/>
+          <w:sz w:val="24"/>
+          <w:szCs w:val="24"/>
+          <w14:ligatures w14:val="standardContextual"/>
+        </w:rPr>
+      </w:pPr>
+      <w:proofErr w:type="spellStart"/>
+      <w:r>
+        <w:rPr>
+          <w:rFonts w:asciiTheme="minorHAnsi" w:eastAsiaTheme="minorHAnsi" w:hAnsiTheme="minorHAnsi" w:cstheme="minorBidi"/>
+          <w:kern w:val="2"/>
+          <w:sz w:val="24"/>
+          <w:szCs w:val="24"/>
+          <w14:ligatures w14:val="standardContextual"/>
+        </w:rPr>
+        <w:t>Globals</w:t>
+      </w:r>
+      <w:proofErr w:type="spellEnd"/>
+      <w:r>
+        <w:rPr>
+          <w:rFonts w:asciiTheme="minorHAnsi" w:eastAsiaTheme="minorHAnsi" w:hAnsiTheme="minorHAnsi" w:cstheme="minorBidi"/>
+          <w:kern w:val="2"/>
+          <w:sz w:val="24"/>
+          <w:szCs w:val="24"/>
+          <w14:ligatures w14:val="standardContextual"/>
+        </w:rPr>
+        <w:t>:</w:t>
+      </w:r>
+    </w:p>
+    <w:p>
+      <w:pPr>
+        <w:pStyle w:val="HTMLPreformatted"/>
+        <w:ind w:left="720"/>
+        <w:rPr>
+          <w:rFonts w:asciiTheme="minorHAnsi" w:eastAsiaTheme="minorHAnsi" w:hAnsiTheme="minorHAnsi" w:cstheme="minorBidi"/>
+          <w:kern w:val="2"/>
+          <w:sz w:val="24"/>
+          <w:szCs w:val="24"/>
+          <w14:ligatures w14:val="standardContextual"/>
+        </w:rPr>
+      </w:pPr>
+      <w:r>
+        <w:rPr>
+          <w:rFonts w:asciiTheme="minorHAnsi" w:eastAsiaTheme="minorHAnsi" w:hAnsiTheme="minorHAnsi" w:cstheme="minorBidi"/>
+          <w:kern w:val="2"/>
+          <w:sz w:val="24"/>
+          <w:szCs w:val="24"/>
+          <w14:ligatures w14:val="standardContextual"/>
+        </w:rPr>
+        <w:t xml:space="preserve">  Function:</w:t>
+      </w:r>
+    </w:p>
+    <w:p>
+      <w:pPr>
+        <w:pStyle w:val="HTMLPreformatted"/>
+        <w:ind w:left="720"/>
+        <w:rPr>
+          <w:rFonts w:asciiTheme="minorHAnsi" w:eastAsiaTheme="minorHAnsi" w:hAnsiTheme="minorHAnsi" w:cstheme="minorBidi"/>
+          <w:kern w:val="2"/>
+          <w:sz w:val="24"/>
+          <w:szCs w:val="24"/>
+          <w14:ligatures w14:val="standardContextual"/>
+        </w:rPr>
+      </w:pPr>
+      <w:r>
+        <w:rPr>
+          <w:rFonts w:asciiTheme="minorHAnsi" w:eastAsiaTheme="minorHAnsi" w:hAnsiTheme="minorHAnsi" w:cstheme="minorBidi"/>
+          <w:kern w:val="2"/>
+          <w:sz w:val="24"/>
+          <w:szCs w:val="24"/>
+          <w14:ligatures w14:val="standardContextual"/>
+        </w:rPr>
+        <w:t xml:space="preserve">    Runtime: python3.13</w:t>
+      </w:r>
+    </w:p>
+    <w:p>
+      <w:pPr>
+        <w:pStyle w:val="HTMLPreformatted"/>
+        <w:ind w:left="720"/>
+        <w:rPr>
+          <w:rFonts w:asciiTheme="minorHAnsi" w:eastAsiaTheme="minorHAnsi" w:hAnsiTheme="minorHAnsi" w:cstheme="minorBidi"/>
+          <w:kern w:val="2"/>
+          <w:sz w:val="24"/>
+          <w:szCs w:val="24"/>
+          <w14:ligatures w14:val="standardContextual"/>
+        </w:rPr>
+      </w:pPr>
+      <w:r>
+        <w:rPr>
+          <w:rFonts w:asciiTheme="minorHAnsi" w:eastAsiaTheme="minorHAnsi" w:hAnsiTheme="minorHAnsi" w:cstheme="minorBidi"/>
+          <w:kern w:val="2"/>
+          <w:sz w:val="24"/>
+          <w:szCs w:val="24"/>
+          <w14:ligatures w14:val="standardContextual"/>
+        </w:rPr>
+        <w:t xml:space="preserve">    </w:t>
+      </w:r>
+      <w:proofErr w:type="spellStart"/>
+      <w:r>
+        <w:rPr>
+          <w:rFonts w:asciiTheme="minorHAnsi" w:eastAsiaTheme="minorHAnsi" w:hAnsiTheme="minorHAnsi" w:cstheme="minorBidi"/>
+          <w:kern w:val="2"/>
+          <w:sz w:val="24"/>
+          <w:szCs w:val="24"/>
+          <w14:ligatures w14:val="standardContextual"/>
+        </w:rPr>
+        <w:t>MemorySize</w:t>
+      </w:r>
+      <w:proofErr w:type="spellEnd"/>
+      <w:r>
+        <w:rPr>
+          <w:rFonts w:asciiTheme="minorHAnsi" w:eastAsiaTheme="minorHAnsi" w:hAnsiTheme="minorHAnsi" w:cstheme="minorBidi"/>
+          <w:kern w:val="2"/>
+          <w:sz w:val="24"/>
+          <w:szCs w:val="24"/>
+          <w14:ligatures w14:val="standardContextual"/>
+        </w:rPr>
+        <w:t>: 512</w:t>
+      </w:r>
+    </w:p>
+    <w:p>
+      <w:pPr>
+        <w:pStyle w:val="HTMLPreformatted"/>
+        <w:ind w:left="720"/>
+        <w:rPr>
+          <w:rFonts w:asciiTheme="minorHAnsi" w:eastAsiaTheme="minorHAnsi" w:hAnsiTheme="minorHAnsi" w:cstheme="minorBidi"/>
+          <w:kern w:val="2"/>
+          <w:sz w:val="24"/>
+          <w:szCs w:val="24"/>
+          <w14:ligatures w14:val="standardContextual"/>
+        </w:rPr>
+      </w:pPr>
+      <w:r>
+        <w:rPr>
+          <w:rFonts w:asciiTheme="minorHAnsi" w:eastAsiaTheme="minorHAnsi" w:hAnsiTheme="minorHAnsi" w:cstheme="minorBidi"/>
+          <w:kern w:val="2"/>
+          <w:sz w:val="24"/>
+          <w:szCs w:val="24"/>
+          <w14:ligatures w14:val="standardContextual"/>
+        </w:rPr>
+        <w:t xml:space="preserve">    Timeout: 30</w:t>
+      </w:r>
+    </w:p>
+    <w:p>
+      <w:pPr>
+        <w:pStyle w:val="HTMLPreformatted"/>
+        <w:ind w:left="720"/>
+        <w:rPr>
+          <w:rFonts w:asciiTheme="minorHAnsi" w:eastAsiaTheme="minorHAnsi" w:hAnsiTheme="minorHAnsi" w:cstheme="minorBidi"/>
+          <w:kern w:val="2"/>
+          <w:sz w:val="24"/>
+          <w:szCs w:val="24"/>
+          <w14:ligatures w14:val="standardContextual"/>
+        </w:rPr>
+      </w:pPr>
+      <w:r>
+        <w:rPr>
+          <w:rFonts w:asciiTheme="minorHAnsi" w:eastAsiaTheme="minorHAnsi" w:hAnsiTheme="minorHAnsi" w:cstheme="minorBidi"/>
+          <w:kern w:val="2"/>
+          <w:sz w:val="24"/>
+          <w:szCs w:val="24"/>
+          <w14:ligatures w14:val="standardContextual"/>
+        </w:rPr>
+        <w:t xml:space="preserve">    Tracing: Active</w:t>
+      </w:r>
+    </w:p>
+    <w:p>
+      <w:pPr>
+        <w:pStyle w:val="ListParagraph"/>
+        <w:spacing w:before="100" w:beforeAutospacing="1" w:after="100" w:afterAutospacing="1" w:line="240" w:lineRule="auto"/>
+      </w:pPr>
+      <w:r>
+        <w:t>Now those settings become defaults for all SAM Functions.</w:t>
+      </w:r>
+    </w:p>
+    <w:p>
+      <w:pPr>
+        <w:pStyle w:val="ListParagraph"/>
+        <w:numPr>
+          <w:ilvl w:val="0"/>
+          <w:numId w:val="6"/>
+        </w:numPr>
+        <w:spacing w:before="100" w:beforeAutospacing="1" w:after="100" w:afterAutospacing="1" w:line="240" w:lineRule="auto"/>
+      </w:pPr>
+      <w:r>
+        <w:t>In case a function has a different functionality or definition when we write it inside it will override the global</w:t>
+      </w:r>
+    </w:p>
+    <w:p>
+      <w:pPr>
+        <w:pStyle w:val="ListParagraph"/>
+        <w:numPr>
+          <w:ilvl w:val="0"/>
+          <w:numId w:val="6"/>
+        </w:numPr>
+        <w:spacing w:before="100" w:beforeAutospacing="1" w:after="100" w:afterAutospacing="1" w:line="240" w:lineRule="auto"/>
+      </w:pPr>
+      <w:r>
+        <w:t xml:space="preserve">We have </w:t>
+      </w:r>
+      <w:proofErr w:type="spellStart"/>
+      <w:r>
+        <w:t>globals</w:t>
+      </w:r>
+      <w:proofErr w:type="spellEnd"/>
+      <w:r>
+        <w:t xml:space="preserve"> for functions, </w:t>
+      </w:r>
+      <w:proofErr w:type="spellStart"/>
+      <w:r>
+        <w:t>apis</w:t>
+      </w:r>
+      <w:proofErr w:type="spellEnd"/>
+      <w:r>
+        <w:t xml:space="preserve">, </w:t>
+      </w:r>
+      <w:proofErr w:type="spellStart"/>
+      <w:r>
+        <w:t>dynamodb</w:t>
+      </w:r>
+      <w:proofErr w:type="spellEnd"/>
+      <w:r>
+        <w:t xml:space="preserve">. </w:t>
+      </w:r>
+      <w:r>
+        <w:t>Each resource type should have theirs defined</w:t>
+      </w:r>
+    </w:p>
+    <w:p>
+      <w:pPr>
+        <w:pStyle w:val="NormalWeb"/>
+        <w:ind w:left="360"/>
+        <w:rPr>
+          <w:rFonts w:asciiTheme="minorHAnsi" w:eastAsiaTheme="minorHAnsi" w:hAnsiTheme="minorHAnsi" w:cstheme="minorBidi"/>
+          <w:b/>
+          <w:bCs/>
+          <w:color w:val="000000" w:themeColor="text1"/>
+          <w:kern w:val="2"/>
+          <w:u w:val="single"/>
+          <w14:ligatures w14:val="standardContextual"/>
+        </w:rPr>
+      </w:pPr>
+      <w:r>
+        <w:rPr>
+          <w:rFonts w:asciiTheme="minorHAnsi" w:eastAsiaTheme="minorHAnsi" w:hAnsiTheme="minorHAnsi" w:cstheme="minorBidi"/>
+          <w:b/>
+          <w:bCs/>
+          <w:color w:val="000000" w:themeColor="text1"/>
+          <w:kern w:val="2"/>
+          <w:u w:val="single"/>
+          <w14:ligatures w14:val="standardContextual"/>
+        </w:rPr>
+        <w:t>P</w:t>
+      </w:r>
+      <w:r>
+        <w:rPr>
+          <w:rFonts w:asciiTheme="minorHAnsi" w:eastAsiaTheme="minorHAnsi" w:hAnsiTheme="minorHAnsi" w:cstheme="minorBidi"/>
+          <w:b/>
+          <w:bCs/>
+          <w:color w:val="000000" w:themeColor="text1"/>
+          <w:kern w:val="2"/>
+          <w:u w:val="single"/>
+          <w14:ligatures w14:val="standardContextual"/>
+        </w:rPr>
+        <w:t>arameters</w:t>
+      </w:r>
+      <w:r>
+        <w:rPr>
+          <w:rFonts w:asciiTheme="minorHAnsi" w:eastAsiaTheme="minorHAnsi" w:hAnsiTheme="minorHAnsi" w:cstheme="minorBidi"/>
+          <w:b/>
+          <w:bCs/>
+          <w:color w:val="000000" w:themeColor="text1"/>
+          <w:kern w:val="2"/>
+          <w:u w:val="single"/>
+          <w14:ligatures w14:val="standardContextual"/>
+        </w:rPr>
+        <w:t>:</w:t>
       </w:r>
     </w:p>
     <w:p>
@@ -921,70 +1734,137 @@
         <w:pStyle w:val="NormalWeb"/>
         <w:numPr>
           <w:ilvl w:val="0"/>
-          <w:numId w:val="3"/>
+          <w:numId w:val="7"/>
         </w:numPr>
         <w:rPr>
           <w:rFonts w:asciiTheme="minorHAnsi" w:eastAsiaTheme="minorHAnsi" w:hAnsiTheme="minorHAnsi" w:cstheme="minorBidi"/>
-          <w:color w:val="000000" w:themeColor="text1"/>
-          <w:kern w:val="2"/>
-          <w:sz w:val="22"/>
-          <w:szCs w:val="22"/>
-          <w14:ligatures w14:val="standardContextual"/>
-        </w:rPr>
-      </w:pPr>
-      <w:r>
-        <w:rPr>
-          <w:rFonts w:asciiTheme="minorHAnsi" w:eastAsiaTheme="minorHAnsi" w:hAnsiTheme="minorHAnsi" w:cstheme="minorBidi"/>
-          <w:color w:val="000000" w:themeColor="text1"/>
-          <w:kern w:val="2"/>
-          <w:sz w:val="22"/>
-          <w:szCs w:val="22"/>
-          <w14:ligatures w14:val="standardContextual"/>
-        </w:rPr>
-        <w:t xml:space="preserve">SAM </w:t>
-      </w:r>
-      <w:proofErr w:type="spellStart"/>
-      <w:proofErr w:type="gramStart"/>
-      <w:r>
-        <w:rPr>
-          <w:rFonts w:asciiTheme="minorHAnsi" w:eastAsiaTheme="minorHAnsi" w:hAnsiTheme="minorHAnsi" w:cstheme="minorBidi"/>
-          <w:color w:val="000000" w:themeColor="text1"/>
-          <w:kern w:val="2"/>
-          <w:sz w:val="22"/>
-          <w:szCs w:val="22"/>
-          <w14:ligatures w14:val="standardContextual"/>
-        </w:rPr>
-        <w:t>init</w:t>
-      </w:r>
-      <w:proofErr w:type="spellEnd"/>
-      <w:proofErr w:type="gramEnd"/>
+          <w:kern w:val="2"/>
+          <w14:ligatures w14:val="standardContextual"/>
+        </w:rPr>
+      </w:pPr>
+      <w:r>
+        <w:rPr>
+          <w:rFonts w:asciiTheme="minorHAnsi" w:eastAsiaTheme="minorHAnsi" w:hAnsiTheme="minorHAnsi" w:cstheme="minorBidi"/>
+          <w:kern w:val="2"/>
+          <w14:ligatures w14:val="standardContextual"/>
+        </w:rPr>
+        <w:t>A parameter is basically a variable that you provide when deploying your SAM application.</w:t>
+      </w:r>
     </w:p>
     <w:p>
       <w:pPr>
         <w:pStyle w:val="NormalWeb"/>
         <w:numPr>
           <w:ilvl w:val="0"/>
-          <w:numId w:val="3"/>
+          <w:numId w:val="7"/>
         </w:numPr>
         <w:rPr>
           <w:rFonts w:asciiTheme="minorHAnsi" w:eastAsiaTheme="minorHAnsi" w:hAnsiTheme="minorHAnsi" w:cstheme="minorBidi"/>
-          <w:color w:val="000000" w:themeColor="text1"/>
-          <w:kern w:val="2"/>
-          <w:sz w:val="22"/>
-          <w:szCs w:val="22"/>
-          <w14:ligatures w14:val="standardContextual"/>
-        </w:rPr>
-      </w:pPr>
-      <w:r>
-        <w:rPr>
-          <w:rFonts w:asciiTheme="minorHAnsi" w:eastAsiaTheme="minorHAnsi" w:hAnsiTheme="minorHAnsi" w:cstheme="minorBidi"/>
-          <w:color w:val="000000" w:themeColor="text1"/>
-          <w:kern w:val="2"/>
-          <w:sz w:val="22"/>
-          <w:szCs w:val="22"/>
-          <w14:ligatures w14:val="standardContextual"/>
-        </w:rPr>
-        <w:t>SAM build</w:t>
+          <w:kern w:val="2"/>
+          <w14:ligatures w14:val="standardContextual"/>
+        </w:rPr>
+      </w:pPr>
+      <w:r>
+        <w:rPr>
+          <w:rFonts w:asciiTheme="minorHAnsi" w:eastAsiaTheme="minorHAnsi" w:hAnsiTheme="minorHAnsi" w:cstheme="minorBidi"/>
+          <w:kern w:val="2"/>
+          <w14:ligatures w14:val="standardContextual"/>
+        </w:rPr>
+        <w:t xml:space="preserve">Suppose we have 3 stages for our app, dev stage dep. Create a </w:t>
+      </w:r>
+      <w:proofErr w:type="spellStart"/>
+      <w:r>
+        <w:rPr>
+          <w:rFonts w:asciiTheme="minorHAnsi" w:eastAsiaTheme="minorHAnsi" w:hAnsiTheme="minorHAnsi" w:cstheme="minorBidi"/>
+          <w:kern w:val="2"/>
+          <w14:ligatures w14:val="standardContextual"/>
+        </w:rPr>
+        <w:t>template.yaml</w:t>
+      </w:r>
+      <w:proofErr w:type="spellEnd"/>
+      <w:r>
+        <w:rPr>
+          <w:rFonts w:asciiTheme="minorHAnsi" w:eastAsiaTheme="minorHAnsi" w:hAnsiTheme="minorHAnsi" w:cstheme="minorBidi"/>
+          <w:kern w:val="2"/>
+          <w14:ligatures w14:val="standardContextual"/>
+        </w:rPr>
+        <w:t xml:space="preserve"> for each stage is not maintainable but creating just one and give it different values depending on the stage</w:t>
+      </w:r>
+    </w:p>
+    <w:p>
+      <w:pPr>
+        <w:pStyle w:val="NormalWeb"/>
+        <w:ind w:left="720"/>
+        <w:rPr>
+          <w:rFonts w:asciiTheme="minorHAnsi" w:eastAsiaTheme="minorHAnsi" w:hAnsiTheme="minorHAnsi" w:cstheme="minorBidi"/>
+          <w:kern w:val="2"/>
+          <w14:ligatures w14:val="standardContextual"/>
+        </w:rPr>
+      </w:pPr>
+      <w:r>
+        <w:rPr>
+          <w:rFonts w:asciiTheme="minorHAnsi" w:eastAsiaTheme="minorHAnsi" w:hAnsiTheme="minorHAnsi" w:cstheme="minorBidi"/>
+          <w:kern w:val="2"/>
+          <w14:ligatures w14:val="standardContextual"/>
+        </w:rPr>
+        <w:t>Parameters:</w:t>
+      </w:r>
+    </w:p>
+    <w:p>
+      <w:pPr>
+        <w:pStyle w:val="NormalWeb"/>
+        <w:ind w:left="720"/>
+        <w:rPr>
+          <w:rFonts w:asciiTheme="minorHAnsi" w:eastAsiaTheme="minorHAnsi" w:hAnsiTheme="minorHAnsi" w:cstheme="minorBidi"/>
+          <w:kern w:val="2"/>
+          <w14:ligatures w14:val="standardContextual"/>
+        </w:rPr>
+      </w:pPr>
+      <w:r>
+        <w:rPr>
+          <w:rFonts w:asciiTheme="minorHAnsi" w:eastAsiaTheme="minorHAnsi" w:hAnsiTheme="minorHAnsi" w:cstheme="minorBidi"/>
+          <w:kern w:val="2"/>
+          <w14:ligatures w14:val="standardContextual"/>
+        </w:rPr>
+        <w:t xml:space="preserve">  Environment:</w:t>
+      </w:r>
+    </w:p>
+    <w:p>
+      <w:pPr>
+        <w:pStyle w:val="NormalWeb"/>
+        <w:ind w:left="720"/>
+        <w:rPr>
+          <w:rFonts w:asciiTheme="minorHAnsi" w:eastAsiaTheme="minorHAnsi" w:hAnsiTheme="minorHAnsi" w:cstheme="minorBidi"/>
+          <w:kern w:val="2"/>
+          <w14:ligatures w14:val="standardContextual"/>
+        </w:rPr>
+      </w:pPr>
+      <w:r>
+        <w:rPr>
+          <w:rFonts w:asciiTheme="minorHAnsi" w:eastAsiaTheme="minorHAnsi" w:hAnsiTheme="minorHAnsi" w:cstheme="minorBidi"/>
+          <w:kern w:val="2"/>
+          <w14:ligatures w14:val="standardContextual"/>
+        </w:rPr>
+        <w:t xml:space="preserve">    Type: String</w:t>
+      </w:r>
+    </w:p>
+    <w:p>
+      <w:pPr>
+        <w:pStyle w:val="NormalWeb"/>
+        <w:ind w:left="720"/>
+        <w:rPr>
+          <w:rFonts w:asciiTheme="minorHAnsi" w:eastAsiaTheme="minorHAnsi" w:hAnsiTheme="minorHAnsi" w:cstheme="minorBidi"/>
+          <w:kern w:val="2"/>
+          <w14:ligatures w14:val="standardContextual"/>
+        </w:rPr>
+      </w:pPr>
+      <w:r>
+        <w:rPr>
+          <w:rFonts w:asciiTheme="minorHAnsi" w:eastAsiaTheme="minorHAnsi" w:hAnsiTheme="minorHAnsi" w:cstheme="minorBidi"/>
+          <w:kern w:val="2"/>
+          <w14:ligatures w14:val="standardContextual"/>
+        </w:rPr>
+        <w:t xml:space="preserve">    Default: dev</w:t>
       </w:r>
     </w:p>
     <w:p>
@@ -992,27 +1872,21 @@
         <w:pStyle w:val="NormalWeb"/>
         <w:numPr>
           <w:ilvl w:val="0"/>
-          <w:numId w:val="3"/>
+          <w:numId w:val="9"/>
         </w:numPr>
         <w:rPr>
           <w:rFonts w:asciiTheme="minorHAnsi" w:eastAsiaTheme="minorHAnsi" w:hAnsiTheme="minorHAnsi" w:cstheme="minorBidi"/>
-          <w:color w:val="000000" w:themeColor="text1"/>
-          <w:kern w:val="2"/>
-          <w:sz w:val="22"/>
-          <w:szCs w:val="22"/>
-          <w14:ligatures w14:val="standardContextual"/>
-        </w:rPr>
-      </w:pPr>
-      <w:r>
-        <w:rPr>
-          <w:rFonts w:asciiTheme="minorHAnsi" w:eastAsiaTheme="minorHAnsi" w:hAnsiTheme="minorHAnsi" w:cstheme="minorBidi"/>
-          <w:color w:val="000000" w:themeColor="text1"/>
-          <w:kern w:val="2"/>
-          <w:sz w:val="22"/>
-          <w:szCs w:val="22"/>
-          <w14:ligatures w14:val="standardContextual"/>
-        </w:rPr>
-        <w:t>SAM package</w:t>
+          <w:kern w:val="2"/>
+          <w14:ligatures w14:val="standardContextual"/>
+        </w:rPr>
+      </w:pPr>
+      <w:r>
+        <w:rPr>
+          <w:rFonts w:asciiTheme="minorHAnsi" w:eastAsiaTheme="minorHAnsi" w:hAnsiTheme="minorHAnsi" w:cstheme="minorBidi"/>
+          <w:kern w:val="2"/>
+          <w14:ligatures w14:val="standardContextual"/>
+        </w:rPr>
+        <w:t xml:space="preserve">Parameters tells the SAM we are about to write a parameter, Environment is its name, type and default are self-explanatory </w:t>
       </w:r>
     </w:p>
     <w:p>
@@ -1020,68 +1894,161 @@
         <w:pStyle w:val="NormalWeb"/>
         <w:numPr>
           <w:ilvl w:val="0"/>
-          <w:numId w:val="3"/>
+          <w:numId w:val="9"/>
         </w:numPr>
         <w:rPr>
           <w:rFonts w:asciiTheme="minorHAnsi" w:eastAsiaTheme="minorHAnsi" w:hAnsiTheme="minorHAnsi" w:cstheme="minorBidi"/>
-          <w:color w:val="000000" w:themeColor="text1"/>
-          <w:kern w:val="2"/>
-          <w:sz w:val="22"/>
-          <w:szCs w:val="22"/>
-          <w14:ligatures w14:val="standardContextual"/>
-        </w:rPr>
-      </w:pPr>
-      <w:r>
-        <w:rPr>
-          <w:rFonts w:asciiTheme="minorHAnsi" w:eastAsiaTheme="minorHAnsi" w:hAnsiTheme="minorHAnsi" w:cstheme="minorBidi"/>
-          <w:color w:val="000000" w:themeColor="text1"/>
-          <w:kern w:val="2"/>
-          <w:sz w:val="22"/>
-          <w:szCs w:val="22"/>
-          <w14:ligatures w14:val="standardContextual"/>
-        </w:rPr>
-        <w:t xml:space="preserve">SAM </w:t>
-      </w:r>
-      <w:proofErr w:type="gramStart"/>
-      <w:r>
-        <w:rPr>
-          <w:rFonts w:asciiTheme="minorHAnsi" w:eastAsiaTheme="minorHAnsi" w:hAnsiTheme="minorHAnsi" w:cstheme="minorBidi"/>
-          <w:color w:val="000000" w:themeColor="text1"/>
-          <w:kern w:val="2"/>
-          <w:sz w:val="22"/>
-          <w:szCs w:val="22"/>
-          <w14:ligatures w14:val="standardContextual"/>
-        </w:rPr>
-        <w:t>deploy</w:t>
-      </w:r>
-      <w:proofErr w:type="gramEnd"/>
+          <w:kern w:val="2"/>
+          <w14:ligatures w14:val="standardContextual"/>
+        </w:rPr>
+      </w:pPr>
+      <w:r>
+        <w:rPr>
+          <w:rFonts w:asciiTheme="minorHAnsi" w:eastAsiaTheme="minorHAnsi" w:hAnsiTheme="minorHAnsi" w:cstheme="minorBidi"/>
+          <w:kern w:val="2"/>
+          <w14:ligatures w14:val="standardContextual"/>
+        </w:rPr>
+        <w:t>By just defining a parameter we don’t really do or change anything</w:t>
+      </w:r>
     </w:p>
     <w:p>
       <w:pPr>
         <w:pStyle w:val="NormalWeb"/>
         <w:numPr>
           <w:ilvl w:val="0"/>
-          <w:numId w:val="3"/>
+          <w:numId w:val="9"/>
         </w:numPr>
         <w:rPr>
           <w:rFonts w:asciiTheme="minorHAnsi" w:eastAsiaTheme="minorHAnsi" w:hAnsiTheme="minorHAnsi" w:cstheme="minorBidi"/>
-          <w:color w:val="000000" w:themeColor="text1"/>
-          <w:kern w:val="2"/>
-          <w:sz w:val="22"/>
-          <w:szCs w:val="22"/>
-          <w14:ligatures w14:val="standardContextual"/>
-        </w:rPr>
-      </w:pPr>
-      <w:r>
-        <w:rPr>
-          <w:rFonts w:asciiTheme="minorHAnsi" w:eastAsiaTheme="minorHAnsi" w:hAnsiTheme="minorHAnsi" w:cstheme="minorBidi"/>
-          <w:color w:val="000000" w:themeColor="text1"/>
-          <w:kern w:val="2"/>
-          <w:sz w:val="22"/>
-          <w:szCs w:val="22"/>
-          <w14:ligatures w14:val="standardContextual"/>
-        </w:rPr>
-        <w:t>SAM local</w:t>
+          <w:kern w:val="2"/>
+          <w14:ligatures w14:val="standardContextual"/>
+        </w:rPr>
+      </w:pPr>
+      <w:r>
+        <w:rPr>
+          <w:rFonts w:asciiTheme="minorHAnsi" w:eastAsiaTheme="minorHAnsi" w:hAnsiTheme="minorHAnsi" w:cstheme="minorBidi"/>
+          <w:kern w:val="2"/>
+          <w14:ligatures w14:val="standardContextual"/>
+        </w:rPr>
+        <w:t>!Ref — using a parameter</w:t>
+      </w:r>
+    </w:p>
+    <w:p>
+      <w:pPr>
+        <w:pStyle w:val="NormalWeb"/>
+        <w:rPr>
+          <w:rFonts w:asciiTheme="minorHAnsi" w:eastAsiaTheme="minorHAnsi" w:hAnsiTheme="minorHAnsi" w:cstheme="minorBidi"/>
+          <w:kern w:val="2"/>
+          <w14:ligatures w14:val="standardContextual"/>
+        </w:rPr>
+      </w:pPr>
+      <w:proofErr w:type="spellStart"/>
+      <w:r>
+        <w:rPr>
+          <w:rFonts w:asciiTheme="minorHAnsi" w:eastAsiaTheme="minorHAnsi" w:hAnsiTheme="minorHAnsi" w:cstheme="minorBidi"/>
+          <w:kern w:val="2"/>
+          <w14:ligatures w14:val="standardContextual"/>
+        </w:rPr>
+        <w:lastRenderedPageBreak/>
+        <w:t>Globals</w:t>
+      </w:r>
+      <w:proofErr w:type="spellEnd"/>
+      <w:r>
+        <w:rPr>
+          <w:rFonts w:asciiTheme="minorHAnsi" w:eastAsiaTheme="minorHAnsi" w:hAnsiTheme="minorHAnsi" w:cstheme="minorBidi"/>
+          <w:kern w:val="2"/>
+          <w14:ligatures w14:val="standardContextual"/>
+        </w:rPr>
+        <w:t>:</w:t>
+      </w:r>
+    </w:p>
+    <w:p>
+      <w:pPr>
+        <w:pStyle w:val="NormalWeb"/>
+        <w:rPr>
+          <w:rFonts w:asciiTheme="minorHAnsi" w:eastAsiaTheme="minorHAnsi" w:hAnsiTheme="minorHAnsi" w:cstheme="minorBidi"/>
+          <w:kern w:val="2"/>
+          <w14:ligatures w14:val="standardContextual"/>
+        </w:rPr>
+      </w:pPr>
+      <w:r>
+        <w:rPr>
+          <w:rFonts w:asciiTheme="minorHAnsi" w:eastAsiaTheme="minorHAnsi" w:hAnsiTheme="minorHAnsi" w:cstheme="minorBidi"/>
+          <w:kern w:val="2"/>
+          <w14:ligatures w14:val="standardContextual"/>
+        </w:rPr>
+        <w:t xml:space="preserve">  Function:</w:t>
+      </w:r>
+    </w:p>
+    <w:p>
+      <w:pPr>
+        <w:pStyle w:val="NormalWeb"/>
+        <w:rPr>
+          <w:rFonts w:asciiTheme="minorHAnsi" w:eastAsiaTheme="minorHAnsi" w:hAnsiTheme="minorHAnsi" w:cstheme="minorBidi"/>
+          <w:kern w:val="2"/>
+          <w14:ligatures w14:val="standardContextual"/>
+        </w:rPr>
+      </w:pPr>
+      <w:r>
+        <w:rPr>
+          <w:rFonts w:asciiTheme="minorHAnsi" w:eastAsiaTheme="minorHAnsi" w:hAnsiTheme="minorHAnsi" w:cstheme="minorBidi"/>
+          <w:kern w:val="2"/>
+          <w14:ligatures w14:val="standardContextual"/>
+        </w:rPr>
+        <w:t xml:space="preserve">    Environment:</w:t>
+      </w:r>
+    </w:p>
+    <w:p>
+      <w:pPr>
+        <w:pStyle w:val="NormalWeb"/>
+        <w:rPr>
+          <w:rFonts w:asciiTheme="minorHAnsi" w:eastAsiaTheme="minorHAnsi" w:hAnsiTheme="minorHAnsi" w:cstheme="minorBidi"/>
+          <w:kern w:val="2"/>
+          <w14:ligatures w14:val="standardContextual"/>
+        </w:rPr>
+      </w:pPr>
+      <w:r>
+        <w:rPr>
+          <w:rFonts w:asciiTheme="minorHAnsi" w:eastAsiaTheme="minorHAnsi" w:hAnsiTheme="minorHAnsi" w:cstheme="minorBidi"/>
+          <w:kern w:val="2"/>
+          <w14:ligatures w14:val="standardContextual"/>
+        </w:rPr>
+        <w:t xml:space="preserve">      Variables:</w:t>
+      </w:r>
+    </w:p>
+    <w:p>
+      <w:pPr>
+        <w:pStyle w:val="NormalWeb"/>
+        <w:rPr>
+          <w:rFonts w:asciiTheme="minorHAnsi" w:eastAsiaTheme="minorHAnsi" w:hAnsiTheme="minorHAnsi" w:cstheme="minorBidi"/>
+          <w:kern w:val="2"/>
+          <w14:ligatures w14:val="standardContextual"/>
+        </w:rPr>
+      </w:pPr>
+      <w:r>
+        <w:rPr>
+          <w:rFonts w:asciiTheme="minorHAnsi" w:eastAsiaTheme="minorHAnsi" w:hAnsiTheme="minorHAnsi" w:cstheme="minorBidi"/>
+          <w:kern w:val="2"/>
+          <w14:ligatures w14:val="standardContextual"/>
+        </w:rPr>
+        <w:t xml:space="preserve">        APP_ENV: !Ref Environment</w:t>
+      </w:r>
+    </w:p>
+    <w:p>
+      <w:pPr>
+        <w:pStyle w:val="pdq2pgselectionanchorcontainer"/>
+        <w:numPr>
+          <w:ilvl w:val="0"/>
+          <w:numId w:val="10"/>
+        </w:numPr>
+      </w:pPr>
+      <w:r>
+        <w:rPr>
+          <w:rFonts w:asciiTheme="minorHAnsi" w:eastAsiaTheme="minorHAnsi" w:hAnsiTheme="minorHAnsi" w:cstheme="minorBidi"/>
+          <w:kern w:val="2"/>
+          <w14:ligatures w14:val="standardContextual"/>
+        </w:rPr>
+        <w:t>With SAM CLI, you might deploy and provide parameter overrides.</w:t>
       </w:r>
     </w:p>
     <w:p>
@@ -1089,51 +2056,21 @@
         <w:pStyle w:val="NormalWeb"/>
         <w:numPr>
           <w:ilvl w:val="0"/>
-          <w:numId w:val="3"/>
+          <w:numId w:val="10"/>
         </w:numPr>
         <w:rPr>
           <w:rFonts w:asciiTheme="minorHAnsi" w:eastAsiaTheme="minorHAnsi" w:hAnsiTheme="minorHAnsi" w:cstheme="minorBidi"/>
-          <w:color w:val="000000" w:themeColor="text1"/>
-          <w:kern w:val="2"/>
-          <w:sz w:val="22"/>
-          <w:szCs w:val="22"/>
-          <w14:ligatures w14:val="standardContextual"/>
-        </w:rPr>
-      </w:pPr>
-      <w:r>
-        <w:rPr>
-          <w:rFonts w:asciiTheme="minorHAnsi" w:eastAsiaTheme="minorHAnsi" w:hAnsiTheme="minorHAnsi" w:cstheme="minorBidi"/>
-          <w:color w:val="000000" w:themeColor="text1"/>
-          <w:kern w:val="2"/>
-          <w:sz w:val="22"/>
-          <w:szCs w:val="22"/>
-          <w14:ligatures w14:val="standardContextual"/>
-        </w:rPr>
-        <w:t xml:space="preserve">SAM </w:t>
-      </w:r>
-      <w:proofErr w:type="gramStart"/>
-      <w:r>
-        <w:rPr>
-          <w:rFonts w:asciiTheme="minorHAnsi" w:eastAsiaTheme="minorHAnsi" w:hAnsiTheme="minorHAnsi" w:cstheme="minorBidi"/>
-          <w:color w:val="000000" w:themeColor="text1"/>
-          <w:kern w:val="2"/>
-          <w:sz w:val="22"/>
-          <w:szCs w:val="22"/>
-          <w14:ligatures w14:val="standardContextual"/>
-        </w:rPr>
-        <w:t>local</w:t>
-      </w:r>
-      <w:proofErr w:type="gramEnd"/>
-      <w:r>
-        <w:rPr>
-          <w:rFonts w:asciiTheme="minorHAnsi" w:eastAsiaTheme="minorHAnsi" w:hAnsiTheme="minorHAnsi" w:cstheme="minorBidi"/>
-          <w:color w:val="000000" w:themeColor="text1"/>
-          <w:kern w:val="2"/>
-          <w:sz w:val="22"/>
-          <w:szCs w:val="22"/>
-          <w14:ligatures w14:val="standardContextual"/>
-        </w:rPr>
-        <w:t xml:space="preserve"> generate Events</w:t>
+          <w:kern w:val="2"/>
+          <w14:ligatures w14:val="standardContextual"/>
+        </w:rPr>
+      </w:pPr>
+      <w:r>
+        <w:rPr>
+          <w:rFonts w:asciiTheme="minorHAnsi" w:eastAsiaTheme="minorHAnsi" w:hAnsiTheme="minorHAnsi" w:cstheme="minorBidi"/>
+          <w:kern w:val="2"/>
+          <w14:ligatures w14:val="standardContextual"/>
+        </w:rPr>
+        <w:t>We can also specify the allowed values for a certain parameter</w:t>
       </w:r>
     </w:p>
     <w:p>
@@ -1141,24 +2078,390 @@
         <w:pStyle w:val="NormalWeb"/>
         <w:numPr>
           <w:ilvl w:val="0"/>
-          <w:numId w:val="3"/>
+          <w:numId w:val="10"/>
         </w:numPr>
         <w:rPr>
           <w:rFonts w:asciiTheme="minorHAnsi" w:eastAsiaTheme="minorHAnsi" w:hAnsiTheme="minorHAnsi" w:cstheme="minorBidi"/>
-          <w:color w:val="000000" w:themeColor="text1"/>
-          <w:kern w:val="2"/>
-          <w:sz w:val="22"/>
-          <w:szCs w:val="22"/>
-          <w14:ligatures w14:val="standardContextual"/>
-        </w:rPr>
-      </w:pPr>
-      <w:r>
-        <w:rPr>
-          <w:rFonts w:asciiTheme="minorHAnsi" w:eastAsiaTheme="minorHAnsi" w:hAnsiTheme="minorHAnsi" w:cstheme="minorBidi"/>
-          <w:color w:val="000000" w:themeColor="text1"/>
-          <w:kern w:val="2"/>
-          <w:sz w:val="22"/>
-          <w:szCs w:val="22"/>
+          <w:kern w:val="2"/>
+          <w14:ligatures w14:val="standardContextual"/>
+        </w:rPr>
+      </w:pPr>
+    </w:p>
+    <w:p>
+      <w:pPr>
+        <w:pStyle w:val="NormalWeb"/>
+        <w:ind w:left="360"/>
+        <w:rPr>
+          <w:rFonts w:asciiTheme="minorHAnsi" w:eastAsiaTheme="minorHAnsi" w:hAnsiTheme="minorHAnsi" w:cstheme="minorBidi"/>
+          <w:b/>
+          <w:bCs/>
+          <w:color w:val="000000" w:themeColor="text1"/>
+          <w:kern w:val="2"/>
+          <w:u w:val="single"/>
+          <w14:ligatures w14:val="standardContextual"/>
+        </w:rPr>
+      </w:pPr>
+      <w:r>
+        <w:rPr>
+          <w:rFonts w:asciiTheme="minorHAnsi" w:eastAsiaTheme="minorHAnsi" w:hAnsiTheme="minorHAnsi" w:cstheme="minorBidi"/>
+          <w:b/>
+          <w:bCs/>
+          <w:color w:val="000000" w:themeColor="text1"/>
+          <w:kern w:val="2"/>
+          <w:u w:val="single"/>
+          <w14:ligatures w14:val="standardContextual"/>
+        </w:rPr>
+        <w:t>using different values for the same template based on which stage we are at</w:t>
+      </w:r>
+      <w:r>
+        <w:rPr>
+          <w:rFonts w:asciiTheme="minorHAnsi" w:eastAsiaTheme="minorHAnsi" w:hAnsiTheme="minorHAnsi" w:cstheme="minorBidi"/>
+          <w:b/>
+          <w:bCs/>
+          <w:color w:val="000000" w:themeColor="text1"/>
+          <w:kern w:val="2"/>
+          <w:u w:val="single"/>
+          <w14:ligatures w14:val="standardContextual"/>
+        </w:rPr>
+        <w:t>:</w:t>
+      </w:r>
+    </w:p>
+    <w:p>
+      <w:pPr>
+        <w:pStyle w:val="NormalWeb"/>
+        <w:ind w:left="360"/>
+        <w:rPr>
+          <w:rFonts w:asciiTheme="minorHAnsi" w:eastAsiaTheme="minorHAnsi" w:hAnsiTheme="minorHAnsi" w:cstheme="minorBidi"/>
+          <w:b/>
+          <w:bCs/>
+          <w:color w:val="000000" w:themeColor="text1"/>
+          <w:kern w:val="2"/>
+          <w:u w:val="single"/>
+          <w14:ligatures w14:val="standardContextual"/>
+        </w:rPr>
+      </w:pPr>
+      <w:r>
+        <w:rPr>
+          <w:rFonts w:asciiTheme="minorHAnsi" w:eastAsiaTheme="minorHAnsi" w:hAnsiTheme="minorHAnsi" w:cstheme="minorBidi"/>
+          <w:b/>
+          <w:bCs/>
+          <w:color w:val="000000" w:themeColor="text1"/>
+          <w:kern w:val="2"/>
+          <w:u w:val="single"/>
+          <w14:ligatures w14:val="standardContextual"/>
+        </w:rPr>
+        <w:t>parameters inline</w:t>
+      </w:r>
+      <w:r>
+        <w:rPr>
+          <w:rFonts w:asciiTheme="minorHAnsi" w:eastAsiaTheme="minorHAnsi" w:hAnsiTheme="minorHAnsi" w:cstheme="minorBidi"/>
+          <w:b/>
+          <w:bCs/>
+          <w:color w:val="000000" w:themeColor="text1"/>
+          <w:kern w:val="2"/>
+          <w:u w:val="single"/>
+          <w14:ligatures w14:val="standardContextual"/>
+        </w:rPr>
+        <w:t>:</w:t>
+      </w:r>
+    </w:p>
+    <w:p>
+      <w:pPr>
+        <w:pStyle w:val="NormalWeb"/>
+        <w:ind w:left="360"/>
+        <w:rPr>
+          <w:rFonts w:asciiTheme="minorHAnsi" w:eastAsiaTheme="minorHAnsi" w:hAnsiTheme="minorHAnsi" w:cstheme="minorBidi"/>
+          <w:b/>
+          <w:bCs/>
+          <w:color w:val="000000" w:themeColor="text1"/>
+          <w:kern w:val="2"/>
+          <w:u w:val="single"/>
+          <w14:ligatures w14:val="standardContextual"/>
+        </w:rPr>
+      </w:pPr>
+      <w:r>
+        <w:rPr>
+          <w:rFonts w:asciiTheme="minorHAnsi" w:eastAsiaTheme="minorHAnsi" w:hAnsiTheme="minorHAnsi" w:cstheme="minorBidi"/>
+          <w:b/>
+          <w:bCs/>
+          <w:color w:val="000000" w:themeColor="text1"/>
+          <w:kern w:val="2"/>
+          <w:u w:val="single"/>
+          <w14:ligatures w14:val="standardContextual"/>
+        </w:rPr>
+        <w:t>AWS CLI</w:t>
+      </w:r>
+      <w:r>
+        <w:rPr>
+          <w:rFonts w:asciiTheme="minorHAnsi" w:eastAsiaTheme="minorHAnsi" w:hAnsiTheme="minorHAnsi" w:cstheme="minorBidi"/>
+          <w:b/>
+          <w:bCs/>
+          <w:color w:val="000000" w:themeColor="text1"/>
+          <w:kern w:val="2"/>
+          <w:u w:val="single"/>
+          <w14:ligatures w14:val="standardContextual"/>
+        </w:rPr>
+        <w:t>:</w:t>
+      </w:r>
+    </w:p>
+    <w:p>
+      <w:pPr>
+        <w:pStyle w:val="NormalWeb"/>
+        <w:ind w:left="360"/>
+        <w:rPr>
+          <w:rFonts w:asciiTheme="minorHAnsi" w:eastAsiaTheme="minorHAnsi" w:hAnsiTheme="minorHAnsi" w:cstheme="minorBidi"/>
+          <w:b/>
+          <w:bCs/>
+          <w:color w:val="000000" w:themeColor="text1"/>
+          <w:kern w:val="2"/>
+          <w:u w:val="single"/>
+          <w14:ligatures w14:val="standardContextual"/>
+        </w:rPr>
+      </w:pPr>
+      <w:r>
+        <w:rPr>
+          <w:rFonts w:asciiTheme="minorHAnsi" w:eastAsiaTheme="minorHAnsi" w:hAnsiTheme="minorHAnsi" w:cstheme="minorBidi"/>
+          <w:b/>
+          <w:bCs/>
+          <w:color w:val="000000" w:themeColor="text1"/>
+          <w:kern w:val="2"/>
+          <w:u w:val="single"/>
+          <w14:ligatures w14:val="standardContextual"/>
+        </w:rPr>
+        <w:t xml:space="preserve">SAM </w:t>
+      </w:r>
+      <w:proofErr w:type="spellStart"/>
+      <w:r>
+        <w:rPr>
+          <w:rFonts w:asciiTheme="minorHAnsi" w:eastAsiaTheme="minorHAnsi" w:hAnsiTheme="minorHAnsi" w:cstheme="minorBidi"/>
+          <w:b/>
+          <w:bCs/>
+          <w:color w:val="000000" w:themeColor="text1"/>
+          <w:kern w:val="2"/>
+          <w:u w:val="single"/>
+          <w14:ligatures w14:val="standardContextual"/>
+        </w:rPr>
+        <w:t>init</w:t>
+      </w:r>
+      <w:proofErr w:type="spellEnd"/>
+      <w:r>
+        <w:rPr>
+          <w:rFonts w:asciiTheme="minorHAnsi" w:eastAsiaTheme="minorHAnsi" w:hAnsiTheme="minorHAnsi" w:cstheme="minorBidi"/>
+          <w:b/>
+          <w:bCs/>
+          <w:color w:val="000000" w:themeColor="text1"/>
+          <w:kern w:val="2"/>
+          <w:u w:val="single"/>
+          <w14:ligatures w14:val="standardContextual"/>
+        </w:rPr>
+        <w:t>:</w:t>
+      </w:r>
+    </w:p>
+    <w:p>
+      <w:pPr>
+        <w:pStyle w:val="NormalWeb"/>
+        <w:ind w:left="360"/>
+        <w:rPr>
+          <w:rFonts w:asciiTheme="minorHAnsi" w:eastAsiaTheme="minorHAnsi" w:hAnsiTheme="minorHAnsi" w:cstheme="minorBidi"/>
+          <w:b/>
+          <w:bCs/>
+          <w:color w:val="000000" w:themeColor="text1"/>
+          <w:kern w:val="2"/>
+          <w:u w:val="single"/>
+          <w14:ligatures w14:val="standardContextual"/>
+        </w:rPr>
+      </w:pPr>
+      <w:r>
+        <w:rPr>
+          <w:rFonts w:asciiTheme="minorHAnsi" w:eastAsiaTheme="minorHAnsi" w:hAnsiTheme="minorHAnsi" w:cstheme="minorBidi"/>
+          <w:b/>
+          <w:bCs/>
+          <w:color w:val="000000" w:themeColor="text1"/>
+          <w:kern w:val="2"/>
+          <w:u w:val="single"/>
+          <w14:ligatures w14:val="standardContextual"/>
+        </w:rPr>
+        <w:t>SAM build</w:t>
+      </w:r>
+      <w:r>
+        <w:rPr>
+          <w:rFonts w:asciiTheme="minorHAnsi" w:eastAsiaTheme="minorHAnsi" w:hAnsiTheme="minorHAnsi" w:cstheme="minorBidi"/>
+          <w:b/>
+          <w:bCs/>
+          <w:color w:val="000000" w:themeColor="text1"/>
+          <w:kern w:val="2"/>
+          <w:u w:val="single"/>
+          <w14:ligatures w14:val="standardContextual"/>
+        </w:rPr>
+        <w:t>:</w:t>
+      </w:r>
+    </w:p>
+    <w:p>
+      <w:pPr>
+        <w:pStyle w:val="NormalWeb"/>
+        <w:ind w:left="360"/>
+        <w:rPr>
+          <w:rFonts w:asciiTheme="minorHAnsi" w:eastAsiaTheme="minorHAnsi" w:hAnsiTheme="minorHAnsi" w:cstheme="minorBidi"/>
+          <w:b/>
+          <w:bCs/>
+          <w:color w:val="000000" w:themeColor="text1"/>
+          <w:kern w:val="2"/>
+          <w:u w:val="single"/>
+          <w14:ligatures w14:val="standardContextual"/>
+        </w:rPr>
+      </w:pPr>
+      <w:r>
+        <w:rPr>
+          <w:rFonts w:asciiTheme="minorHAnsi" w:eastAsiaTheme="minorHAnsi" w:hAnsiTheme="minorHAnsi" w:cstheme="minorBidi"/>
+          <w:b/>
+          <w:bCs/>
+          <w:color w:val="000000" w:themeColor="text1"/>
+          <w:kern w:val="2"/>
+          <w:u w:val="single"/>
+          <w14:ligatures w14:val="standardContextual"/>
+        </w:rPr>
+        <w:t>SAM package</w:t>
+      </w:r>
+      <w:r>
+        <w:rPr>
+          <w:rFonts w:asciiTheme="minorHAnsi" w:eastAsiaTheme="minorHAnsi" w:hAnsiTheme="minorHAnsi" w:cstheme="minorBidi"/>
+          <w:b/>
+          <w:bCs/>
+          <w:color w:val="000000" w:themeColor="text1"/>
+          <w:kern w:val="2"/>
+          <w:u w:val="single"/>
+          <w14:ligatures w14:val="standardContextual"/>
+        </w:rPr>
+        <w:t>:</w:t>
+      </w:r>
+    </w:p>
+    <w:p>
+      <w:pPr>
+        <w:pStyle w:val="NormalWeb"/>
+        <w:ind w:left="360"/>
+        <w:rPr>
+          <w:rFonts w:asciiTheme="minorHAnsi" w:eastAsiaTheme="minorHAnsi" w:hAnsiTheme="minorHAnsi" w:cstheme="minorBidi"/>
+          <w:b/>
+          <w:bCs/>
+          <w:color w:val="000000" w:themeColor="text1"/>
+          <w:kern w:val="2"/>
+          <w:u w:val="single"/>
+          <w14:ligatures w14:val="standardContextual"/>
+        </w:rPr>
+      </w:pPr>
+      <w:r>
+        <w:rPr>
+          <w:rFonts w:asciiTheme="minorHAnsi" w:eastAsiaTheme="minorHAnsi" w:hAnsiTheme="minorHAnsi" w:cstheme="minorBidi"/>
+          <w:b/>
+          <w:bCs/>
+          <w:color w:val="000000" w:themeColor="text1"/>
+          <w:kern w:val="2"/>
+          <w:u w:val="single"/>
+          <w14:ligatures w14:val="standardContextual"/>
+        </w:rPr>
+        <w:t>SAM deploy</w:t>
+      </w:r>
+      <w:r>
+        <w:rPr>
+          <w:rFonts w:asciiTheme="minorHAnsi" w:eastAsiaTheme="minorHAnsi" w:hAnsiTheme="minorHAnsi" w:cstheme="minorBidi"/>
+          <w:b/>
+          <w:bCs/>
+          <w:color w:val="000000" w:themeColor="text1"/>
+          <w:kern w:val="2"/>
+          <w:u w:val="single"/>
+          <w14:ligatures w14:val="standardContextual"/>
+        </w:rPr>
+        <w:t>:</w:t>
+      </w:r>
+    </w:p>
+    <w:p>
+      <w:pPr>
+        <w:pStyle w:val="NormalWeb"/>
+        <w:ind w:left="360"/>
+        <w:rPr>
+          <w:rFonts w:asciiTheme="minorHAnsi" w:eastAsiaTheme="minorHAnsi" w:hAnsiTheme="minorHAnsi" w:cstheme="minorBidi"/>
+          <w:b/>
+          <w:bCs/>
+          <w:color w:val="000000" w:themeColor="text1"/>
+          <w:kern w:val="2"/>
+          <w:u w:val="single"/>
+          <w14:ligatures w14:val="standardContextual"/>
+        </w:rPr>
+      </w:pPr>
+      <w:r>
+        <w:rPr>
+          <w:rFonts w:asciiTheme="minorHAnsi" w:eastAsiaTheme="minorHAnsi" w:hAnsiTheme="minorHAnsi" w:cstheme="minorBidi"/>
+          <w:b/>
+          <w:bCs/>
+          <w:color w:val="000000" w:themeColor="text1"/>
+          <w:kern w:val="2"/>
+          <w:u w:val="single"/>
+          <w14:ligatures w14:val="standardContextual"/>
+        </w:rPr>
+        <w:t>SAM local</w:t>
+      </w:r>
+      <w:r>
+        <w:rPr>
+          <w:rFonts w:asciiTheme="minorHAnsi" w:eastAsiaTheme="minorHAnsi" w:hAnsiTheme="minorHAnsi" w:cstheme="minorBidi"/>
+          <w:b/>
+          <w:bCs/>
+          <w:color w:val="000000" w:themeColor="text1"/>
+          <w:kern w:val="2"/>
+          <w:u w:val="single"/>
+          <w14:ligatures w14:val="standardContextual"/>
+        </w:rPr>
+        <w:t>:</w:t>
+      </w:r>
+    </w:p>
+    <w:p>
+      <w:pPr>
+        <w:pStyle w:val="NormalWeb"/>
+        <w:ind w:left="360"/>
+        <w:rPr>
+          <w:rFonts w:asciiTheme="minorHAnsi" w:eastAsiaTheme="minorHAnsi" w:hAnsiTheme="minorHAnsi" w:cstheme="minorBidi"/>
+          <w:b/>
+          <w:bCs/>
+          <w:color w:val="000000" w:themeColor="text1"/>
+          <w:kern w:val="2"/>
+          <w:u w:val="single"/>
+          <w14:ligatures w14:val="standardContextual"/>
+        </w:rPr>
+      </w:pPr>
+      <w:r>
+        <w:rPr>
+          <w:rFonts w:asciiTheme="minorHAnsi" w:eastAsiaTheme="minorHAnsi" w:hAnsiTheme="minorHAnsi" w:cstheme="minorBidi"/>
+          <w:b/>
+          <w:bCs/>
+          <w:color w:val="000000" w:themeColor="text1"/>
+          <w:kern w:val="2"/>
+          <w:u w:val="single"/>
+          <w14:ligatures w14:val="standardContextual"/>
+        </w:rPr>
+        <w:t>SAM local generate Events</w:t>
+      </w:r>
+    </w:p>
+    <w:p>
+      <w:pPr>
+        <w:pStyle w:val="NormalWeb"/>
+        <w:ind w:left="360"/>
+        <w:rPr>
+          <w:rFonts w:asciiTheme="minorHAnsi" w:eastAsiaTheme="minorHAnsi" w:hAnsiTheme="minorHAnsi" w:cstheme="minorBidi"/>
+          <w:b/>
+          <w:bCs/>
+          <w:color w:val="000000" w:themeColor="text1"/>
+          <w:kern w:val="2"/>
+          <w:u w:val="single"/>
+          <w14:ligatures w14:val="standardContextual"/>
+        </w:rPr>
+      </w:pPr>
+      <w:r>
+        <w:rPr>
+          <w:rFonts w:asciiTheme="minorHAnsi" w:eastAsiaTheme="minorHAnsi" w:hAnsiTheme="minorHAnsi" w:cstheme="minorBidi"/>
+          <w:b/>
+          <w:bCs/>
+          <w:color w:val="000000" w:themeColor="text1"/>
+          <w:kern w:val="2"/>
+          <w:u w:val="single"/>
           <w14:ligatures w14:val="standardContextual"/>
         </w:rPr>
         <w:t>SAM local start-</w:t>
@@ -1167,10 +2470,11 @@
       <w:r>
         <w:rPr>
           <w:rFonts w:asciiTheme="minorHAnsi" w:eastAsiaTheme="minorHAnsi" w:hAnsiTheme="minorHAnsi" w:cstheme="minorBidi"/>
-          <w:color w:val="000000" w:themeColor="text1"/>
-          <w:kern w:val="2"/>
-          <w:sz w:val="22"/>
-          <w:szCs w:val="22"/>
+          <w:b/>
+          <w:bCs/>
+          <w:color w:val="000000" w:themeColor="text1"/>
+          <w:kern w:val="2"/>
+          <w:u w:val="single"/>
           <w14:ligatures w14:val="standardContextual"/>
         </w:rPr>
         <w:t>api</w:t>
@@ -1180,26 +2484,25 @@
     <w:p>
       <w:pPr>
         <w:pStyle w:val="NormalWeb"/>
-        <w:numPr>
-          <w:ilvl w:val="0"/>
-          <w:numId w:val="3"/>
-        </w:numPr>
-        <w:rPr>
-          <w:rFonts w:asciiTheme="minorHAnsi" w:eastAsiaTheme="minorHAnsi" w:hAnsiTheme="minorHAnsi" w:cstheme="minorBidi"/>
-          <w:color w:val="000000" w:themeColor="text1"/>
-          <w:kern w:val="2"/>
-          <w:sz w:val="22"/>
-          <w:szCs w:val="22"/>
-          <w14:ligatures w14:val="standardContextual"/>
-        </w:rPr>
-      </w:pPr>
-      <w:r>
-        <w:rPr>
-          <w:rFonts w:asciiTheme="minorHAnsi" w:eastAsiaTheme="minorHAnsi" w:hAnsiTheme="minorHAnsi" w:cstheme="minorBidi"/>
-          <w:color w:val="000000" w:themeColor="text1"/>
-          <w:kern w:val="2"/>
-          <w:sz w:val="22"/>
-          <w:szCs w:val="22"/>
+        <w:ind w:left="360"/>
+        <w:rPr>
+          <w:rFonts w:asciiTheme="minorHAnsi" w:eastAsiaTheme="minorHAnsi" w:hAnsiTheme="minorHAnsi" w:cstheme="minorBidi"/>
+          <w:b/>
+          <w:bCs/>
+          <w:color w:val="000000" w:themeColor="text1"/>
+          <w:kern w:val="2"/>
+          <w:u w:val="single"/>
+          <w14:ligatures w14:val="standardContextual"/>
+        </w:rPr>
+      </w:pPr>
+      <w:r>
+        <w:rPr>
+          <w:rFonts w:asciiTheme="minorHAnsi" w:eastAsiaTheme="minorHAnsi" w:hAnsiTheme="minorHAnsi" w:cstheme="minorBidi"/>
+          <w:b/>
+          <w:bCs/>
+          <w:color w:val="000000" w:themeColor="text1"/>
+          <w:kern w:val="2"/>
+          <w:u w:val="single"/>
           <w14:ligatures w14:val="standardContextual"/>
         </w:rPr>
         <w:t>SAM local start-lambda</w:t>
@@ -1208,78 +2511,52 @@
     <w:p>
       <w:pPr>
         <w:pStyle w:val="NormalWeb"/>
-        <w:numPr>
-          <w:ilvl w:val="0"/>
-          <w:numId w:val="3"/>
-        </w:numPr>
-        <w:rPr>
-          <w:rFonts w:asciiTheme="minorHAnsi" w:eastAsiaTheme="minorHAnsi" w:hAnsiTheme="minorHAnsi" w:cstheme="minorBidi"/>
-          <w:color w:val="000000" w:themeColor="text1"/>
-          <w:kern w:val="2"/>
-          <w:sz w:val="22"/>
-          <w:szCs w:val="22"/>
-          <w14:ligatures w14:val="standardContextual"/>
-        </w:rPr>
-      </w:pPr>
-      <w:r>
-        <w:rPr>
-          <w:rFonts w:asciiTheme="minorHAnsi" w:eastAsiaTheme="minorHAnsi" w:hAnsiTheme="minorHAnsi" w:cstheme="minorBidi"/>
-          <w:color w:val="000000" w:themeColor="text1"/>
-          <w:kern w:val="2"/>
-          <w:sz w:val="22"/>
-          <w:szCs w:val="22"/>
-          <w14:ligatures w14:val="standardContextual"/>
-        </w:rPr>
-        <w:t xml:space="preserve">SAM </w:t>
-      </w:r>
-      <w:proofErr w:type="gramStart"/>
-      <w:r>
-        <w:rPr>
-          <w:rFonts w:asciiTheme="minorHAnsi" w:eastAsiaTheme="minorHAnsi" w:hAnsiTheme="minorHAnsi" w:cstheme="minorBidi"/>
-          <w:color w:val="000000" w:themeColor="text1"/>
-          <w:kern w:val="2"/>
-          <w:sz w:val="22"/>
-          <w:szCs w:val="22"/>
-          <w14:ligatures w14:val="standardContextual"/>
-        </w:rPr>
-        <w:t>local</w:t>
-      </w:r>
-      <w:proofErr w:type="gramEnd"/>
-      <w:r>
-        <w:rPr>
-          <w:rFonts w:asciiTheme="minorHAnsi" w:eastAsiaTheme="minorHAnsi" w:hAnsiTheme="minorHAnsi" w:cstheme="minorBidi"/>
-          <w:color w:val="000000" w:themeColor="text1"/>
-          <w:kern w:val="2"/>
-          <w:sz w:val="22"/>
-          <w:szCs w:val="22"/>
-          <w14:ligatures w14:val="standardContextual"/>
-        </w:rPr>
-        <w:t xml:space="preserve"> invoke-lambda</w:t>
+        <w:ind w:left="360"/>
+        <w:rPr>
+          <w:rFonts w:asciiTheme="minorHAnsi" w:eastAsiaTheme="minorHAnsi" w:hAnsiTheme="minorHAnsi" w:cstheme="minorBidi"/>
+          <w:b/>
+          <w:bCs/>
+          <w:color w:val="000000" w:themeColor="text1"/>
+          <w:kern w:val="2"/>
+          <w:u w:val="single"/>
+          <w14:ligatures w14:val="standardContextual"/>
+        </w:rPr>
+      </w:pPr>
+      <w:r>
+        <w:rPr>
+          <w:rFonts w:asciiTheme="minorHAnsi" w:eastAsiaTheme="minorHAnsi" w:hAnsiTheme="minorHAnsi" w:cstheme="minorBidi"/>
+          <w:b/>
+          <w:bCs/>
+          <w:color w:val="000000" w:themeColor="text1"/>
+          <w:kern w:val="2"/>
+          <w:u w:val="single"/>
+          <w14:ligatures w14:val="standardContextual"/>
+        </w:rPr>
+        <w:t>SAM local invoke-lambda</w:t>
       </w:r>
     </w:p>
     <w:p>
       <w:pPr>
         <w:pStyle w:val="NormalWeb"/>
-        <w:numPr>
-          <w:ilvl w:val="0"/>
-          <w:numId w:val="3"/>
-        </w:numPr>
-        <w:rPr>
-          <w:rFonts w:asciiTheme="minorHAnsi" w:eastAsiaTheme="minorHAnsi" w:hAnsiTheme="minorHAnsi" w:cstheme="minorBidi"/>
-          <w:color w:val="000000" w:themeColor="text1"/>
-          <w:kern w:val="2"/>
-          <w:sz w:val="22"/>
-          <w:szCs w:val="22"/>
-          <w14:ligatures w14:val="standardContextual"/>
-        </w:rPr>
-      </w:pPr>
-      <w:r>
-        <w:rPr>
-          <w:rFonts w:asciiTheme="minorHAnsi" w:eastAsiaTheme="minorHAnsi" w:hAnsiTheme="minorHAnsi" w:cstheme="minorBidi"/>
-          <w:color w:val="000000" w:themeColor="text1"/>
-          <w:kern w:val="2"/>
-          <w:sz w:val="22"/>
-          <w:szCs w:val="22"/>
+        <w:ind w:left="360"/>
+        <w:rPr>
+          <w:rFonts w:asciiTheme="minorHAnsi" w:eastAsiaTheme="minorHAnsi" w:hAnsiTheme="minorHAnsi" w:cstheme="minorBidi"/>
+          <w:b/>
+          <w:bCs/>
+          <w:color w:val="000000" w:themeColor="text1"/>
+          <w:kern w:val="2"/>
+          <w:u w:val="single"/>
+          <w14:ligatures w14:val="standardContextual"/>
+        </w:rPr>
+      </w:pPr>
+      <w:r>
+        <w:rPr>
+          <w:rFonts w:asciiTheme="minorHAnsi" w:eastAsiaTheme="minorHAnsi" w:hAnsiTheme="minorHAnsi" w:cstheme="minorBidi"/>
+          <w:b/>
+          <w:bCs/>
+          <w:color w:val="000000" w:themeColor="text1"/>
+          <w:kern w:val="2"/>
+          <w:u w:val="single"/>
           <w14:ligatures w14:val="standardContextual"/>
         </w:rPr>
         <w:t>SAM logs</w:t>
@@ -1349,6 +2626,458 @@
 <file path=word/numbering.xml><?xml version="1.0" encoding="utf-8"?>
 <w:numbering xmlns:wpc="http://schemas.microsoft.com/office/word/2010/wordprocessingCanvas" xmlns:cx="http://schemas.microsoft.com/office/drawing/2014/chartex" xmlns:cx1="http://schemas.microsoft.com/office/drawing/2015/9/8/chartex" xmlns:cx2="http://schemas.microsoft.com/office/drawing/2015/10/21/chartex" xmlns:cx3="http://schemas.microsoft.com/office/drawing/2016/5/9/chartex" xmlns:cx4="http://schemas.microsoft.com/office/drawing/2016/5/10/chartex" xmlns:cx5="http://schemas.microsoft.com/office/drawing/2016/5/11/chartex" xmlns:cx6="http://schemas.microsoft.com/office/drawing/2016/5/12/chartex" xmlns:cx7="http://schemas.microsoft.com/office/drawing/2016/5/13/chartex" xmlns:cx8="http://schemas.microsoft.com/office/drawing/2016/5/14/chartex" xmlns:mc="http://schemas.openxmlformats.org/markup-compatibility/2006" xmlns:aink="http://schemas.microsoft.com/office/drawing/2016/ink" xmlns:am3d="http://schemas.microsoft.com/office/drawing/2017/model3d" xmlns:o="urn:schemas-microsoft-com:office:office" xmlns:oel="http://schemas.microsoft.com/office/2019/extlst" xmlns:r="http://schemas.openxmlformats.org/officeDocument/2006/relationships" xmlns:m="http://schemas.openxmlformats.org/officeDocument/2006/math" xmlns:v="urn:schemas-microsoft-com:vml" xmlns:wp14="http://schemas.microsoft.com/office/word/2010/wordprocessingDrawing" xmlns:wp="http://schemas.openxmlformats.org/drawingml/2006/wordprocessingDrawing" xmlns:w10="urn:schemas-microsoft-com:office:word" xmlns:w="http://schemas.openxmlformats.org/wordprocessingml/2006/main" xmlns:w14="http://schemas.microsoft.com/office/word/2010/wordml" xmlns:w15="http://schemas.microsoft.com/office/word/2012/wordml" xmlns:w16cex="http://schemas.microsoft.com/office/word/2018/wordml/cex" xmlns:w16cid="http://schemas.microsoft.com/office/word/2016/wordml/cid" xmlns:w16="http://schemas.microsoft.com/office/word/2018/wordml" xmlns:w16du="http://schemas.microsoft.com/office/word/2023/wordml/word16du" xmlns:w16sdtdh="http://schemas.microsoft.com/office/word/2020/wordml/sdtdatahash" xmlns:w16sdtfl="http://schemas.microsoft.com/office/word/2024/wordml/sdtformatlock" xmlns:w16se="http://schemas.microsoft.com/office/word/2015/wordml/symex" xmlns:wpg="http://schemas.microsoft.com/office/word/2010/wordprocessingGroup" xmlns:wpi="http://schemas.microsoft.com/office/word/2010/wordprocessingInk" xmlns:wne="http://schemas.microsoft.com/office/word/2006/wordml" xmlns:wps="http://schemas.microsoft.com/office/word/2010/wordprocessingShape" mc:Ignorable="w14 w15 w16se w16cid w16 w16cex w16sdtdh w16sdtfl w16du wp14">
   <w:abstractNum w:abstractNumId="0" w15:restartNumberingAfterBreak="0">
+    <w:nsid w:val="0F3D4982"/>
+    <w:multiLevelType w:val="hybridMultilevel"/>
+    <w:tmpl w:val="6926477C"/>
+    <w:lvl w:ilvl="0" w:tplc="04090001">
+      <w:start w:val="1"/>
+      <w:numFmt w:val="bullet"/>
+      <w:lvlText w:val=""/>
+      <w:lvlJc w:val="left"/>
+      <w:pPr>
+        <w:ind w:left="1080" w:hanging="360"/>
+      </w:pPr>
+      <w:rPr>
+        <w:rFonts w:ascii="Symbol" w:hAnsi="Symbol" w:hint="default"/>
+      </w:rPr>
+    </w:lvl>
+    <w:lvl w:ilvl="1" w:tplc="04090003" w:tentative="1">
+      <w:start w:val="1"/>
+      <w:numFmt w:val="bullet"/>
+      <w:lvlText w:val="o"/>
+      <w:lvlJc w:val="left"/>
+      <w:pPr>
+        <w:ind w:left="1800" w:hanging="360"/>
+      </w:pPr>
+      <w:rPr>
+        <w:rFonts w:ascii="Courier New" w:hAnsi="Courier New" w:cs="Courier New" w:hint="default"/>
+      </w:rPr>
+    </w:lvl>
+    <w:lvl w:ilvl="2" w:tplc="04090005" w:tentative="1">
+      <w:start w:val="1"/>
+      <w:numFmt w:val="bullet"/>
+      <w:lvlText w:val=""/>
+      <w:lvlJc w:val="left"/>
+      <w:pPr>
+        <w:ind w:left="2520" w:hanging="360"/>
+      </w:pPr>
+      <w:rPr>
+        <w:rFonts w:ascii="Wingdings" w:hAnsi="Wingdings" w:hint="default"/>
+      </w:rPr>
+    </w:lvl>
+    <w:lvl w:ilvl="3" w:tplc="04090001" w:tentative="1">
+      <w:start w:val="1"/>
+      <w:numFmt w:val="bullet"/>
+      <w:lvlText w:val=""/>
+      <w:lvlJc w:val="left"/>
+      <w:pPr>
+        <w:ind w:left="3240" w:hanging="360"/>
+      </w:pPr>
+      <w:rPr>
+        <w:rFonts w:ascii="Symbol" w:hAnsi="Symbol" w:hint="default"/>
+      </w:rPr>
+    </w:lvl>
+    <w:lvl w:ilvl="4" w:tplc="04090003" w:tentative="1">
+      <w:start w:val="1"/>
+      <w:numFmt w:val="bullet"/>
+      <w:lvlText w:val="o"/>
+      <w:lvlJc w:val="left"/>
+      <w:pPr>
+        <w:ind w:left="3960" w:hanging="360"/>
+      </w:pPr>
+      <w:rPr>
+        <w:rFonts w:ascii="Courier New" w:hAnsi="Courier New" w:cs="Courier New" w:hint="default"/>
+      </w:rPr>
+    </w:lvl>
+    <w:lvl w:ilvl="5" w:tplc="04090005" w:tentative="1">
+      <w:start w:val="1"/>
+      <w:numFmt w:val="bullet"/>
+      <w:lvlText w:val=""/>
+      <w:lvlJc w:val="left"/>
+      <w:pPr>
+        <w:ind w:left="4680" w:hanging="360"/>
+      </w:pPr>
+      <w:rPr>
+        <w:rFonts w:ascii="Wingdings" w:hAnsi="Wingdings" w:hint="default"/>
+      </w:rPr>
+    </w:lvl>
+    <w:lvl w:ilvl="6" w:tplc="04090001" w:tentative="1">
+      <w:start w:val="1"/>
+      <w:numFmt w:val="bullet"/>
+      <w:lvlText w:val=""/>
+      <w:lvlJc w:val="left"/>
+      <w:pPr>
+        <w:ind w:left="5400" w:hanging="360"/>
+      </w:pPr>
+      <w:rPr>
+        <w:rFonts w:ascii="Symbol" w:hAnsi="Symbol" w:hint="default"/>
+      </w:rPr>
+    </w:lvl>
+    <w:lvl w:ilvl="7" w:tplc="04090003" w:tentative="1">
+      <w:start w:val="1"/>
+      <w:numFmt w:val="bullet"/>
+      <w:lvlText w:val="o"/>
+      <w:lvlJc w:val="left"/>
+      <w:pPr>
+        <w:ind w:left="6120" w:hanging="360"/>
+      </w:pPr>
+      <w:rPr>
+        <w:rFonts w:ascii="Courier New" w:hAnsi="Courier New" w:cs="Courier New" w:hint="default"/>
+      </w:rPr>
+    </w:lvl>
+    <w:lvl w:ilvl="8" w:tplc="04090005" w:tentative="1">
+      <w:start w:val="1"/>
+      <w:numFmt w:val="bullet"/>
+      <w:lvlText w:val=""/>
+      <w:lvlJc w:val="left"/>
+      <w:pPr>
+        <w:ind w:left="6840" w:hanging="360"/>
+      </w:pPr>
+      <w:rPr>
+        <w:rFonts w:ascii="Wingdings" w:hAnsi="Wingdings" w:hint="default"/>
+      </w:rPr>
+    </w:lvl>
+  </w:abstractNum>
+  <w:abstractNum w:abstractNumId="1" w15:restartNumberingAfterBreak="0">
+    <w:nsid w:val="15A517CA"/>
+    <w:multiLevelType w:val="hybridMultilevel"/>
+    <w:tmpl w:val="25662EC8"/>
+    <w:lvl w:ilvl="0" w:tplc="04090001">
+      <w:start w:val="1"/>
+      <w:numFmt w:val="bullet"/>
+      <w:lvlText w:val=""/>
+      <w:lvlJc w:val="left"/>
+      <w:pPr>
+        <w:ind w:left="1080" w:hanging="360"/>
+      </w:pPr>
+      <w:rPr>
+        <w:rFonts w:ascii="Symbol" w:hAnsi="Symbol" w:hint="default"/>
+      </w:rPr>
+    </w:lvl>
+    <w:lvl w:ilvl="1" w:tplc="04090003" w:tentative="1">
+      <w:start w:val="1"/>
+      <w:numFmt w:val="bullet"/>
+      <w:lvlText w:val="o"/>
+      <w:lvlJc w:val="left"/>
+      <w:pPr>
+        <w:ind w:left="1800" w:hanging="360"/>
+      </w:pPr>
+      <w:rPr>
+        <w:rFonts w:ascii="Courier New" w:hAnsi="Courier New" w:cs="Courier New" w:hint="default"/>
+      </w:rPr>
+    </w:lvl>
+    <w:lvl w:ilvl="2" w:tplc="04090005" w:tentative="1">
+      <w:start w:val="1"/>
+      <w:numFmt w:val="bullet"/>
+      <w:lvlText w:val=""/>
+      <w:lvlJc w:val="left"/>
+      <w:pPr>
+        <w:ind w:left="2520" w:hanging="360"/>
+      </w:pPr>
+      <w:rPr>
+        <w:rFonts w:ascii="Wingdings" w:hAnsi="Wingdings" w:hint="default"/>
+      </w:rPr>
+    </w:lvl>
+    <w:lvl w:ilvl="3" w:tplc="04090001" w:tentative="1">
+      <w:start w:val="1"/>
+      <w:numFmt w:val="bullet"/>
+      <w:lvlText w:val=""/>
+      <w:lvlJc w:val="left"/>
+      <w:pPr>
+        <w:ind w:left="3240" w:hanging="360"/>
+      </w:pPr>
+      <w:rPr>
+        <w:rFonts w:ascii="Symbol" w:hAnsi="Symbol" w:hint="default"/>
+      </w:rPr>
+    </w:lvl>
+    <w:lvl w:ilvl="4" w:tplc="04090003" w:tentative="1">
+      <w:start w:val="1"/>
+      <w:numFmt w:val="bullet"/>
+      <w:lvlText w:val="o"/>
+      <w:lvlJc w:val="left"/>
+      <w:pPr>
+        <w:ind w:left="3960" w:hanging="360"/>
+      </w:pPr>
+      <w:rPr>
+        <w:rFonts w:ascii="Courier New" w:hAnsi="Courier New" w:cs="Courier New" w:hint="default"/>
+      </w:rPr>
+    </w:lvl>
+    <w:lvl w:ilvl="5" w:tplc="04090005" w:tentative="1">
+      <w:start w:val="1"/>
+      <w:numFmt w:val="bullet"/>
+      <w:lvlText w:val=""/>
+      <w:lvlJc w:val="left"/>
+      <w:pPr>
+        <w:ind w:left="4680" w:hanging="360"/>
+      </w:pPr>
+      <w:rPr>
+        <w:rFonts w:ascii="Wingdings" w:hAnsi="Wingdings" w:hint="default"/>
+      </w:rPr>
+    </w:lvl>
+    <w:lvl w:ilvl="6" w:tplc="04090001" w:tentative="1">
+      <w:start w:val="1"/>
+      <w:numFmt w:val="bullet"/>
+      <w:lvlText w:val=""/>
+      <w:lvlJc w:val="left"/>
+      <w:pPr>
+        <w:ind w:left="5400" w:hanging="360"/>
+      </w:pPr>
+      <w:rPr>
+        <w:rFonts w:ascii="Symbol" w:hAnsi="Symbol" w:hint="default"/>
+      </w:rPr>
+    </w:lvl>
+    <w:lvl w:ilvl="7" w:tplc="04090003" w:tentative="1">
+      <w:start w:val="1"/>
+      <w:numFmt w:val="bullet"/>
+      <w:lvlText w:val="o"/>
+      <w:lvlJc w:val="left"/>
+      <w:pPr>
+        <w:ind w:left="6120" w:hanging="360"/>
+      </w:pPr>
+      <w:rPr>
+        <w:rFonts w:ascii="Courier New" w:hAnsi="Courier New" w:cs="Courier New" w:hint="default"/>
+      </w:rPr>
+    </w:lvl>
+    <w:lvl w:ilvl="8" w:tplc="04090005" w:tentative="1">
+      <w:start w:val="1"/>
+      <w:numFmt w:val="bullet"/>
+      <w:lvlText w:val=""/>
+      <w:lvlJc w:val="left"/>
+      <w:pPr>
+        <w:ind w:left="6840" w:hanging="360"/>
+      </w:pPr>
+      <w:rPr>
+        <w:rFonts w:ascii="Wingdings" w:hAnsi="Wingdings" w:hint="default"/>
+      </w:rPr>
+    </w:lvl>
+  </w:abstractNum>
+  <w:abstractNum w:abstractNumId="2" w15:restartNumberingAfterBreak="0">
+    <w:nsid w:val="2ADD0BC0"/>
+    <w:multiLevelType w:val="hybridMultilevel"/>
+    <w:tmpl w:val="DF08CDB2"/>
+    <w:lvl w:ilvl="0" w:tplc="04090001">
+      <w:start w:val="1"/>
+      <w:numFmt w:val="bullet"/>
+      <w:lvlText w:val=""/>
+      <w:lvlJc w:val="left"/>
+      <w:pPr>
+        <w:ind w:left="720" w:hanging="360"/>
+      </w:pPr>
+      <w:rPr>
+        <w:rFonts w:ascii="Symbol" w:hAnsi="Symbol" w:hint="default"/>
+      </w:rPr>
+    </w:lvl>
+    <w:lvl w:ilvl="1" w:tplc="04090003" w:tentative="1">
+      <w:start w:val="1"/>
+      <w:numFmt w:val="bullet"/>
+      <w:lvlText w:val="o"/>
+      <w:lvlJc w:val="left"/>
+      <w:pPr>
+        <w:ind w:left="1440" w:hanging="360"/>
+      </w:pPr>
+      <w:rPr>
+        <w:rFonts w:ascii="Courier New" w:hAnsi="Courier New" w:cs="Courier New" w:hint="default"/>
+      </w:rPr>
+    </w:lvl>
+    <w:lvl w:ilvl="2" w:tplc="04090005" w:tentative="1">
+      <w:start w:val="1"/>
+      <w:numFmt w:val="bullet"/>
+      <w:lvlText w:val=""/>
+      <w:lvlJc w:val="left"/>
+      <w:pPr>
+        <w:ind w:left="2160" w:hanging="360"/>
+      </w:pPr>
+      <w:rPr>
+        <w:rFonts w:ascii="Wingdings" w:hAnsi="Wingdings" w:hint="default"/>
+      </w:rPr>
+    </w:lvl>
+    <w:lvl w:ilvl="3" w:tplc="04090001" w:tentative="1">
+      <w:start w:val="1"/>
+      <w:numFmt w:val="bullet"/>
+      <w:lvlText w:val=""/>
+      <w:lvlJc w:val="left"/>
+      <w:pPr>
+        <w:ind w:left="2880" w:hanging="360"/>
+      </w:pPr>
+      <w:rPr>
+        <w:rFonts w:ascii="Symbol" w:hAnsi="Symbol" w:hint="default"/>
+      </w:rPr>
+    </w:lvl>
+    <w:lvl w:ilvl="4" w:tplc="04090003" w:tentative="1">
+      <w:start w:val="1"/>
+      <w:numFmt w:val="bullet"/>
+      <w:lvlText w:val="o"/>
+      <w:lvlJc w:val="left"/>
+      <w:pPr>
+        <w:ind w:left="3600" w:hanging="360"/>
+      </w:pPr>
+      <w:rPr>
+        <w:rFonts w:ascii="Courier New" w:hAnsi="Courier New" w:cs="Courier New" w:hint="default"/>
+      </w:rPr>
+    </w:lvl>
+    <w:lvl w:ilvl="5" w:tplc="04090005" w:tentative="1">
+      <w:start w:val="1"/>
+      <w:numFmt w:val="bullet"/>
+      <w:lvlText w:val=""/>
+      <w:lvlJc w:val="left"/>
+      <w:pPr>
+        <w:ind w:left="4320" w:hanging="360"/>
+      </w:pPr>
+      <w:rPr>
+        <w:rFonts w:ascii="Wingdings" w:hAnsi="Wingdings" w:hint="default"/>
+      </w:rPr>
+    </w:lvl>
+    <w:lvl w:ilvl="6" w:tplc="04090001" w:tentative="1">
+      <w:start w:val="1"/>
+      <w:numFmt w:val="bullet"/>
+      <w:lvlText w:val=""/>
+      <w:lvlJc w:val="left"/>
+      <w:pPr>
+        <w:ind w:left="5040" w:hanging="360"/>
+      </w:pPr>
+      <w:rPr>
+        <w:rFonts w:ascii="Symbol" w:hAnsi="Symbol" w:hint="default"/>
+      </w:rPr>
+    </w:lvl>
+    <w:lvl w:ilvl="7" w:tplc="04090003" w:tentative="1">
+      <w:start w:val="1"/>
+      <w:numFmt w:val="bullet"/>
+      <w:lvlText w:val="o"/>
+      <w:lvlJc w:val="left"/>
+      <w:pPr>
+        <w:ind w:left="5760" w:hanging="360"/>
+      </w:pPr>
+      <w:rPr>
+        <w:rFonts w:ascii="Courier New" w:hAnsi="Courier New" w:cs="Courier New" w:hint="default"/>
+      </w:rPr>
+    </w:lvl>
+    <w:lvl w:ilvl="8" w:tplc="04090005" w:tentative="1">
+      <w:start w:val="1"/>
+      <w:numFmt w:val="bullet"/>
+      <w:lvlText w:val=""/>
+      <w:lvlJc w:val="left"/>
+      <w:pPr>
+        <w:ind w:left="6480" w:hanging="360"/>
+      </w:pPr>
+      <w:rPr>
+        <w:rFonts w:ascii="Wingdings" w:hAnsi="Wingdings" w:hint="default"/>
+      </w:rPr>
+    </w:lvl>
+  </w:abstractNum>
+  <w:abstractNum w:abstractNumId="3" w15:restartNumberingAfterBreak="0">
+    <w:nsid w:val="2C61381D"/>
+    <w:multiLevelType w:val="hybridMultilevel"/>
+    <w:tmpl w:val="D4A6A160"/>
+    <w:lvl w:ilvl="0" w:tplc="04090001">
+      <w:start w:val="1"/>
+      <w:numFmt w:val="bullet"/>
+      <w:lvlText w:val=""/>
+      <w:lvlJc w:val="left"/>
+      <w:pPr>
+        <w:ind w:left="1440" w:hanging="360"/>
+      </w:pPr>
+      <w:rPr>
+        <w:rFonts w:ascii="Symbol" w:hAnsi="Symbol" w:hint="default"/>
+      </w:rPr>
+    </w:lvl>
+    <w:lvl w:ilvl="1" w:tplc="04090003" w:tentative="1">
+      <w:start w:val="1"/>
+      <w:numFmt w:val="bullet"/>
+      <w:lvlText w:val="o"/>
+      <w:lvlJc w:val="left"/>
+      <w:pPr>
+        <w:ind w:left="2160" w:hanging="360"/>
+      </w:pPr>
+      <w:rPr>
+        <w:rFonts w:ascii="Courier New" w:hAnsi="Courier New" w:cs="Courier New" w:hint="default"/>
+      </w:rPr>
+    </w:lvl>
+    <w:lvl w:ilvl="2" w:tplc="04090005" w:tentative="1">
+      <w:start w:val="1"/>
+      <w:numFmt w:val="bullet"/>
+      <w:lvlText w:val=""/>
+      <w:lvlJc w:val="left"/>
+      <w:pPr>
+        <w:ind w:left="2880" w:hanging="360"/>
+      </w:pPr>
+      <w:rPr>
+        <w:rFonts w:ascii="Wingdings" w:hAnsi="Wingdings" w:hint="default"/>
+      </w:rPr>
+    </w:lvl>
+    <w:lvl w:ilvl="3" w:tplc="04090001" w:tentative="1">
+      <w:start w:val="1"/>
+      <w:numFmt w:val="bullet"/>
+      <w:lvlText w:val=""/>
+      <w:lvlJc w:val="left"/>
+      <w:pPr>
+        <w:ind w:left="3600" w:hanging="360"/>
+      </w:pPr>
+      <w:rPr>
+        <w:rFonts w:ascii="Symbol" w:hAnsi="Symbol" w:hint="default"/>
+      </w:rPr>
+    </w:lvl>
+    <w:lvl w:ilvl="4" w:tplc="04090003" w:tentative="1">
+      <w:start w:val="1"/>
+      <w:numFmt w:val="bullet"/>
+      <w:lvlText w:val="o"/>
+      <w:lvlJc w:val="left"/>
+      <w:pPr>
+        <w:ind w:left="4320" w:hanging="360"/>
+      </w:pPr>
+      <w:rPr>
+        <w:rFonts w:ascii="Courier New" w:hAnsi="Courier New" w:cs="Courier New" w:hint="default"/>
+      </w:rPr>
+    </w:lvl>
+    <w:lvl w:ilvl="5" w:tplc="04090005" w:tentative="1">
+      <w:start w:val="1"/>
+      <w:numFmt w:val="bullet"/>
+      <w:lvlText w:val=""/>
+      <w:lvlJc w:val="left"/>
+      <w:pPr>
+        <w:ind w:left="5040" w:hanging="360"/>
+      </w:pPr>
+      <w:rPr>
+        <w:rFonts w:ascii="Wingdings" w:hAnsi="Wingdings" w:hint="default"/>
+      </w:rPr>
+    </w:lvl>
+    <w:lvl w:ilvl="6" w:tplc="04090001" w:tentative="1">
+      <w:start w:val="1"/>
+      <w:numFmt w:val="bullet"/>
+      <w:lvlText w:val=""/>
+      <w:lvlJc w:val="left"/>
+      <w:pPr>
+        <w:ind w:left="5760" w:hanging="360"/>
+      </w:pPr>
+      <w:rPr>
+        <w:rFonts w:ascii="Symbol" w:hAnsi="Symbol" w:hint="default"/>
+      </w:rPr>
+    </w:lvl>
+    <w:lvl w:ilvl="7" w:tplc="04090003" w:tentative="1">
+      <w:start w:val="1"/>
+      <w:numFmt w:val="bullet"/>
+      <w:lvlText w:val="o"/>
+      <w:lvlJc w:val="left"/>
+      <w:pPr>
+        <w:ind w:left="6480" w:hanging="360"/>
+      </w:pPr>
+      <w:rPr>
+        <w:rFonts w:ascii="Courier New" w:hAnsi="Courier New" w:cs="Courier New" w:hint="default"/>
+      </w:rPr>
+    </w:lvl>
+    <w:lvl w:ilvl="8" w:tplc="04090005" w:tentative="1">
+      <w:start w:val="1"/>
+      <w:numFmt w:val="bullet"/>
+      <w:lvlText w:val=""/>
+      <w:lvlJc w:val="left"/>
+      <w:pPr>
+        <w:ind w:left="7200" w:hanging="360"/>
+      </w:pPr>
+      <w:rPr>
+        <w:rFonts w:ascii="Wingdings" w:hAnsi="Wingdings" w:hint="default"/>
+      </w:rPr>
+    </w:lvl>
+  </w:abstractNum>
+  <w:abstractNum w:abstractNumId="4" w15:restartNumberingAfterBreak="0">
     <w:nsid w:val="4951601C"/>
     <w:multiLevelType w:val="hybridMultilevel"/>
     <w:tmpl w:val="D9902C00"/>
@@ -1461,7 +3190,7 @@
       </w:rPr>
     </w:lvl>
   </w:abstractNum>
-  <w:abstractNum w:abstractNumId="1" w15:restartNumberingAfterBreak="0">
+  <w:abstractNum w:abstractNumId="5" w15:restartNumberingAfterBreak="0">
     <w:nsid w:val="4A265569"/>
     <w:multiLevelType w:val="hybridMultilevel"/>
     <w:tmpl w:val="D68A27CE"/>
@@ -1574,7 +3303,120 @@
       </w:rPr>
     </w:lvl>
   </w:abstractNum>
-  <w:abstractNum w:abstractNumId="2" w15:restartNumberingAfterBreak="0">
+  <w:abstractNum w:abstractNumId="6" w15:restartNumberingAfterBreak="0">
+    <w:nsid w:val="57AB13C7"/>
+    <w:multiLevelType w:val="hybridMultilevel"/>
+    <w:tmpl w:val="F2FA0B7E"/>
+    <w:lvl w:ilvl="0" w:tplc="04090001">
+      <w:start w:val="1"/>
+      <w:numFmt w:val="bullet"/>
+      <w:lvlText w:val=""/>
+      <w:lvlJc w:val="left"/>
+      <w:pPr>
+        <w:ind w:left="1080" w:hanging="360"/>
+      </w:pPr>
+      <w:rPr>
+        <w:rFonts w:ascii="Symbol" w:hAnsi="Symbol" w:hint="default"/>
+      </w:rPr>
+    </w:lvl>
+    <w:lvl w:ilvl="1" w:tplc="04090003" w:tentative="1">
+      <w:start w:val="1"/>
+      <w:numFmt w:val="bullet"/>
+      <w:lvlText w:val="o"/>
+      <w:lvlJc w:val="left"/>
+      <w:pPr>
+        <w:ind w:left="1800" w:hanging="360"/>
+      </w:pPr>
+      <w:rPr>
+        <w:rFonts w:ascii="Courier New" w:hAnsi="Courier New" w:cs="Courier New" w:hint="default"/>
+      </w:rPr>
+    </w:lvl>
+    <w:lvl w:ilvl="2" w:tplc="04090005" w:tentative="1">
+      <w:start w:val="1"/>
+      <w:numFmt w:val="bullet"/>
+      <w:lvlText w:val=""/>
+      <w:lvlJc w:val="left"/>
+      <w:pPr>
+        <w:ind w:left="2520" w:hanging="360"/>
+      </w:pPr>
+      <w:rPr>
+        <w:rFonts w:ascii="Wingdings" w:hAnsi="Wingdings" w:hint="default"/>
+      </w:rPr>
+    </w:lvl>
+    <w:lvl w:ilvl="3" w:tplc="04090001" w:tentative="1">
+      <w:start w:val="1"/>
+      <w:numFmt w:val="bullet"/>
+      <w:lvlText w:val=""/>
+      <w:lvlJc w:val="left"/>
+      <w:pPr>
+        <w:ind w:left="3240" w:hanging="360"/>
+      </w:pPr>
+      <w:rPr>
+        <w:rFonts w:ascii="Symbol" w:hAnsi="Symbol" w:hint="default"/>
+      </w:rPr>
+    </w:lvl>
+    <w:lvl w:ilvl="4" w:tplc="04090003" w:tentative="1">
+      <w:start w:val="1"/>
+      <w:numFmt w:val="bullet"/>
+      <w:lvlText w:val="o"/>
+      <w:lvlJc w:val="left"/>
+      <w:pPr>
+        <w:ind w:left="3960" w:hanging="360"/>
+      </w:pPr>
+      <w:rPr>
+        <w:rFonts w:ascii="Courier New" w:hAnsi="Courier New" w:cs="Courier New" w:hint="default"/>
+      </w:rPr>
+    </w:lvl>
+    <w:lvl w:ilvl="5" w:tplc="04090005" w:tentative="1">
+      <w:start w:val="1"/>
+      <w:numFmt w:val="bullet"/>
+      <w:lvlText w:val=""/>
+      <w:lvlJc w:val="left"/>
+      <w:pPr>
+        <w:ind w:left="4680" w:hanging="360"/>
+      </w:pPr>
+      <w:rPr>
+        <w:rFonts w:ascii="Wingdings" w:hAnsi="Wingdings" w:hint="default"/>
+      </w:rPr>
+    </w:lvl>
+    <w:lvl w:ilvl="6" w:tplc="04090001" w:tentative="1">
+      <w:start w:val="1"/>
+      <w:numFmt w:val="bullet"/>
+      <w:lvlText w:val=""/>
+      <w:lvlJc w:val="left"/>
+      <w:pPr>
+        <w:ind w:left="5400" w:hanging="360"/>
+      </w:pPr>
+      <w:rPr>
+        <w:rFonts w:ascii="Symbol" w:hAnsi="Symbol" w:hint="default"/>
+      </w:rPr>
+    </w:lvl>
+    <w:lvl w:ilvl="7" w:tplc="04090003" w:tentative="1">
+      <w:start w:val="1"/>
+      <w:numFmt w:val="bullet"/>
+      <w:lvlText w:val="o"/>
+      <w:lvlJc w:val="left"/>
+      <w:pPr>
+        <w:ind w:left="6120" w:hanging="360"/>
+      </w:pPr>
+      <w:rPr>
+        <w:rFonts w:ascii="Courier New" w:hAnsi="Courier New" w:cs="Courier New" w:hint="default"/>
+      </w:rPr>
+    </w:lvl>
+    <w:lvl w:ilvl="8" w:tplc="04090005" w:tentative="1">
+      <w:start w:val="1"/>
+      <w:numFmt w:val="bullet"/>
+      <w:lvlText w:val=""/>
+      <w:lvlJc w:val="left"/>
+      <w:pPr>
+        <w:ind w:left="6840" w:hanging="360"/>
+      </w:pPr>
+      <w:rPr>
+        <w:rFonts w:ascii="Wingdings" w:hAnsi="Wingdings" w:hint="default"/>
+      </w:rPr>
+    </w:lvl>
+  </w:abstractNum>
+  <w:abstractNum w:abstractNumId="7" w15:restartNumberingAfterBreak="0">
     <w:nsid w:val="721A24C1"/>
     <w:multiLevelType w:val="hybridMultilevel"/>
     <w:tmpl w:val="581A38B8"/>
@@ -1687,14 +3529,261 @@
       </w:rPr>
     </w:lvl>
   </w:abstractNum>
+  <w:abstractNum w:abstractNumId="8" w15:restartNumberingAfterBreak="0">
+    <w:nsid w:val="77C16ED4"/>
+    <w:multiLevelType w:val="hybridMultilevel"/>
+    <w:tmpl w:val="39304592"/>
+    <w:lvl w:ilvl="0" w:tplc="04090001">
+      <w:start w:val="1"/>
+      <w:numFmt w:val="bullet"/>
+      <w:lvlText w:val=""/>
+      <w:lvlJc w:val="left"/>
+      <w:pPr>
+        <w:ind w:left="720" w:hanging="360"/>
+      </w:pPr>
+      <w:rPr>
+        <w:rFonts w:ascii="Symbol" w:hAnsi="Symbol" w:hint="default"/>
+      </w:rPr>
+    </w:lvl>
+    <w:lvl w:ilvl="1" w:tplc="04090003" w:tentative="1">
+      <w:start w:val="1"/>
+      <w:numFmt w:val="bullet"/>
+      <w:lvlText w:val="o"/>
+      <w:lvlJc w:val="left"/>
+      <w:pPr>
+        <w:ind w:left="1440" w:hanging="360"/>
+      </w:pPr>
+      <w:rPr>
+        <w:rFonts w:ascii="Courier New" w:hAnsi="Courier New" w:cs="Courier New" w:hint="default"/>
+      </w:rPr>
+    </w:lvl>
+    <w:lvl w:ilvl="2" w:tplc="04090005" w:tentative="1">
+      <w:start w:val="1"/>
+      <w:numFmt w:val="bullet"/>
+      <w:lvlText w:val=""/>
+      <w:lvlJc w:val="left"/>
+      <w:pPr>
+        <w:ind w:left="2160" w:hanging="360"/>
+      </w:pPr>
+      <w:rPr>
+        <w:rFonts w:ascii="Wingdings" w:hAnsi="Wingdings" w:hint="default"/>
+      </w:rPr>
+    </w:lvl>
+    <w:lvl w:ilvl="3" w:tplc="04090001" w:tentative="1">
+      <w:start w:val="1"/>
+      <w:numFmt w:val="bullet"/>
+      <w:lvlText w:val=""/>
+      <w:lvlJc w:val="left"/>
+      <w:pPr>
+        <w:ind w:left="2880" w:hanging="360"/>
+      </w:pPr>
+      <w:rPr>
+        <w:rFonts w:ascii="Symbol" w:hAnsi="Symbol" w:hint="default"/>
+      </w:rPr>
+    </w:lvl>
+    <w:lvl w:ilvl="4" w:tplc="04090003" w:tentative="1">
+      <w:start w:val="1"/>
+      <w:numFmt w:val="bullet"/>
+      <w:lvlText w:val="o"/>
+      <w:lvlJc w:val="left"/>
+      <w:pPr>
+        <w:ind w:left="3600" w:hanging="360"/>
+      </w:pPr>
+      <w:rPr>
+        <w:rFonts w:ascii="Courier New" w:hAnsi="Courier New" w:cs="Courier New" w:hint="default"/>
+      </w:rPr>
+    </w:lvl>
+    <w:lvl w:ilvl="5" w:tplc="04090005" w:tentative="1">
+      <w:start w:val="1"/>
+      <w:numFmt w:val="bullet"/>
+      <w:lvlText w:val=""/>
+      <w:lvlJc w:val="left"/>
+      <w:pPr>
+        <w:ind w:left="4320" w:hanging="360"/>
+      </w:pPr>
+      <w:rPr>
+        <w:rFonts w:ascii="Wingdings" w:hAnsi="Wingdings" w:hint="default"/>
+      </w:rPr>
+    </w:lvl>
+    <w:lvl w:ilvl="6" w:tplc="04090001" w:tentative="1">
+      <w:start w:val="1"/>
+      <w:numFmt w:val="bullet"/>
+      <w:lvlText w:val=""/>
+      <w:lvlJc w:val="left"/>
+      <w:pPr>
+        <w:ind w:left="5040" w:hanging="360"/>
+      </w:pPr>
+      <w:rPr>
+        <w:rFonts w:ascii="Symbol" w:hAnsi="Symbol" w:hint="default"/>
+      </w:rPr>
+    </w:lvl>
+    <w:lvl w:ilvl="7" w:tplc="04090003" w:tentative="1">
+      <w:start w:val="1"/>
+      <w:numFmt w:val="bullet"/>
+      <w:lvlText w:val="o"/>
+      <w:lvlJc w:val="left"/>
+      <w:pPr>
+        <w:ind w:left="5760" w:hanging="360"/>
+      </w:pPr>
+      <w:rPr>
+        <w:rFonts w:ascii="Courier New" w:hAnsi="Courier New" w:cs="Courier New" w:hint="default"/>
+      </w:rPr>
+    </w:lvl>
+    <w:lvl w:ilvl="8" w:tplc="04090005" w:tentative="1">
+      <w:start w:val="1"/>
+      <w:numFmt w:val="bullet"/>
+      <w:lvlText w:val=""/>
+      <w:lvlJc w:val="left"/>
+      <w:pPr>
+        <w:ind w:left="6480" w:hanging="360"/>
+      </w:pPr>
+      <w:rPr>
+        <w:rFonts w:ascii="Wingdings" w:hAnsi="Wingdings" w:hint="default"/>
+      </w:rPr>
+    </w:lvl>
+  </w:abstractNum>
+  <w:abstractNum w:abstractNumId="9" w15:restartNumberingAfterBreak="0">
+    <w:nsid w:val="79F7437E"/>
+    <w:multiLevelType w:val="hybridMultilevel"/>
+    <w:tmpl w:val="EA3E0D58"/>
+    <w:lvl w:ilvl="0" w:tplc="04090001">
+      <w:start w:val="1"/>
+      <w:numFmt w:val="bullet"/>
+      <w:lvlText w:val=""/>
+      <w:lvlJc w:val="left"/>
+      <w:pPr>
+        <w:ind w:left="720" w:hanging="360"/>
+      </w:pPr>
+      <w:rPr>
+        <w:rFonts w:ascii="Symbol" w:hAnsi="Symbol" w:hint="default"/>
+      </w:rPr>
+    </w:lvl>
+    <w:lvl w:ilvl="1" w:tplc="04090003" w:tentative="1">
+      <w:start w:val="1"/>
+      <w:numFmt w:val="bullet"/>
+      <w:lvlText w:val="o"/>
+      <w:lvlJc w:val="left"/>
+      <w:pPr>
+        <w:ind w:left="1440" w:hanging="360"/>
+      </w:pPr>
+      <w:rPr>
+        <w:rFonts w:ascii="Courier New" w:hAnsi="Courier New" w:cs="Courier New" w:hint="default"/>
+      </w:rPr>
+    </w:lvl>
+    <w:lvl w:ilvl="2" w:tplc="04090005" w:tentative="1">
+      <w:start w:val="1"/>
+      <w:numFmt w:val="bullet"/>
+      <w:lvlText w:val=""/>
+      <w:lvlJc w:val="left"/>
+      <w:pPr>
+        <w:ind w:left="2160" w:hanging="360"/>
+      </w:pPr>
+      <w:rPr>
+        <w:rFonts w:ascii="Wingdings" w:hAnsi="Wingdings" w:hint="default"/>
+      </w:rPr>
+    </w:lvl>
+    <w:lvl w:ilvl="3" w:tplc="04090001" w:tentative="1">
+      <w:start w:val="1"/>
+      <w:numFmt w:val="bullet"/>
+      <w:lvlText w:val=""/>
+      <w:lvlJc w:val="left"/>
+      <w:pPr>
+        <w:ind w:left="2880" w:hanging="360"/>
+      </w:pPr>
+      <w:rPr>
+        <w:rFonts w:ascii="Symbol" w:hAnsi="Symbol" w:hint="default"/>
+      </w:rPr>
+    </w:lvl>
+    <w:lvl w:ilvl="4" w:tplc="04090003" w:tentative="1">
+      <w:start w:val="1"/>
+      <w:numFmt w:val="bullet"/>
+      <w:lvlText w:val="o"/>
+      <w:lvlJc w:val="left"/>
+      <w:pPr>
+        <w:ind w:left="3600" w:hanging="360"/>
+      </w:pPr>
+      <w:rPr>
+        <w:rFonts w:ascii="Courier New" w:hAnsi="Courier New" w:cs="Courier New" w:hint="default"/>
+      </w:rPr>
+    </w:lvl>
+    <w:lvl w:ilvl="5" w:tplc="04090005" w:tentative="1">
+      <w:start w:val="1"/>
+      <w:numFmt w:val="bullet"/>
+      <w:lvlText w:val=""/>
+      <w:lvlJc w:val="left"/>
+      <w:pPr>
+        <w:ind w:left="4320" w:hanging="360"/>
+      </w:pPr>
+      <w:rPr>
+        <w:rFonts w:ascii="Wingdings" w:hAnsi="Wingdings" w:hint="default"/>
+      </w:rPr>
+    </w:lvl>
+    <w:lvl w:ilvl="6" w:tplc="04090001" w:tentative="1">
+      <w:start w:val="1"/>
+      <w:numFmt w:val="bullet"/>
+      <w:lvlText w:val=""/>
+      <w:lvlJc w:val="left"/>
+      <w:pPr>
+        <w:ind w:left="5040" w:hanging="360"/>
+      </w:pPr>
+      <w:rPr>
+        <w:rFonts w:ascii="Symbol" w:hAnsi="Symbol" w:hint="default"/>
+      </w:rPr>
+    </w:lvl>
+    <w:lvl w:ilvl="7" w:tplc="04090003" w:tentative="1">
+      <w:start w:val="1"/>
+      <w:numFmt w:val="bullet"/>
+      <w:lvlText w:val="o"/>
+      <w:lvlJc w:val="left"/>
+      <w:pPr>
+        <w:ind w:left="5760" w:hanging="360"/>
+      </w:pPr>
+      <w:rPr>
+        <w:rFonts w:ascii="Courier New" w:hAnsi="Courier New" w:cs="Courier New" w:hint="default"/>
+      </w:rPr>
+    </w:lvl>
+    <w:lvl w:ilvl="8" w:tplc="04090005" w:tentative="1">
+      <w:start w:val="1"/>
+      <w:numFmt w:val="bullet"/>
+      <w:lvlText w:val=""/>
+      <w:lvlJc w:val="left"/>
+      <w:pPr>
+        <w:ind w:left="6480" w:hanging="360"/>
+      </w:pPr>
+      <w:rPr>
+        <w:rFonts w:ascii="Wingdings" w:hAnsi="Wingdings" w:hint="default"/>
+      </w:rPr>
+    </w:lvl>
+  </w:abstractNum>
   <w:num w:numId="1" w16cid:durableId="2124877233">
+    <w:abstractNumId w:val="7"/>
+  </w:num>
+  <w:num w:numId="2" w16cid:durableId="286358884">
+    <w:abstractNumId w:val="5"/>
+  </w:num>
+  <w:num w:numId="3" w16cid:durableId="865102172">
+    <w:abstractNumId w:val="4"/>
+  </w:num>
+  <w:num w:numId="4" w16cid:durableId="1216503814">
+    <w:abstractNumId w:val="1"/>
+  </w:num>
+  <w:num w:numId="5" w16cid:durableId="989289131">
+    <w:abstractNumId w:val="0"/>
+  </w:num>
+  <w:num w:numId="6" w16cid:durableId="288055700">
     <w:abstractNumId w:val="2"/>
   </w:num>
-  <w:num w:numId="2" w16cid:durableId="286358884">
-    <w:abstractNumId w:val="1"/>
+  <w:num w:numId="7" w16cid:durableId="1693140301">
+    <w:abstractNumId w:val="6"/>
   </w:num>
-  <w:num w:numId="3" w16cid:durableId="865102172">
-    <w:abstractNumId w:val="0"/>
+  <w:num w:numId="8" w16cid:durableId="1673292260">
+    <w:abstractNumId w:val="3"/>
+  </w:num>
+  <w:num w:numId="9" w16cid:durableId="858084437">
+    <w:abstractNumId w:val="8"/>
+  </w:num>
+  <w:num w:numId="10" w16cid:durableId="1195970887">
+    <w:abstractNumId w:val="9"/>
   </w:num>
 </w:numbering>
 </file>
@@ -2631,6 +4720,95 @@
       <w14:ligatures w14:val="none"/>
     </w:rPr>
   </w:style>
+  <w:style w:type="paragraph" w:styleId="HTMLPreformatted">
+    <w:name w:val="HTML Preformatted"/>
+    <w:basedOn w:val="Normal"/>
+    <w:link w:val="HTMLPreformattedChar"/>
+    <w:uiPriority w:val="99"/>
+    <w:semiHidden/>
+    <w:unhideWhenUsed/>
+    <w:rsid w:val="00D16CB8"/>
+    <w:pPr>
+      <w:tabs>
+        <w:tab w:val="left" w:pos="916"/>
+        <w:tab w:val="left" w:pos="1832"/>
+        <w:tab w:val="left" w:pos="2748"/>
+        <w:tab w:val="left" w:pos="3664"/>
+        <w:tab w:val="left" w:pos="4580"/>
+        <w:tab w:val="left" w:pos="5496"/>
+        <w:tab w:val="left" w:pos="6412"/>
+        <w:tab w:val="left" w:pos="7328"/>
+        <w:tab w:val="left" w:pos="8244"/>
+        <w:tab w:val="left" w:pos="9160"/>
+        <w:tab w:val="left" w:pos="10076"/>
+        <w:tab w:val="left" w:pos="10992"/>
+        <w:tab w:val="left" w:pos="11908"/>
+        <w:tab w:val="left" w:pos="12824"/>
+        <w:tab w:val="left" w:pos="13740"/>
+        <w:tab w:val="left" w:pos="14656"/>
+      </w:tabs>
+      <w:spacing w:after="0" w:line="240" w:lineRule="auto"/>
+    </w:pPr>
+    <w:rPr>
+      <w:rFonts w:ascii="Courier New" w:eastAsia="Times New Roman" w:hAnsi="Courier New" w:cs="Courier New"/>
+      <w:kern w:val="0"/>
+      <w:sz w:val="20"/>
+      <w:szCs w:val="20"/>
+      <w14:ligatures w14:val="none"/>
+    </w:rPr>
+  </w:style>
+  <w:style w:type="character" w:customStyle="1" w:styleId="HTMLPreformattedChar">
+    <w:name w:val="HTML Preformatted Char"/>
+    <w:basedOn w:val="DefaultParagraphFont"/>
+    <w:link w:val="HTMLPreformatted"/>
+    <w:uiPriority w:val="99"/>
+    <w:semiHidden/>
+    <w:rsid w:val="00D16CB8"/>
+    <w:rPr>
+      <w:rFonts w:ascii="Courier New" w:eastAsia="Times New Roman" w:hAnsi="Courier New" w:cs="Courier New"/>
+      <w:kern w:val="0"/>
+      <w:sz w:val="20"/>
+      <w:szCs w:val="20"/>
+      <w14:ligatures w14:val="none"/>
+    </w:rPr>
+  </w:style>
+  <w:style w:type="character" w:styleId="HTMLCode">
+    <w:name w:val="HTML Code"/>
+    <w:basedOn w:val="DefaultParagraphFont"/>
+    <w:uiPriority w:val="99"/>
+    <w:semiHidden/>
+    <w:unhideWhenUsed/>
+    <w:rsid w:val="00D16CB8"/>
+    <w:rPr>
+      <w:rFonts w:ascii="Courier New" w:eastAsia="Times New Roman" w:hAnsi="Courier New" w:cs="Courier New"/>
+      <w:sz w:val="20"/>
+      <w:szCs w:val="20"/>
+    </w:rPr>
+  </w:style>
+  <w:style w:type="character" w:styleId="Strong">
+    <w:name w:val="Strong"/>
+    <w:basedOn w:val="DefaultParagraphFont"/>
+    <w:uiPriority w:val="22"/>
+    <w:qFormat/>
+    <w:rsid w:val="00733865"/>
+    <w:rPr>
+      <w:b/>
+      <w:bCs/>
+    </w:rPr>
+  </w:style>
+  <w:style w:type="paragraph" w:customStyle="1" w:styleId="pdq2pgselectionanchorcontainer">
+    <w:name w:val="pdq2pg_selectionanchorcontainer"/>
+    <w:basedOn w:val="Normal"/>
+    <w:rsid w:val="0025351B"/>
+    <w:pPr>
+      <w:spacing w:before="100" w:beforeAutospacing="1" w:after="100" w:afterAutospacing="1" w:line="240" w:lineRule="auto"/>
+    </w:pPr>
+    <w:rPr>
+      <w:rFonts w:ascii="Times New Roman" w:eastAsia="Times New Roman" w:hAnsi="Times New Roman" w:cs="Times New Roman"/>
+      <w:kern w:val="0"/>
+      <w14:ligatures w14:val="none"/>
+    </w:rPr>
+  </w:style>
 </w:styles>
 </file>
 

</xml_diff>

<commit_message>
add more sam notes
</commit_message>
<xml_diff>
--- a/AWS/SAM/Notes.docx
+++ b/AWS/SAM/Notes.docx
@@ -105,6 +105,7 @@
           <w:szCs w:val="22"/>
         </w:rPr>
       </w:pPr>
+      <w:proofErr w:type="gramStart"/>
       <w:r>
         <w:rPr>
           <w:b/>
@@ -113,7 +114,18 @@
           <w:sz w:val="22"/>
           <w:szCs w:val="22"/>
         </w:rPr>
-        <w:t>AWS::serverless::Function</w:t>
+        <w:t>AWS::serverless::</w:t>
+      </w:r>
+      <w:proofErr w:type="gramEnd"/>
+      <w:r>
+        <w:rPr>
+          <w:b/>
+          <w:bCs/>
+          <w:color w:val="000000" w:themeColor="text1"/>
+          <w:sz w:val="22"/>
+          <w:szCs w:val="22"/>
+        </w:rPr>
+        <w:t>Function</w:t>
       </w:r>
       <w:r>
         <w:rPr>
@@ -171,6 +183,7 @@
           <w:szCs w:val="22"/>
         </w:rPr>
       </w:pPr>
+      <w:proofErr w:type="gramStart"/>
       <w:r>
         <w:rPr>
           <w:b/>
@@ -179,7 +192,18 @@
           <w:sz w:val="22"/>
           <w:szCs w:val="22"/>
         </w:rPr>
-        <w:t>AWS::serverless::Api</w:t>
+        <w:t>AWS::serverless::</w:t>
+      </w:r>
+      <w:proofErr w:type="gramEnd"/>
+      <w:r>
+        <w:rPr>
+          <w:b/>
+          <w:bCs/>
+          <w:color w:val="000000" w:themeColor="text1"/>
+          <w:sz w:val="22"/>
+          <w:szCs w:val="22"/>
+        </w:rPr>
+        <w:t>Api</w:t>
       </w:r>
       <w:r>
         <w:rPr>
@@ -253,6 +277,7 @@
           <w:szCs w:val="22"/>
         </w:rPr>
       </w:pPr>
+      <w:proofErr w:type="gramStart"/>
       <w:r>
         <w:rPr>
           <w:b/>
@@ -264,6 +289,7 @@
         <w:t>AWS::serverless::</w:t>
       </w:r>
       <w:proofErr w:type="spellStart"/>
+      <w:proofErr w:type="gramEnd"/>
       <w:r>
         <w:rPr>
           <w:b/>
@@ -305,7 +331,25 @@
           <w:sz w:val="22"/>
           <w:szCs w:val="22"/>
         </w:rPr>
-        <w:t>This is also an API Gateway API, but it's an HTTP API rather than a REST API.</w:t>
+        <w:t xml:space="preserve">This is also an API Gateway API, but it's </w:t>
+      </w:r>
+      <w:proofErr w:type="gramStart"/>
+      <w:r>
+        <w:rPr>
+          <w:color w:val="000000" w:themeColor="text1"/>
+          <w:sz w:val="22"/>
+          <w:szCs w:val="22"/>
+        </w:rPr>
+        <w:t>an HTTP</w:t>
+      </w:r>
+      <w:proofErr w:type="gramEnd"/>
+      <w:r>
+        <w:rPr>
+          <w:color w:val="000000" w:themeColor="text1"/>
+          <w:sz w:val="22"/>
+          <w:szCs w:val="22"/>
+        </w:rPr>
+        <w:t xml:space="preserve"> API rather than a REST API.</w:t>
       </w:r>
     </w:p>
     <w:p>
@@ -321,6 +365,7 @@
           <w:szCs w:val="22"/>
         </w:rPr>
       </w:pPr>
+      <w:proofErr w:type="gramStart"/>
       <w:r>
         <w:rPr>
           <w:b/>
@@ -332,6 +377,7 @@
         <w:t>AWS::serverless::</w:t>
       </w:r>
       <w:proofErr w:type="spellStart"/>
+      <w:proofErr w:type="gramEnd"/>
       <w:r>
         <w:rPr>
           <w:b/>
@@ -383,7 +429,25 @@
           <w:sz w:val="22"/>
           <w:szCs w:val="22"/>
         </w:rPr>
-        <w:t xml:space="preserve"> is intentionally a simplified SAM resource. If you need more advanced DynamoDB configuration, you'd normally use AWS::DynamoDB::Table directly.</w:t>
+        <w:t xml:space="preserve"> is intentionally a simplified SAM resource. If you need more advanced DynamoDB configuration, you'd normally use </w:t>
+      </w:r>
+      <w:proofErr w:type="gramStart"/>
+      <w:r>
+        <w:rPr>
+          <w:color w:val="000000" w:themeColor="text1"/>
+          <w:sz w:val="22"/>
+          <w:szCs w:val="22"/>
+        </w:rPr>
+        <w:t>AWS::DynamoDB::</w:t>
+      </w:r>
+      <w:proofErr w:type="gramEnd"/>
+      <w:r>
+        <w:rPr>
+          <w:color w:val="000000" w:themeColor="text1"/>
+          <w:sz w:val="22"/>
+          <w:szCs w:val="22"/>
+        </w:rPr>
+        <w:t>Table directly.</w:t>
       </w:r>
     </w:p>
     <w:p>
@@ -399,6 +463,7 @@
           <w:szCs w:val="22"/>
         </w:rPr>
       </w:pPr>
+      <w:proofErr w:type="gramStart"/>
       <w:r>
         <w:rPr>
           <w:b/>
@@ -407,7 +472,18 @@
           <w:sz w:val="22"/>
           <w:szCs w:val="22"/>
         </w:rPr>
-        <w:t>AWS::serverless::Application</w:t>
+        <w:t>AWS::serverless::</w:t>
+      </w:r>
+      <w:proofErr w:type="gramEnd"/>
+      <w:r>
+        <w:rPr>
+          <w:b/>
+          <w:bCs/>
+          <w:color w:val="000000" w:themeColor="text1"/>
+          <w:sz w:val="22"/>
+          <w:szCs w:val="22"/>
+        </w:rPr>
+        <w:t>Application</w:t>
       </w:r>
       <w:r>
         <w:rPr>
@@ -455,6 +531,7 @@
           <w:szCs w:val="22"/>
         </w:rPr>
       </w:pPr>
+      <w:proofErr w:type="gramStart"/>
       <w:r>
         <w:rPr>
           <w:b/>
@@ -466,6 +543,7 @@
         <w:t>AWS::serverless::</w:t>
       </w:r>
       <w:proofErr w:type="spellStart"/>
+      <w:proofErr w:type="gramEnd"/>
       <w:r>
         <w:rPr>
           <w:b/>
@@ -523,8 +601,18 @@
           <w:sz w:val="22"/>
           <w:szCs w:val="22"/>
         </w:rPr>
-        <w:t>The important distinction is:</w:t>
-      </w:r>
+        <w:t xml:space="preserve">The important distinction </w:t>
+      </w:r>
+      <w:proofErr w:type="gramStart"/>
+      <w:r>
+        <w:rPr>
+          <w:color w:val="000000" w:themeColor="text1"/>
+          <w:sz w:val="22"/>
+          <w:szCs w:val="22"/>
+        </w:rPr>
+        <w:t>is:</w:t>
+      </w:r>
+      <w:proofErr w:type="gramEnd"/>
       <w:r>
         <w:rPr>
           <w:color w:val="000000" w:themeColor="text1"/>
@@ -555,6 +643,7 @@
           <w:szCs w:val="22"/>
         </w:rPr>
       </w:pPr>
+      <w:proofErr w:type="gramStart"/>
       <w:r>
         <w:rPr>
           <w:b/>
@@ -566,6 +655,7 @@
         <w:t>AWS::serverless::</w:t>
       </w:r>
       <w:proofErr w:type="spellStart"/>
+      <w:proofErr w:type="gramEnd"/>
       <w:r>
         <w:rPr>
           <w:b/>
@@ -710,31 +800,7 @@
         <w:t>We focus</w:t>
       </w:r>
       <w:r>
-        <w:t xml:space="preserve"> on these</w:t>
-      </w:r>
-      <w:r>
-        <w:t xml:space="preserve">: </w:t>
-      </w:r>
-      <w:r>
-        <w:t>Principal</w:t>
-      </w:r>
-      <w:r>
-        <w:t xml:space="preserve"> -&gt;</w:t>
-      </w:r>
-      <w:r>
-        <w:t>Policy</w:t>
-      </w:r>
-      <w:r>
-        <w:t xml:space="preserve"> -&gt;</w:t>
-      </w:r>
-      <w:r>
-        <w:t>Permission</w:t>
-      </w:r>
-      <w:r>
-        <w:t xml:space="preserve">-&gt; </w:t>
-      </w:r>
-      <w:r>
-        <w:t>Resource</w:t>
+        <w:t xml:space="preserve"> on these: Principal -&gt;Policy -&gt;Permission-&gt; Resource</w:t>
       </w:r>
     </w:p>
     <w:tbl>
@@ -1307,19 +1373,7 @@
         <w:ind w:left="1080"/>
       </w:pPr>
       <w:r>
-        <w:t>Policies:</w:t>
-      </w:r>
-      <w:r>
-        <w:t xml:space="preserve"> </w:t>
-      </w:r>
-      <w:r>
-        <w:t>think:</w:t>
-      </w:r>
-      <w:r>
-        <w:t xml:space="preserve"> </w:t>
-      </w:r>
-      <w:r>
-        <w:t>“What is this Lambda allowed to do?”</w:t>
+        <w:t>Policies: think: “What is this Lambda allowed to do?”</w:t>
       </w:r>
     </w:p>
     <w:p>
@@ -1329,25 +1383,7 @@
         <w:ind w:left="1080"/>
       </w:pPr>
       <w:r>
-        <w:t>When you see:</w:t>
-      </w:r>
-      <w:r>
-        <w:t xml:space="preserve"> </w:t>
-      </w:r>
-      <w:r>
-        <w:t>Action:</w:t>
-      </w:r>
-      <w:r>
-        <w:t xml:space="preserve"> </w:t>
-      </w:r>
-      <w:r>
-        <w:t>think:</w:t>
-      </w:r>
-      <w:r>
-        <w:t xml:space="preserve"> </w:t>
-      </w:r>
-      <w:r>
-        <w:t>“What operation?”</w:t>
+        <w:t>When you see: Action: think: “What operation?”</w:t>
       </w:r>
     </w:p>
     <w:p>
@@ -1357,25 +1393,7 @@
         <w:ind w:left="1080"/>
       </w:pPr>
       <w:r>
-        <w:t>When you see:</w:t>
-      </w:r>
-      <w:r>
-        <w:t xml:space="preserve"> </w:t>
-      </w:r>
-      <w:r>
-        <w:t>Resource:</w:t>
-      </w:r>
-      <w:r>
-        <w:t xml:space="preserve"> </w:t>
-      </w:r>
-      <w:r>
-        <w:t>think:</w:t>
-      </w:r>
-      <w:r>
-        <w:t xml:space="preserve"> </w:t>
-      </w:r>
-      <w:r>
-        <w:t>“On which AWS resource?”</w:t>
+        <w:t>When you see: Resource: think: “On which AWS resource?”</w:t>
       </w:r>
     </w:p>
     <w:p>
@@ -1440,8 +1458,13 @@
         </w:numPr>
         <w:spacing w:before="100" w:beforeAutospacing="1" w:after="100" w:afterAutospacing="1" w:line="240" w:lineRule="auto"/>
       </w:pPr>
-      <w:r>
-        <w:t>it lets you define common settings once and automatically apply them to many resources.</w:t>
+      <w:proofErr w:type="gramStart"/>
+      <w:r>
+        <w:t>it</w:t>
+      </w:r>
+      <w:proofErr w:type="gramEnd"/>
+      <w:r>
+        <w:t xml:space="preserve"> lets you define common settings once and automatically apply them to many resources.</w:t>
       </w:r>
     </w:p>
     <w:p>
@@ -1622,7 +1645,15 @@
         <w:spacing w:before="100" w:beforeAutospacing="1" w:after="100" w:afterAutospacing="1" w:line="240" w:lineRule="auto"/>
       </w:pPr>
       <w:r>
-        <w:t>Now those settings become defaults for all SAM Functions.</w:t>
+        <w:t xml:space="preserve">Now those settings </w:t>
+      </w:r>
+      <w:proofErr w:type="gramStart"/>
+      <w:r>
+        <w:t>become</w:t>
+      </w:r>
+      <w:proofErr w:type="gramEnd"/>
+      <w:r>
+        <w:t xml:space="preserve"> defaults for all SAM Functions.</w:t>
       </w:r>
     </w:p>
     <w:p>
@@ -1770,9 +1801,28 @@
           <w:kern w:val="2"/>
           <w14:ligatures w14:val="standardContextual"/>
         </w:rPr>
-        <w:t xml:space="preserve">Suppose we have 3 stages for our app, dev stage dep. Create a </w:t>
+        <w:t xml:space="preserve">Suppose we have 3 stages for our </w:t>
+      </w:r>
+      <w:proofErr w:type="gramStart"/>
+      <w:r>
+        <w:rPr>
+          <w:rFonts w:asciiTheme="minorHAnsi" w:eastAsiaTheme="minorHAnsi" w:hAnsiTheme="minorHAnsi" w:cstheme="minorBidi"/>
+          <w:kern w:val="2"/>
+          <w14:ligatures w14:val="standardContextual"/>
+        </w:rPr>
+        <w:t>app,</w:t>
+      </w:r>
+      <w:proofErr w:type="gramEnd"/>
+      <w:r>
+        <w:rPr>
+          <w:rFonts w:asciiTheme="minorHAnsi" w:eastAsiaTheme="minorHAnsi" w:hAnsiTheme="minorHAnsi" w:cstheme="minorBidi"/>
+          <w:kern w:val="2"/>
+          <w14:ligatures w14:val="standardContextual"/>
+        </w:rPr>
+        <w:t xml:space="preserve"> dev stage dep. Create a </w:t>
       </w:r>
       <w:proofErr w:type="spellStart"/>
+      <w:proofErr w:type="gramStart"/>
       <w:r>
         <w:rPr>
           <w:rFonts w:asciiTheme="minorHAnsi" w:eastAsiaTheme="minorHAnsi" w:hAnsiTheme="minorHAnsi" w:cstheme="minorBidi"/>
@@ -1782,6 +1832,7 @@
         <w:t>template.yaml</w:t>
       </w:r>
       <w:proofErr w:type="spellEnd"/>
+      <w:proofErr w:type="gramEnd"/>
       <w:r>
         <w:rPr>
           <w:rFonts w:asciiTheme="minorHAnsi" w:eastAsiaTheme="minorHAnsi" w:hAnsiTheme="minorHAnsi" w:cstheme="minorBidi"/>
@@ -1886,7 +1937,25 @@
           <w:kern w:val="2"/>
           <w14:ligatures w14:val="standardContextual"/>
         </w:rPr>
-        <w:t xml:space="preserve">Parameters tells the SAM we are about to write a parameter, Environment is its name, type and default are self-explanatory </w:t>
+        <w:t xml:space="preserve">Parameters </w:t>
+      </w:r>
+      <w:proofErr w:type="gramStart"/>
+      <w:r>
+        <w:rPr>
+          <w:rFonts w:asciiTheme="minorHAnsi" w:eastAsiaTheme="minorHAnsi" w:hAnsiTheme="minorHAnsi" w:cstheme="minorBidi"/>
+          <w:kern w:val="2"/>
+          <w14:ligatures w14:val="standardContextual"/>
+        </w:rPr>
+        <w:t>tells</w:t>
+      </w:r>
+      <w:proofErr w:type="gramEnd"/>
+      <w:r>
+        <w:rPr>
+          <w:rFonts w:asciiTheme="minorHAnsi" w:eastAsiaTheme="minorHAnsi" w:hAnsiTheme="minorHAnsi" w:cstheme="minorBidi"/>
+          <w:kern w:val="2"/>
+          <w14:ligatures w14:val="standardContextual"/>
+        </w:rPr>
+        <w:t xml:space="preserve"> the SAM we are about to write a parameter, Environment is its name, type and default are self-explanatory </w:t>
       </w:r>
     </w:p>
     <w:p>
@@ -1924,13 +1993,23 @@
           <w14:ligatures w14:val="standardContextual"/>
         </w:rPr>
       </w:pPr>
-      <w:r>
-        <w:rPr>
-          <w:rFonts w:asciiTheme="minorHAnsi" w:eastAsiaTheme="minorHAnsi" w:hAnsiTheme="minorHAnsi" w:cstheme="minorBidi"/>
-          <w:kern w:val="2"/>
-          <w14:ligatures w14:val="standardContextual"/>
-        </w:rPr>
-        <w:t>!Ref — using a parameter</w:t>
+      <w:proofErr w:type="gramStart"/>
+      <w:r>
+        <w:rPr>
+          <w:rFonts w:asciiTheme="minorHAnsi" w:eastAsiaTheme="minorHAnsi" w:hAnsiTheme="minorHAnsi" w:cstheme="minorBidi"/>
+          <w:kern w:val="2"/>
+          <w14:ligatures w14:val="standardContextual"/>
+        </w:rPr>
+        <w:t>!Ref</w:t>
+      </w:r>
+      <w:proofErr w:type="gramEnd"/>
+      <w:r>
+        <w:rPr>
+          <w:rFonts w:asciiTheme="minorHAnsi" w:eastAsiaTheme="minorHAnsi" w:hAnsiTheme="minorHAnsi" w:cstheme="minorBidi"/>
+          <w:kern w:val="2"/>
+          <w14:ligatures w14:val="standardContextual"/>
+        </w:rPr>
+        <w:t xml:space="preserve"> — using a parameter</w:t>
       </w:r>
     </w:p>
     <w:p>
@@ -2031,7 +2110,25 @@
           <w:kern w:val="2"/>
           <w14:ligatures w14:val="standardContextual"/>
         </w:rPr>
-        <w:t xml:space="preserve">        APP_ENV: !Ref Environment</w:t>
+        <w:t xml:space="preserve">        APP_ENV</w:t>
+      </w:r>
+      <w:proofErr w:type="gramStart"/>
+      <w:r>
+        <w:rPr>
+          <w:rFonts w:asciiTheme="minorHAnsi" w:eastAsiaTheme="minorHAnsi" w:hAnsiTheme="minorHAnsi" w:cstheme="minorBidi"/>
+          <w:kern w:val="2"/>
+          <w14:ligatures w14:val="standardContextual"/>
+        </w:rPr>
+        <w:t>: !Ref</w:t>
+      </w:r>
+      <w:proofErr w:type="gramEnd"/>
+      <w:r>
+        <w:rPr>
+          <w:rFonts w:asciiTheme="minorHAnsi" w:eastAsiaTheme="minorHAnsi" w:hAnsiTheme="minorHAnsi" w:cstheme="minorBidi"/>
+          <w:kern w:val="2"/>
+          <w14:ligatures w14:val="standardContextual"/>
+        </w:rPr>
+        <w:t xml:space="preserve"> Environment</w:t>
       </w:r>
     </w:p>
     <w:p>
@@ -2070,7 +2167,79 @@
           <w:kern w:val="2"/>
           <w14:ligatures w14:val="standardContextual"/>
         </w:rPr>
-        <w:t>We can also specify the allowed values for a certain parameter</w:t>
+        <w:t xml:space="preserve">We can also specify the </w:t>
+      </w:r>
+      <w:proofErr w:type="gramStart"/>
+      <w:r>
+        <w:rPr>
+          <w:rFonts w:asciiTheme="minorHAnsi" w:eastAsiaTheme="minorHAnsi" w:hAnsiTheme="minorHAnsi" w:cstheme="minorBidi"/>
+          <w:kern w:val="2"/>
+          <w14:ligatures w14:val="standardContextual"/>
+        </w:rPr>
+        <w:t>allowed values</w:t>
+      </w:r>
+      <w:proofErr w:type="gramEnd"/>
+      <w:r>
+        <w:rPr>
+          <w:rFonts w:asciiTheme="minorHAnsi" w:eastAsiaTheme="minorHAnsi" w:hAnsiTheme="minorHAnsi" w:cstheme="minorBidi"/>
+          <w:kern w:val="2"/>
+          <w14:ligatures w14:val="standardContextual"/>
+        </w:rPr>
+        <w:t xml:space="preserve"> for a certain parameter</w:t>
+      </w:r>
+    </w:p>
+    <w:p>
+      <w:pPr>
+        <w:pStyle w:val="NormalWeb"/>
+        <w:ind w:left="360"/>
+        <w:rPr>
+          <w:rFonts w:asciiTheme="minorHAnsi" w:eastAsiaTheme="minorHAnsi" w:hAnsiTheme="minorHAnsi" w:cstheme="minorBidi"/>
+          <w:b/>
+          <w:bCs/>
+          <w:color w:val="000000" w:themeColor="text1"/>
+          <w:kern w:val="2"/>
+          <w:u w:val="single"/>
+          <w14:ligatures w14:val="standardContextual"/>
+        </w:rPr>
+      </w:pPr>
+    </w:p>
+    <w:p>
+      <w:pPr>
+        <w:pStyle w:val="NormalWeb"/>
+        <w:ind w:left="360"/>
+        <w:rPr>
+          <w:rFonts w:asciiTheme="minorHAnsi" w:eastAsiaTheme="minorHAnsi" w:hAnsiTheme="minorHAnsi" w:cstheme="minorBidi"/>
+          <w:b/>
+          <w:bCs/>
+          <w:color w:val="000000" w:themeColor="text1"/>
+          <w:kern w:val="2"/>
+          <w:u w:val="single"/>
+          <w14:ligatures w14:val="standardContextual"/>
+        </w:rPr>
+      </w:pPr>
+      <w:r>
+        <w:rPr>
+          <w:rFonts w:asciiTheme="minorHAnsi" w:eastAsiaTheme="minorHAnsi" w:hAnsiTheme="minorHAnsi" w:cstheme="minorBidi"/>
+          <w:b/>
+          <w:bCs/>
+          <w:color w:val="000000" w:themeColor="text1"/>
+          <w:kern w:val="2"/>
+          <w:u w:val="single"/>
+          <w14:ligatures w14:val="standardContextual"/>
+        </w:rPr>
+        <w:t>using different values for the same template based on which stage we are at</w:t>
+      </w:r>
+      <w:r>
+        <w:rPr>
+          <w:rFonts w:asciiTheme="minorHAnsi" w:eastAsiaTheme="minorHAnsi" w:hAnsiTheme="minorHAnsi" w:cstheme="minorBidi"/>
+          <w:b/>
+          <w:bCs/>
+          <w:color w:val="000000" w:themeColor="text1"/>
+          <w:kern w:val="2"/>
+          <w:u w:val="single"/>
+          <w14:ligatures w14:val="standardContextual"/>
+        </w:rPr>
+        <w:t>:</w:t>
       </w:r>
     </w:p>
     <w:p>
@@ -2078,11 +2247,365 @@
         <w:pStyle w:val="NormalWeb"/>
         <w:numPr>
           <w:ilvl w:val="0"/>
-          <w:numId w:val="10"/>
+          <w:numId w:val="11"/>
         </w:numPr>
         <w:rPr>
           <w:rFonts w:asciiTheme="minorHAnsi" w:eastAsiaTheme="minorHAnsi" w:hAnsiTheme="minorHAnsi" w:cstheme="minorBidi"/>
-          <w:kern w:val="2"/>
+          <w:color w:val="000000" w:themeColor="text1"/>
+          <w:kern w:val="2"/>
+          <w:sz w:val="22"/>
+          <w:szCs w:val="22"/>
+          <w14:ligatures w14:val="standardContextual"/>
+        </w:rPr>
+      </w:pPr>
+      <w:r>
+        <w:rPr>
+          <w:rFonts w:asciiTheme="minorHAnsi" w:eastAsiaTheme="minorHAnsi" w:hAnsiTheme="minorHAnsi" w:cstheme="minorBidi"/>
+          <w:color w:val="000000" w:themeColor="text1"/>
+          <w:kern w:val="2"/>
+          <w:sz w:val="22"/>
+          <w:szCs w:val="22"/>
+          <w14:ligatures w14:val="standardContextual"/>
+        </w:rPr>
+        <w:t>Use the same SAM template, but give resources different configuration values depending on the deployment stage, such as dev, staging, or prod.</w:t>
+      </w:r>
+    </w:p>
+    <w:p>
+      <w:pPr>
+        <w:pStyle w:val="NormalWeb"/>
+        <w:numPr>
+          <w:ilvl w:val="0"/>
+          <w:numId w:val="11"/>
+        </w:numPr>
+        <w:rPr>
+          <w:rFonts w:asciiTheme="minorHAnsi" w:eastAsiaTheme="minorHAnsi" w:hAnsiTheme="minorHAnsi" w:cstheme="minorBidi"/>
+          <w:color w:val="000000" w:themeColor="text1"/>
+          <w:kern w:val="2"/>
+          <w:sz w:val="22"/>
+          <w:szCs w:val="22"/>
+          <w14:ligatures w14:val="standardContextual"/>
+        </w:rPr>
+      </w:pPr>
+      <w:proofErr w:type="gramStart"/>
+      <w:r>
+        <w:rPr>
+          <w:rFonts w:asciiTheme="minorHAnsi" w:eastAsiaTheme="minorHAnsi" w:hAnsiTheme="minorHAnsi" w:cstheme="minorBidi"/>
+          <w:color w:val="000000" w:themeColor="text1"/>
+          <w:kern w:val="2"/>
+          <w:sz w:val="22"/>
+          <w:szCs w:val="22"/>
+          <w14:ligatures w14:val="standardContextual"/>
+        </w:rPr>
+        <w:t>So</w:t>
+      </w:r>
+      <w:proofErr w:type="gramEnd"/>
+      <w:r>
+        <w:rPr>
+          <w:rFonts w:asciiTheme="minorHAnsi" w:eastAsiaTheme="minorHAnsi" w:hAnsiTheme="minorHAnsi" w:cstheme="minorBidi"/>
+          <w:color w:val="000000" w:themeColor="text1"/>
+          <w:kern w:val="2"/>
+          <w:sz w:val="22"/>
+          <w:szCs w:val="22"/>
+          <w14:ligatures w14:val="standardContextual"/>
+        </w:rPr>
+        <w:t xml:space="preserve"> for </w:t>
+      </w:r>
+      <w:proofErr w:type="gramStart"/>
+      <w:r>
+        <w:rPr>
+          <w:rFonts w:asciiTheme="minorHAnsi" w:eastAsiaTheme="minorHAnsi" w:hAnsiTheme="minorHAnsi" w:cstheme="minorBidi"/>
+          <w:color w:val="000000" w:themeColor="text1"/>
+          <w:kern w:val="2"/>
+          <w:sz w:val="22"/>
+          <w:szCs w:val="22"/>
+          <w14:ligatures w14:val="standardContextual"/>
+        </w:rPr>
+        <w:t>example</w:t>
+      </w:r>
+      <w:proofErr w:type="gramEnd"/>
+      <w:r>
+        <w:rPr>
+          <w:rFonts w:asciiTheme="minorHAnsi" w:eastAsiaTheme="minorHAnsi" w:hAnsiTheme="minorHAnsi" w:cstheme="minorBidi"/>
+          <w:color w:val="000000" w:themeColor="text1"/>
+          <w:kern w:val="2"/>
+          <w:sz w:val="22"/>
+          <w:szCs w:val="22"/>
+          <w14:ligatures w14:val="standardContextual"/>
+        </w:rPr>
+        <w:t xml:space="preserve"> we have a database for each </w:t>
+      </w:r>
+      <w:proofErr w:type="gramStart"/>
+      <w:r>
+        <w:rPr>
+          <w:rFonts w:asciiTheme="minorHAnsi" w:eastAsiaTheme="minorHAnsi" w:hAnsiTheme="minorHAnsi" w:cstheme="minorBidi"/>
+          <w:color w:val="000000" w:themeColor="text1"/>
+          <w:kern w:val="2"/>
+          <w:sz w:val="22"/>
+          <w:szCs w:val="22"/>
+          <w14:ligatures w14:val="standardContextual"/>
+        </w:rPr>
+        <w:t>phase</w:t>
+      </w:r>
+      <w:proofErr w:type="gramEnd"/>
+      <w:r>
+        <w:rPr>
+          <w:rFonts w:asciiTheme="minorHAnsi" w:eastAsiaTheme="minorHAnsi" w:hAnsiTheme="minorHAnsi" w:cstheme="minorBidi"/>
+          <w:color w:val="000000" w:themeColor="text1"/>
+          <w:kern w:val="2"/>
+          <w:sz w:val="22"/>
+          <w:szCs w:val="22"/>
+          <w14:ligatures w14:val="standardContextual"/>
+        </w:rPr>
+        <w:t xml:space="preserve"> but we don’t want to write it manually for each stage so we define a parameter in one template and provide the values in the AWS CLI </w:t>
+      </w:r>
+    </w:p>
+    <w:p>
+      <w:pPr>
+        <w:pStyle w:val="NormalWeb"/>
+        <w:numPr>
+          <w:ilvl w:val="0"/>
+          <w:numId w:val="11"/>
+        </w:numPr>
+        <w:rPr>
+          <w:rFonts w:asciiTheme="minorHAnsi" w:eastAsiaTheme="minorHAnsi" w:hAnsiTheme="minorHAnsi" w:cstheme="minorBidi"/>
+          <w:color w:val="000000" w:themeColor="text1"/>
+          <w:kern w:val="2"/>
+          <w:sz w:val="22"/>
+          <w:szCs w:val="22"/>
+          <w14:ligatures w14:val="standardContextual"/>
+        </w:rPr>
+      </w:pPr>
+      <w:r>
+        <w:rPr>
+          <w:rFonts w:asciiTheme="minorHAnsi" w:eastAsiaTheme="minorHAnsi" w:hAnsiTheme="minorHAnsi" w:cstheme="minorBidi"/>
+          <w:color w:val="000000" w:themeColor="text1"/>
+          <w:kern w:val="2"/>
+          <w:sz w:val="22"/>
+          <w:szCs w:val="22"/>
+          <w14:ligatures w14:val="standardContextual"/>
+        </w:rPr>
+        <w:t xml:space="preserve">Example of parameter usage; </w:t>
+      </w:r>
+      <w:r>
+        <w:rPr>
+          <w:rFonts w:asciiTheme="minorHAnsi" w:eastAsiaTheme="minorHAnsi" w:hAnsiTheme="minorHAnsi" w:cstheme="minorBidi"/>
+          <w:color w:val="000000" w:themeColor="text1"/>
+          <w:kern w:val="2"/>
+          <w:sz w:val="22"/>
+          <w:szCs w:val="22"/>
+          <w14:ligatures w14:val="standardContextual"/>
+        </w:rPr>
+        <w:t>Parameters:</w:t>
+      </w:r>
+    </w:p>
+    <w:p>
+      <w:pPr>
+        <w:pStyle w:val="NormalWeb"/>
+        <w:ind w:left="1440"/>
+        <w:rPr>
+          <w:rFonts w:asciiTheme="minorHAnsi" w:eastAsiaTheme="minorHAnsi" w:hAnsiTheme="minorHAnsi" w:cstheme="minorBidi"/>
+          <w:color w:val="000000" w:themeColor="text1"/>
+          <w:kern w:val="2"/>
+          <w:sz w:val="22"/>
+          <w:szCs w:val="22"/>
+          <w14:ligatures w14:val="standardContextual"/>
+        </w:rPr>
+      </w:pPr>
+      <w:r>
+        <w:rPr>
+          <w:rFonts w:asciiTheme="minorHAnsi" w:eastAsiaTheme="minorHAnsi" w:hAnsiTheme="minorHAnsi" w:cstheme="minorBidi"/>
+          <w:color w:val="000000" w:themeColor="text1"/>
+          <w:kern w:val="2"/>
+          <w:sz w:val="22"/>
+          <w:szCs w:val="22"/>
+          <w14:ligatures w14:val="standardContextual"/>
+        </w:rPr>
+        <w:t xml:space="preserve">  Stage:</w:t>
+      </w:r>
+    </w:p>
+    <w:p>
+      <w:pPr>
+        <w:pStyle w:val="NormalWeb"/>
+        <w:ind w:left="1440"/>
+        <w:rPr>
+          <w:rFonts w:asciiTheme="minorHAnsi" w:eastAsiaTheme="minorHAnsi" w:hAnsiTheme="minorHAnsi" w:cstheme="minorBidi"/>
+          <w:color w:val="000000" w:themeColor="text1"/>
+          <w:kern w:val="2"/>
+          <w:sz w:val="22"/>
+          <w:szCs w:val="22"/>
+          <w14:ligatures w14:val="standardContextual"/>
+        </w:rPr>
+      </w:pPr>
+      <w:r>
+        <w:rPr>
+          <w:rFonts w:asciiTheme="minorHAnsi" w:eastAsiaTheme="minorHAnsi" w:hAnsiTheme="minorHAnsi" w:cstheme="minorBidi"/>
+          <w:color w:val="000000" w:themeColor="text1"/>
+          <w:kern w:val="2"/>
+          <w:sz w:val="22"/>
+          <w:szCs w:val="22"/>
+          <w14:ligatures w14:val="standardContextual"/>
+        </w:rPr>
+        <w:t xml:space="preserve">    Type: String</w:t>
+      </w:r>
+    </w:p>
+    <w:p>
+      <w:pPr>
+        <w:pStyle w:val="NormalWeb"/>
+        <w:ind w:left="1440"/>
+        <w:rPr>
+          <w:rFonts w:asciiTheme="minorHAnsi" w:eastAsiaTheme="minorHAnsi" w:hAnsiTheme="minorHAnsi" w:cstheme="minorBidi"/>
+          <w:color w:val="000000" w:themeColor="text1"/>
+          <w:kern w:val="2"/>
+          <w:sz w:val="22"/>
+          <w:szCs w:val="22"/>
+          <w14:ligatures w14:val="standardContextual"/>
+        </w:rPr>
+      </w:pPr>
+      <w:r>
+        <w:rPr>
+          <w:rFonts w:asciiTheme="minorHAnsi" w:eastAsiaTheme="minorHAnsi" w:hAnsiTheme="minorHAnsi" w:cstheme="minorBidi"/>
+          <w:color w:val="000000" w:themeColor="text1"/>
+          <w:kern w:val="2"/>
+          <w:sz w:val="22"/>
+          <w:szCs w:val="22"/>
+          <w14:ligatures w14:val="standardContextual"/>
+        </w:rPr>
+        <w:t xml:space="preserve">    Default: dev</w:t>
+      </w:r>
+    </w:p>
+    <w:p>
+      <w:pPr>
+        <w:pStyle w:val="NormalWeb"/>
+        <w:ind w:left="1440"/>
+        <w:rPr>
+          <w:rFonts w:asciiTheme="minorHAnsi" w:eastAsiaTheme="minorHAnsi" w:hAnsiTheme="minorHAnsi" w:cstheme="minorBidi"/>
+          <w:color w:val="000000" w:themeColor="text1"/>
+          <w:kern w:val="2"/>
+          <w:sz w:val="22"/>
+          <w:szCs w:val="22"/>
+          <w14:ligatures w14:val="standardContextual"/>
+        </w:rPr>
+      </w:pPr>
+      <w:r>
+        <w:rPr>
+          <w:rFonts w:asciiTheme="minorHAnsi" w:eastAsiaTheme="minorHAnsi" w:hAnsiTheme="minorHAnsi" w:cstheme="minorBidi"/>
+          <w:color w:val="000000" w:themeColor="text1"/>
+          <w:kern w:val="2"/>
+          <w:sz w:val="22"/>
+          <w:szCs w:val="22"/>
+          <w14:ligatures w14:val="standardContextual"/>
+        </w:rPr>
+        <w:t xml:space="preserve">    </w:t>
+      </w:r>
+      <w:proofErr w:type="spellStart"/>
+      <w:r>
+        <w:rPr>
+          <w:rFonts w:asciiTheme="minorHAnsi" w:eastAsiaTheme="minorHAnsi" w:hAnsiTheme="minorHAnsi" w:cstheme="minorBidi"/>
+          <w:color w:val="000000" w:themeColor="text1"/>
+          <w:kern w:val="2"/>
+          <w:sz w:val="22"/>
+          <w:szCs w:val="22"/>
+          <w14:ligatures w14:val="standardContextual"/>
+        </w:rPr>
+        <w:t>AllowedValues</w:t>
+      </w:r>
+      <w:proofErr w:type="spellEnd"/>
+      <w:r>
+        <w:rPr>
+          <w:rFonts w:asciiTheme="minorHAnsi" w:eastAsiaTheme="minorHAnsi" w:hAnsiTheme="minorHAnsi" w:cstheme="minorBidi"/>
+          <w:color w:val="000000" w:themeColor="text1"/>
+          <w:kern w:val="2"/>
+          <w:sz w:val="22"/>
+          <w:szCs w:val="22"/>
+          <w14:ligatures w14:val="standardContextual"/>
+        </w:rPr>
+        <w:t>:</w:t>
+      </w:r>
+    </w:p>
+    <w:p>
+      <w:pPr>
+        <w:pStyle w:val="NormalWeb"/>
+        <w:ind w:left="1440"/>
+        <w:rPr>
+          <w:rFonts w:asciiTheme="minorHAnsi" w:eastAsiaTheme="minorHAnsi" w:hAnsiTheme="minorHAnsi" w:cstheme="minorBidi"/>
+          <w:color w:val="000000" w:themeColor="text1"/>
+          <w:kern w:val="2"/>
+          <w:sz w:val="22"/>
+          <w:szCs w:val="22"/>
+          <w14:ligatures w14:val="standardContextual"/>
+        </w:rPr>
+      </w:pPr>
+      <w:r>
+        <w:rPr>
+          <w:rFonts w:asciiTheme="minorHAnsi" w:eastAsiaTheme="minorHAnsi" w:hAnsiTheme="minorHAnsi" w:cstheme="minorBidi"/>
+          <w:color w:val="000000" w:themeColor="text1"/>
+          <w:kern w:val="2"/>
+          <w:sz w:val="22"/>
+          <w:szCs w:val="22"/>
+          <w14:ligatures w14:val="standardContextual"/>
+        </w:rPr>
+        <w:t xml:space="preserve">      - dev</w:t>
+      </w:r>
+    </w:p>
+    <w:p>
+      <w:pPr>
+        <w:pStyle w:val="NormalWeb"/>
+        <w:ind w:left="1440"/>
+        <w:rPr>
+          <w:rFonts w:asciiTheme="minorHAnsi" w:eastAsiaTheme="minorHAnsi" w:hAnsiTheme="minorHAnsi" w:cstheme="minorBidi"/>
+          <w:color w:val="000000" w:themeColor="text1"/>
+          <w:kern w:val="2"/>
+          <w:sz w:val="22"/>
+          <w:szCs w:val="22"/>
+          <w14:ligatures w14:val="standardContextual"/>
+        </w:rPr>
+      </w:pPr>
+      <w:r>
+        <w:rPr>
+          <w:rFonts w:asciiTheme="minorHAnsi" w:eastAsiaTheme="minorHAnsi" w:hAnsiTheme="minorHAnsi" w:cstheme="minorBidi"/>
+          <w:color w:val="000000" w:themeColor="text1"/>
+          <w:kern w:val="2"/>
+          <w:sz w:val="22"/>
+          <w:szCs w:val="22"/>
+          <w14:ligatures w14:val="standardContextual"/>
+        </w:rPr>
+        <w:t xml:space="preserve">      - staging</w:t>
+      </w:r>
+    </w:p>
+    <w:p>
+      <w:pPr>
+        <w:pStyle w:val="NormalWeb"/>
+        <w:ind w:left="1440"/>
+        <w:rPr>
+          <w:rFonts w:asciiTheme="minorHAnsi" w:eastAsiaTheme="minorHAnsi" w:hAnsiTheme="minorHAnsi" w:cstheme="minorBidi"/>
+          <w:color w:val="000000" w:themeColor="text1"/>
+          <w:kern w:val="2"/>
+          <w:sz w:val="22"/>
+          <w:szCs w:val="22"/>
+          <w14:ligatures w14:val="standardContextual"/>
+        </w:rPr>
+      </w:pPr>
+      <w:r>
+        <w:rPr>
+          <w:rFonts w:asciiTheme="minorHAnsi" w:eastAsiaTheme="minorHAnsi" w:hAnsiTheme="minorHAnsi" w:cstheme="minorBidi"/>
+          <w:color w:val="000000" w:themeColor="text1"/>
+          <w:kern w:val="2"/>
+          <w:sz w:val="22"/>
+          <w:szCs w:val="22"/>
+          <w14:ligatures w14:val="standardContextual"/>
+        </w:rPr>
+        <w:t xml:space="preserve">      - prod</w:t>
+      </w:r>
+    </w:p>
+    <w:p>
+      <w:pPr>
+        <w:pStyle w:val="NormalWeb"/>
+        <w:rPr>
+          <w:rFonts w:asciiTheme="minorHAnsi" w:eastAsiaTheme="minorHAnsi" w:hAnsiTheme="minorHAnsi" w:cstheme="minorBidi"/>
+          <w:color w:val="000000" w:themeColor="text1"/>
+          <w:kern w:val="2"/>
+          <w:sz w:val="22"/>
+          <w:szCs w:val="22"/>
           <w14:ligatures w14:val="standardContextual"/>
         </w:rPr>
       </w:pPr>
@@ -2111,7 +2634,7 @@
           <w:u w:val="single"/>
           <w14:ligatures w14:val="standardContextual"/>
         </w:rPr>
-        <w:t>using different values for the same template based on which stage we are at</w:t>
+        <w:t>parameters inline</w:t>
       </w:r>
       <w:r>
         <w:rPr>
@@ -2129,6 +2652,259 @@
     <w:p>
       <w:pPr>
         <w:pStyle w:val="NormalWeb"/>
+        <w:numPr>
+          <w:ilvl w:val="0"/>
+          <w:numId w:val="13"/>
+        </w:numPr>
+        <w:rPr>
+          <w:rFonts w:asciiTheme="minorHAnsi" w:eastAsiaTheme="minorHAnsi" w:hAnsiTheme="minorHAnsi" w:cstheme="minorBidi"/>
+          <w:color w:val="000000" w:themeColor="text1"/>
+          <w:kern w:val="2"/>
+          <w:sz w:val="22"/>
+          <w:szCs w:val="22"/>
+          <w14:ligatures w14:val="standardContextual"/>
+        </w:rPr>
+      </w:pPr>
+      <w:r>
+        <w:rPr>
+          <w:rFonts w:asciiTheme="minorHAnsi" w:eastAsiaTheme="minorHAnsi" w:hAnsiTheme="minorHAnsi" w:cstheme="minorBidi"/>
+          <w:color w:val="000000" w:themeColor="text1"/>
+          <w:kern w:val="2"/>
+          <w:sz w:val="22"/>
+          <w:szCs w:val="22"/>
+          <w14:ligatures w14:val="standardContextual"/>
+        </w:rPr>
+        <w:t>“</w:t>
+      </w:r>
+      <w:proofErr w:type="gramStart"/>
+      <w:r>
+        <w:rPr>
+          <w:rFonts w:asciiTheme="minorHAnsi" w:eastAsiaTheme="minorHAnsi" w:hAnsiTheme="minorHAnsi" w:cstheme="minorBidi"/>
+          <w:color w:val="000000" w:themeColor="text1"/>
+          <w:kern w:val="2"/>
+          <w:sz w:val="22"/>
+          <w:szCs w:val="22"/>
+          <w14:ligatures w14:val="standardContextual"/>
+        </w:rPr>
+        <w:t>parameters</w:t>
+      </w:r>
+      <w:proofErr w:type="gramEnd"/>
+      <w:r>
+        <w:rPr>
+          <w:rFonts w:asciiTheme="minorHAnsi" w:eastAsiaTheme="minorHAnsi" w:hAnsiTheme="minorHAnsi" w:cstheme="minorBidi"/>
+          <w:color w:val="000000" w:themeColor="text1"/>
+          <w:kern w:val="2"/>
+          <w:sz w:val="22"/>
+          <w:szCs w:val="22"/>
+          <w14:ligatures w14:val="standardContextual"/>
+        </w:rPr>
+        <w:t xml:space="preserve"> inline” usually means providing parameter values directly when you deploy, rather than putting the values inside the template itself.</w:t>
+      </w:r>
+    </w:p>
+    <w:p>
+      <w:pPr>
+        <w:pStyle w:val="NormalWeb"/>
+        <w:numPr>
+          <w:ilvl w:val="0"/>
+          <w:numId w:val="13"/>
+        </w:numPr>
+        <w:rPr>
+          <w:rFonts w:asciiTheme="minorHAnsi" w:eastAsiaTheme="minorHAnsi" w:hAnsiTheme="minorHAnsi" w:cstheme="minorBidi"/>
+          <w:color w:val="000000" w:themeColor="text1"/>
+          <w:kern w:val="2"/>
+          <w:sz w:val="22"/>
+          <w:szCs w:val="22"/>
+          <w14:ligatures w14:val="standardContextual"/>
+        </w:rPr>
+      </w:pPr>
+      <w:r>
+        <w:rPr>
+          <w:rFonts w:asciiTheme="minorHAnsi" w:eastAsiaTheme="minorHAnsi" w:hAnsiTheme="minorHAnsi" w:cstheme="minorBidi"/>
+          <w:color w:val="000000" w:themeColor="text1"/>
+          <w:kern w:val="2"/>
+          <w:sz w:val="22"/>
+          <w:szCs w:val="22"/>
+          <w14:ligatures w14:val="standardContextual"/>
+        </w:rPr>
+        <w:t>CLI → tells AWS which environment</w:t>
+      </w:r>
+      <w:r>
+        <w:rPr>
+          <w:rFonts w:asciiTheme="minorHAnsi" w:eastAsiaTheme="minorHAnsi" w:hAnsiTheme="minorHAnsi" w:cstheme="minorBidi"/>
+          <w:color w:val="000000" w:themeColor="text1"/>
+          <w:kern w:val="2"/>
+          <w:sz w:val="22"/>
+          <w:szCs w:val="22"/>
+          <w14:ligatures w14:val="standardContextual"/>
+        </w:rPr>
+        <w:br/>
+        <w:t>AWS Parameter Store/Secrets Manager → contains the actual sensitive values</w:t>
+      </w:r>
+      <w:r>
+        <w:rPr>
+          <w:rFonts w:asciiTheme="minorHAnsi" w:eastAsiaTheme="minorHAnsi" w:hAnsiTheme="minorHAnsi" w:cstheme="minorBidi"/>
+          <w:color w:val="000000" w:themeColor="text1"/>
+          <w:kern w:val="2"/>
+          <w:sz w:val="22"/>
+          <w:szCs w:val="22"/>
+          <w14:ligatures w14:val="standardContextual"/>
+        </w:rPr>
+        <w:br/>
+        <w:t>SAM template → connects the two.</w:t>
+      </w:r>
+    </w:p>
+    <w:p>
+      <w:pPr>
+        <w:pStyle w:val="NormalWeb"/>
+        <w:numPr>
+          <w:ilvl w:val="0"/>
+          <w:numId w:val="13"/>
+        </w:numPr>
+        <w:rPr>
+          <w:rFonts w:asciiTheme="minorHAnsi" w:eastAsiaTheme="minorHAnsi" w:hAnsiTheme="minorHAnsi" w:cstheme="minorBidi"/>
+          <w:color w:val="000000" w:themeColor="text1"/>
+          <w:kern w:val="2"/>
+          <w:sz w:val="22"/>
+          <w:szCs w:val="22"/>
+          <w14:ligatures w14:val="standardContextual"/>
+        </w:rPr>
+      </w:pPr>
+      <w:r>
+        <w:rPr>
+          <w:rFonts w:asciiTheme="minorHAnsi" w:eastAsiaTheme="minorHAnsi" w:hAnsiTheme="minorHAnsi" w:cstheme="minorBidi"/>
+          <w:color w:val="000000" w:themeColor="text1"/>
+          <w:kern w:val="2"/>
+          <w:sz w:val="22"/>
+          <w:szCs w:val="22"/>
+          <w14:ligatures w14:val="standardContextual"/>
+        </w:rPr>
+        <w:lastRenderedPageBreak/>
+        <w:t xml:space="preserve">store the values as </w:t>
+      </w:r>
+      <w:proofErr w:type="spellStart"/>
+      <w:r>
+        <w:rPr>
+          <w:rFonts w:asciiTheme="minorHAnsi" w:eastAsiaTheme="minorHAnsi" w:hAnsiTheme="minorHAnsi" w:cstheme="minorBidi"/>
+          <w:color w:val="000000" w:themeColor="text1"/>
+          <w:kern w:val="2"/>
+          <w:sz w:val="22"/>
+          <w:szCs w:val="22"/>
+          <w14:ligatures w14:val="standardContextual"/>
+        </w:rPr>
+        <w:t>environmetal</w:t>
+      </w:r>
+      <w:proofErr w:type="spellEnd"/>
+      <w:r>
+        <w:rPr>
+          <w:rFonts w:asciiTheme="minorHAnsi" w:eastAsiaTheme="minorHAnsi" w:hAnsiTheme="minorHAnsi" w:cstheme="minorBidi"/>
+          <w:color w:val="000000" w:themeColor="text1"/>
+          <w:kern w:val="2"/>
+          <w:sz w:val="22"/>
+          <w:szCs w:val="22"/>
+          <w14:ligatures w14:val="standardContextual"/>
+        </w:rPr>
+        <w:t xml:space="preserve"> variables and only pass the stage in the </w:t>
+      </w:r>
+      <w:proofErr w:type="spellStart"/>
+      <w:r>
+        <w:rPr>
+          <w:rFonts w:asciiTheme="minorHAnsi" w:eastAsiaTheme="minorHAnsi" w:hAnsiTheme="minorHAnsi" w:cstheme="minorBidi"/>
+          <w:color w:val="000000" w:themeColor="text1"/>
+          <w:kern w:val="2"/>
+          <w:sz w:val="22"/>
+          <w:szCs w:val="22"/>
+          <w14:ligatures w14:val="standardContextual"/>
+        </w:rPr>
+        <w:t>aws</w:t>
+      </w:r>
+      <w:proofErr w:type="spellEnd"/>
+      <w:r>
+        <w:rPr>
+          <w:rFonts w:asciiTheme="minorHAnsi" w:eastAsiaTheme="minorHAnsi" w:hAnsiTheme="minorHAnsi" w:cstheme="minorBidi"/>
+          <w:color w:val="000000" w:themeColor="text1"/>
+          <w:kern w:val="2"/>
+          <w:sz w:val="22"/>
+          <w:szCs w:val="22"/>
+          <w14:ligatures w14:val="standardContextual"/>
+        </w:rPr>
+        <w:t xml:space="preserve"> </w:t>
+      </w:r>
+      <w:proofErr w:type="spellStart"/>
+      <w:r>
+        <w:rPr>
+          <w:rFonts w:asciiTheme="minorHAnsi" w:eastAsiaTheme="minorHAnsi" w:hAnsiTheme="minorHAnsi" w:cstheme="minorBidi"/>
+          <w:color w:val="000000" w:themeColor="text1"/>
+          <w:kern w:val="2"/>
+          <w:sz w:val="22"/>
+          <w:szCs w:val="22"/>
+          <w14:ligatures w14:val="standardContextual"/>
+        </w:rPr>
+        <w:t>sam</w:t>
+      </w:r>
+      <w:proofErr w:type="spellEnd"/>
+      <w:r>
+        <w:rPr>
+          <w:rFonts w:asciiTheme="minorHAnsi" w:eastAsiaTheme="minorHAnsi" w:hAnsiTheme="minorHAnsi" w:cstheme="minorBidi"/>
+          <w:color w:val="000000" w:themeColor="text1"/>
+          <w:kern w:val="2"/>
+          <w:sz w:val="22"/>
+          <w:szCs w:val="22"/>
+          <w14:ligatures w14:val="standardContextual"/>
+        </w:rPr>
+        <w:t xml:space="preserve"> cli</w:t>
+      </w:r>
+      <w:r>
+        <w:rPr>
+          <w:rFonts w:asciiTheme="minorHAnsi" w:eastAsiaTheme="minorHAnsi" w:hAnsiTheme="minorHAnsi" w:cstheme="minorBidi"/>
+          <w:color w:val="000000" w:themeColor="text1"/>
+          <w:kern w:val="2"/>
+          <w:sz w:val="22"/>
+          <w:szCs w:val="22"/>
+          <w14:ligatures w14:val="standardContextual"/>
+        </w:rPr>
+        <w:t xml:space="preserve">. </w:t>
+      </w:r>
+      <w:proofErr w:type="spellStart"/>
+      <w:proofErr w:type="gramStart"/>
+      <w:r>
+        <w:rPr>
+          <w:rFonts w:asciiTheme="minorHAnsi" w:eastAsiaTheme="minorHAnsi" w:hAnsiTheme="minorHAnsi" w:cstheme="minorBidi"/>
+          <w:color w:val="000000" w:themeColor="text1"/>
+          <w:kern w:val="2"/>
+          <w:sz w:val="22"/>
+          <w:szCs w:val="22"/>
+          <w14:ligatures w14:val="standardContextual"/>
+        </w:rPr>
+        <w:t>i</w:t>
+      </w:r>
+      <w:proofErr w:type="spellEnd"/>
+      <w:r>
+        <w:rPr>
+          <w:rFonts w:asciiTheme="minorHAnsi" w:eastAsiaTheme="minorHAnsi" w:hAnsiTheme="minorHAnsi" w:cstheme="minorBidi"/>
+          <w:color w:val="000000" w:themeColor="text1"/>
+          <w:kern w:val="2"/>
+          <w:sz w:val="22"/>
+          <w:szCs w:val="22"/>
+          <w14:ligatures w14:val="standardContextual"/>
+        </w:rPr>
+        <w:t xml:space="preserve"> never</w:t>
+      </w:r>
+      <w:proofErr w:type="gramEnd"/>
+      <w:r>
+        <w:rPr>
+          <w:rFonts w:asciiTheme="minorHAnsi" w:eastAsiaTheme="minorHAnsi" w:hAnsiTheme="minorHAnsi" w:cstheme="minorBidi"/>
+          <w:color w:val="000000" w:themeColor="text1"/>
+          <w:kern w:val="2"/>
+          <w:sz w:val="22"/>
+          <w:szCs w:val="22"/>
+          <w14:ligatures w14:val="standardContextual"/>
+        </w:rPr>
+        <w:t xml:space="preserve"> pass the actual values for the database in the cli</w:t>
+      </w:r>
+    </w:p>
+    <w:p>
+      <w:pPr>
+        <w:pStyle w:val="NormalWeb"/>
         <w:ind w:left="360"/>
         <w:rPr>
           <w:rFonts w:asciiTheme="minorHAnsi" w:eastAsiaTheme="minorHAnsi" w:hAnsiTheme="minorHAnsi" w:cstheme="minorBidi"/>
@@ -2150,7 +2926,7 @@
           <w:u w:val="single"/>
           <w14:ligatures w14:val="standardContextual"/>
         </w:rPr>
-        <w:t>parameters inline</w:t>
+        <w:t>AWS CLI</w:t>
       </w:r>
       <w:r>
         <w:rPr>
@@ -2168,6 +2944,118 @@
     <w:p>
       <w:pPr>
         <w:pStyle w:val="NormalWeb"/>
+        <w:numPr>
+          <w:ilvl w:val="0"/>
+          <w:numId w:val="14"/>
+        </w:numPr>
+        <w:rPr>
+          <w:rFonts w:asciiTheme="minorHAnsi" w:eastAsiaTheme="minorHAnsi" w:hAnsiTheme="minorHAnsi" w:cstheme="minorBidi"/>
+          <w:color w:val="000000" w:themeColor="text1"/>
+          <w:kern w:val="2"/>
+          <w:sz w:val="22"/>
+          <w:szCs w:val="22"/>
+          <w14:ligatures w14:val="standardContextual"/>
+        </w:rPr>
+      </w:pPr>
+      <w:r>
+        <w:rPr>
+          <w:rFonts w:asciiTheme="minorHAnsi" w:eastAsiaTheme="minorHAnsi" w:hAnsiTheme="minorHAnsi" w:cstheme="minorBidi"/>
+          <w:color w:val="000000" w:themeColor="text1"/>
+          <w:kern w:val="2"/>
+          <w:sz w:val="22"/>
+          <w:szCs w:val="22"/>
+          <w14:ligatures w14:val="standardContextual"/>
+        </w:rPr>
+        <w:t>The AWS CLI lets you control AWS by typing commands in your terminal instead of using the AWS web console.</w:t>
+      </w:r>
+    </w:p>
+    <w:p>
+      <w:pPr>
+        <w:pStyle w:val="pdq2pgselectionanchorcontainer"/>
+        <w:numPr>
+          <w:ilvl w:val="0"/>
+          <w:numId w:val="14"/>
+        </w:numPr>
+        <w:rPr>
+          <w:rFonts w:asciiTheme="minorHAnsi" w:eastAsiaTheme="minorHAnsi" w:hAnsiTheme="minorHAnsi" w:cstheme="minorBidi"/>
+          <w:color w:val="000000" w:themeColor="text1"/>
+          <w:kern w:val="2"/>
+          <w:sz w:val="22"/>
+          <w:szCs w:val="22"/>
+          <w14:ligatures w14:val="standardContextual"/>
+        </w:rPr>
+      </w:pPr>
+      <w:r>
+        <w:rPr>
+          <w:rFonts w:asciiTheme="minorHAnsi" w:eastAsiaTheme="minorHAnsi" w:hAnsiTheme="minorHAnsi" w:cstheme="minorBidi"/>
+          <w:color w:val="000000" w:themeColor="text1"/>
+          <w:kern w:val="2"/>
+          <w:sz w:val="22"/>
+          <w:szCs w:val="22"/>
+          <w14:ligatures w14:val="standardContextual"/>
+        </w:rPr>
+        <w:t>AWS CLI = a command-line tool for interacting with and managing AWS resources.</w:t>
+      </w:r>
+    </w:p>
+    <w:p>
+      <w:pPr>
+        <w:pStyle w:val="NormalWeb"/>
+        <w:numPr>
+          <w:ilvl w:val="0"/>
+          <w:numId w:val="14"/>
+        </w:numPr>
+        <w:rPr>
+          <w:rFonts w:asciiTheme="minorHAnsi" w:eastAsiaTheme="minorHAnsi" w:hAnsiTheme="minorHAnsi" w:cstheme="minorBidi"/>
+          <w:color w:val="000000" w:themeColor="text1"/>
+          <w:kern w:val="2"/>
+          <w:sz w:val="22"/>
+          <w:szCs w:val="22"/>
+          <w14:ligatures w14:val="standardContextual"/>
+        </w:rPr>
+      </w:pPr>
+      <w:r>
+        <w:rPr>
+          <w:rFonts w:asciiTheme="minorHAnsi" w:eastAsiaTheme="minorHAnsi" w:hAnsiTheme="minorHAnsi" w:cstheme="minorBidi"/>
+          <w:color w:val="000000" w:themeColor="text1"/>
+          <w:kern w:val="2"/>
+          <w:sz w:val="22"/>
+          <w:szCs w:val="22"/>
+          <w14:ligatures w14:val="standardContextual"/>
+        </w:rPr>
+        <w:t>SAM CLI = a command-line tool specifically focused on building, testing, and deploying AWS SAM/serverless applications.</w:t>
+      </w:r>
+    </w:p>
+    <w:p>
+      <w:pPr>
+        <w:pStyle w:val="NormalWeb"/>
+        <w:numPr>
+          <w:ilvl w:val="0"/>
+          <w:numId w:val="14"/>
+        </w:numPr>
+        <w:rPr>
+          <w:rFonts w:asciiTheme="minorHAnsi" w:eastAsiaTheme="minorHAnsi" w:hAnsiTheme="minorHAnsi" w:cstheme="minorBidi"/>
+          <w:color w:val="000000" w:themeColor="text1"/>
+          <w:kern w:val="2"/>
+          <w:sz w:val="22"/>
+          <w:szCs w:val="22"/>
+          <w14:ligatures w14:val="standardContextual"/>
+        </w:rPr>
+      </w:pPr>
+      <w:r>
+        <w:rPr>
+          <w:rFonts w:asciiTheme="minorHAnsi" w:eastAsiaTheme="minorHAnsi" w:hAnsiTheme="minorHAnsi" w:cstheme="minorBidi"/>
+          <w:color w:val="000000" w:themeColor="text1"/>
+          <w:kern w:val="2"/>
+          <w:sz w:val="22"/>
+          <w:szCs w:val="22"/>
+          <w14:ligatures w14:val="standardContextual"/>
+        </w:rPr>
+        <w:t>SAM CLI often uses the AWS CLI underneath or interacts with the same AWS services, but it gives you commands specifically designed around serverless applications.</w:t>
+      </w:r>
+    </w:p>
+    <w:p>
+      <w:pPr>
+        <w:pStyle w:val="NormalWeb"/>
         <w:ind w:left="360"/>
         <w:rPr>
           <w:rFonts w:asciiTheme="minorHAnsi" w:eastAsiaTheme="minorHAnsi" w:hAnsiTheme="minorHAnsi" w:cstheme="minorBidi"/>
@@ -2189,8 +3077,9 @@
           <w:u w:val="single"/>
           <w14:ligatures w14:val="standardContextual"/>
         </w:rPr>
-        <w:t>AWS CLI</w:t>
-      </w:r>
+        <w:t xml:space="preserve">SAM </w:t>
+      </w:r>
+      <w:proofErr w:type="spellStart"/>
       <w:r>
         <w:rPr>
           <w:rFonts w:asciiTheme="minorHAnsi" w:eastAsiaTheme="minorHAnsi" w:hAnsiTheme="minorHAnsi" w:cstheme="minorBidi"/>
@@ -2201,7 +3090,884 @@
           <w:u w:val="single"/>
           <w14:ligatures w14:val="standardContextual"/>
         </w:rPr>
+        <w:t>init</w:t>
+      </w:r>
+      <w:proofErr w:type="spellEnd"/>
+      <w:r>
+        <w:rPr>
+          <w:rFonts w:asciiTheme="minorHAnsi" w:eastAsiaTheme="minorHAnsi" w:hAnsiTheme="minorHAnsi" w:cstheme="minorBidi"/>
+          <w:b/>
+          <w:bCs/>
+          <w:color w:val="000000" w:themeColor="text1"/>
+          <w:kern w:val="2"/>
+          <w:u w:val="single"/>
+          <w14:ligatures w14:val="standardContextual"/>
+        </w:rPr>
         <w:t>:</w:t>
+      </w:r>
+    </w:p>
+    <w:p>
+      <w:pPr>
+        <w:pStyle w:val="NormalWeb"/>
+        <w:numPr>
+          <w:ilvl w:val="0"/>
+          <w:numId w:val="15"/>
+        </w:numPr>
+        <w:rPr>
+          <w:rFonts w:asciiTheme="minorHAnsi" w:eastAsiaTheme="minorHAnsi" w:hAnsiTheme="minorHAnsi" w:cstheme="minorBidi"/>
+          <w:color w:val="000000" w:themeColor="text1"/>
+          <w:kern w:val="2"/>
+          <w:sz w:val="22"/>
+          <w:szCs w:val="22"/>
+          <w14:ligatures w14:val="standardContextual"/>
+        </w:rPr>
+      </w:pPr>
+      <w:proofErr w:type="spellStart"/>
+      <w:r>
+        <w:rPr>
+          <w:rFonts w:asciiTheme="minorHAnsi" w:eastAsiaTheme="minorHAnsi" w:hAnsiTheme="minorHAnsi" w:cstheme="minorBidi"/>
+          <w:color w:val="000000" w:themeColor="text1"/>
+          <w:kern w:val="2"/>
+          <w:sz w:val="22"/>
+          <w:szCs w:val="22"/>
+          <w14:ligatures w14:val="standardContextual"/>
+        </w:rPr>
+        <w:t>sam</w:t>
+      </w:r>
+      <w:proofErr w:type="spellEnd"/>
+      <w:r>
+        <w:rPr>
+          <w:rFonts w:asciiTheme="minorHAnsi" w:eastAsiaTheme="minorHAnsi" w:hAnsiTheme="minorHAnsi" w:cstheme="minorBidi"/>
+          <w:color w:val="000000" w:themeColor="text1"/>
+          <w:kern w:val="2"/>
+          <w:sz w:val="22"/>
+          <w:szCs w:val="22"/>
+          <w14:ligatures w14:val="standardContextual"/>
+        </w:rPr>
+        <w:t xml:space="preserve"> </w:t>
+      </w:r>
+      <w:proofErr w:type="spellStart"/>
+      <w:r>
+        <w:rPr>
+          <w:rFonts w:asciiTheme="minorHAnsi" w:eastAsiaTheme="minorHAnsi" w:hAnsiTheme="minorHAnsi" w:cstheme="minorBidi"/>
+          <w:color w:val="000000" w:themeColor="text1"/>
+          <w:kern w:val="2"/>
+          <w:sz w:val="22"/>
+          <w:szCs w:val="22"/>
+          <w14:ligatures w14:val="standardContextual"/>
+        </w:rPr>
+        <w:t>init</w:t>
+      </w:r>
+      <w:proofErr w:type="spellEnd"/>
+      <w:r>
+        <w:rPr>
+          <w:rFonts w:asciiTheme="minorHAnsi" w:eastAsiaTheme="minorHAnsi" w:hAnsiTheme="minorHAnsi" w:cstheme="minorBidi"/>
+          <w:color w:val="000000" w:themeColor="text1"/>
+          <w:kern w:val="2"/>
+          <w:sz w:val="22"/>
+          <w:szCs w:val="22"/>
+          <w14:ligatures w14:val="standardContextual"/>
+        </w:rPr>
+        <w:t xml:space="preserve"> is basically the </w:t>
+      </w:r>
+      <w:r>
+        <w:rPr>
+          <w:rFonts w:asciiTheme="minorHAnsi" w:eastAsiaTheme="minorHAnsi" w:hAnsiTheme="minorHAnsi" w:cstheme="minorBidi"/>
+          <w:b/>
+          <w:bCs/>
+          <w:color w:val="000000" w:themeColor="text1"/>
+          <w:kern w:val="2"/>
+          <w:sz w:val="22"/>
+          <w:szCs w:val="22"/>
+          <w14:ligatures w14:val="standardContextual"/>
+        </w:rPr>
+        <w:t>“create a new SAM project for me”</w:t>
+      </w:r>
+      <w:r>
+        <w:rPr>
+          <w:rFonts w:asciiTheme="minorHAnsi" w:eastAsiaTheme="minorHAnsi" w:hAnsiTheme="minorHAnsi" w:cstheme="minorBidi"/>
+          <w:color w:val="000000" w:themeColor="text1"/>
+          <w:kern w:val="2"/>
+          <w:sz w:val="22"/>
+          <w:szCs w:val="22"/>
+          <w14:ligatures w14:val="standardContextual"/>
+        </w:rPr>
+        <w:t xml:space="preserve"> command.</w:t>
+      </w:r>
+    </w:p>
+    <w:p>
+      <w:pPr>
+        <w:pStyle w:val="ListParagraph"/>
+        <w:numPr>
+          <w:ilvl w:val="0"/>
+          <w:numId w:val="15"/>
+        </w:numPr>
+        <w:rPr>
+          <w:color w:val="000000" w:themeColor="text1"/>
+          <w:sz w:val="22"/>
+          <w:szCs w:val="22"/>
+        </w:rPr>
+      </w:pPr>
+      <w:r>
+        <w:rPr>
+          <w:color w:val="000000" w:themeColor="text1"/>
+          <w:sz w:val="22"/>
+          <w:szCs w:val="22"/>
+        </w:rPr>
+        <w:t>SAM CLI starts an interactive setup where it asks you questions such as:</w:t>
+      </w:r>
+    </w:p>
+    <w:p>
+      <w:pPr>
+        <w:numPr>
+          <w:ilvl w:val="1"/>
+          <w:numId w:val="15"/>
+        </w:numPr>
+        <w:spacing w:before="100" w:beforeAutospacing="1" w:after="100" w:afterAutospacing="1" w:line="240" w:lineRule="auto"/>
+        <w:rPr>
+          <w:color w:val="000000" w:themeColor="text1"/>
+          <w:sz w:val="22"/>
+          <w:szCs w:val="22"/>
+        </w:rPr>
+      </w:pPr>
+      <w:r>
+        <w:rPr>
+          <w:color w:val="000000" w:themeColor="text1"/>
+          <w:sz w:val="22"/>
+          <w:szCs w:val="22"/>
+        </w:rPr>
+        <w:t xml:space="preserve">Which template/starter project do you want? </w:t>
+      </w:r>
+    </w:p>
+    <w:p>
+      <w:pPr>
+        <w:numPr>
+          <w:ilvl w:val="1"/>
+          <w:numId w:val="15"/>
+        </w:numPr>
+        <w:spacing w:before="100" w:beforeAutospacing="1" w:after="100" w:afterAutospacing="1" w:line="240" w:lineRule="auto"/>
+        <w:rPr>
+          <w:color w:val="000000" w:themeColor="text1"/>
+          <w:sz w:val="22"/>
+          <w:szCs w:val="22"/>
+        </w:rPr>
+      </w:pPr>
+      <w:r>
+        <w:rPr>
+          <w:color w:val="000000" w:themeColor="text1"/>
+          <w:sz w:val="22"/>
+          <w:szCs w:val="22"/>
+        </w:rPr>
+        <w:t xml:space="preserve">Which runtime? (Python, Node.js, Java, etc.) </w:t>
+      </w:r>
+    </w:p>
+    <w:p>
+      <w:pPr>
+        <w:numPr>
+          <w:ilvl w:val="1"/>
+          <w:numId w:val="15"/>
+        </w:numPr>
+        <w:spacing w:before="100" w:beforeAutospacing="1" w:after="100" w:afterAutospacing="1" w:line="240" w:lineRule="auto"/>
+        <w:rPr>
+          <w:color w:val="000000" w:themeColor="text1"/>
+          <w:sz w:val="22"/>
+          <w:szCs w:val="22"/>
+        </w:rPr>
+      </w:pPr>
+      <w:r>
+        <w:rPr>
+          <w:color w:val="000000" w:themeColor="text1"/>
+          <w:sz w:val="22"/>
+          <w:szCs w:val="22"/>
+        </w:rPr>
+        <w:t xml:space="preserve">What project name? </w:t>
+      </w:r>
+    </w:p>
+    <w:p>
+      <w:pPr>
+        <w:numPr>
+          <w:ilvl w:val="1"/>
+          <w:numId w:val="15"/>
+        </w:numPr>
+        <w:spacing w:before="100" w:beforeAutospacing="1" w:after="100" w:afterAutospacing="1" w:line="240" w:lineRule="auto"/>
+        <w:rPr>
+          <w:color w:val="000000" w:themeColor="text1"/>
+          <w:sz w:val="22"/>
+          <w:szCs w:val="22"/>
+        </w:rPr>
+      </w:pPr>
+      <w:r>
+        <w:rPr>
+          <w:color w:val="000000" w:themeColor="text1"/>
+          <w:sz w:val="22"/>
+          <w:szCs w:val="22"/>
+        </w:rPr>
+        <w:t>Which package/dependency type?</w:t>
+      </w:r>
+    </w:p>
+    <w:p>
+      <w:pPr>
+        <w:pStyle w:val="NormalWeb"/>
+        <w:numPr>
+          <w:ilvl w:val="0"/>
+          <w:numId w:val="15"/>
+        </w:numPr>
+        <w:rPr>
+          <w:rFonts w:asciiTheme="minorHAnsi" w:eastAsiaTheme="minorHAnsi" w:hAnsiTheme="minorHAnsi" w:cstheme="minorBidi"/>
+          <w:color w:val="000000" w:themeColor="text1"/>
+          <w:kern w:val="2"/>
+          <w:sz w:val="22"/>
+          <w:szCs w:val="22"/>
+          <w14:ligatures w14:val="standardContextual"/>
+        </w:rPr>
+      </w:pPr>
+      <w:r>
+        <w:rPr>
+          <w:rFonts w:asciiTheme="minorHAnsi" w:eastAsiaTheme="minorHAnsi" w:hAnsiTheme="minorHAnsi" w:cstheme="minorBidi"/>
+          <w:color w:val="000000" w:themeColor="text1"/>
+          <w:kern w:val="2"/>
+          <w:sz w:val="22"/>
+          <w:szCs w:val="22"/>
+          <w14:ligatures w14:val="standardContextual"/>
+        </w:rPr>
+        <w:t xml:space="preserve">We might </w:t>
+      </w:r>
+      <w:proofErr w:type="spellStart"/>
+      <w:proofErr w:type="gramStart"/>
+      <w:r>
+        <w:rPr>
+          <w:rFonts w:asciiTheme="minorHAnsi" w:eastAsiaTheme="minorHAnsi" w:hAnsiTheme="minorHAnsi" w:cstheme="minorBidi"/>
+          <w:color w:val="000000" w:themeColor="text1"/>
+          <w:kern w:val="2"/>
+          <w:sz w:val="22"/>
+          <w:szCs w:val="22"/>
+          <w14:ligatures w14:val="standardContextual"/>
+        </w:rPr>
+        <w:t>endup</w:t>
+      </w:r>
+      <w:proofErr w:type="spellEnd"/>
+      <w:proofErr w:type="gramEnd"/>
+      <w:r>
+        <w:rPr>
+          <w:rFonts w:asciiTheme="minorHAnsi" w:eastAsiaTheme="minorHAnsi" w:hAnsiTheme="minorHAnsi" w:cstheme="minorBidi"/>
+          <w:color w:val="000000" w:themeColor="text1"/>
+          <w:kern w:val="2"/>
+          <w:sz w:val="22"/>
+          <w:szCs w:val="22"/>
+          <w14:ligatures w14:val="standardContextual"/>
+        </w:rPr>
+        <w:t xml:space="preserve"> with something like this:</w:t>
+      </w:r>
+    </w:p>
+    <w:p>
+      <w:pPr>
+        <w:pStyle w:val="NormalWeb"/>
+        <w:numPr>
+          <w:ilvl w:val="1"/>
+          <w:numId w:val="15"/>
+        </w:numPr>
+        <w:rPr>
+          <w:rFonts w:asciiTheme="minorHAnsi" w:eastAsiaTheme="minorHAnsi" w:hAnsiTheme="minorHAnsi" w:cstheme="minorBidi"/>
+          <w:color w:val="000000" w:themeColor="text1"/>
+          <w:kern w:val="2"/>
+          <w:sz w:val="22"/>
+          <w:szCs w:val="22"/>
+          <w14:ligatures w14:val="standardContextual"/>
+        </w:rPr>
+      </w:pPr>
+      <w:r>
+        <w:rPr>
+          <w:rFonts w:asciiTheme="minorHAnsi" w:eastAsiaTheme="minorHAnsi" w:hAnsiTheme="minorHAnsi" w:cstheme="minorBidi"/>
+          <w:color w:val="000000" w:themeColor="text1"/>
+          <w:kern w:val="2"/>
+          <w:sz w:val="22"/>
+          <w:szCs w:val="22"/>
+          <w14:ligatures w14:val="standardContextual"/>
+        </w:rPr>
+        <w:t>my-</w:t>
+      </w:r>
+      <w:proofErr w:type="spellStart"/>
+      <w:r>
+        <w:rPr>
+          <w:rFonts w:asciiTheme="minorHAnsi" w:eastAsiaTheme="minorHAnsi" w:hAnsiTheme="minorHAnsi" w:cstheme="minorBidi"/>
+          <w:color w:val="000000" w:themeColor="text1"/>
+          <w:kern w:val="2"/>
+          <w:sz w:val="22"/>
+          <w:szCs w:val="22"/>
+          <w14:ligatures w14:val="standardContextual"/>
+        </w:rPr>
+        <w:t>sam</w:t>
+      </w:r>
+      <w:proofErr w:type="spellEnd"/>
+      <w:r>
+        <w:rPr>
+          <w:rFonts w:asciiTheme="minorHAnsi" w:eastAsiaTheme="minorHAnsi" w:hAnsiTheme="minorHAnsi" w:cstheme="minorBidi"/>
+          <w:color w:val="000000" w:themeColor="text1"/>
+          <w:kern w:val="2"/>
+          <w:sz w:val="22"/>
+          <w:szCs w:val="22"/>
+          <w14:ligatures w14:val="standardContextual"/>
+        </w:rPr>
+        <w:t xml:space="preserve">-app/ </w:t>
+      </w:r>
+      <w:r>
+        <w:rPr>
+          <w:rFonts w:ascii="MS Gothic" w:eastAsia="MS Gothic" w:hAnsi="MS Gothic" w:cs="MS Gothic" w:hint="eastAsia"/>
+          <w:color w:val="000000" w:themeColor="text1"/>
+          <w:kern w:val="2"/>
+          <w:sz w:val="22"/>
+          <w:szCs w:val="22"/>
+          <w14:ligatures w14:val="standardContextual"/>
+        </w:rPr>
+        <w:t>├</w:t>
+      </w:r>
+      <w:r>
+        <w:rPr>
+          <w:rFonts w:ascii="Aptos" w:eastAsiaTheme="minorHAnsi" w:hAnsi="Aptos" w:cs="Aptos"/>
+          <w:color w:val="000000" w:themeColor="text1"/>
+          <w:kern w:val="2"/>
+          <w:sz w:val="22"/>
+          <w:szCs w:val="22"/>
+          <w14:ligatures w14:val="standardContextual"/>
+        </w:rPr>
+        <w:t>──</w:t>
+      </w:r>
+      <w:r>
+        <w:rPr>
+          <w:rFonts w:asciiTheme="minorHAnsi" w:eastAsiaTheme="minorHAnsi" w:hAnsiTheme="minorHAnsi" w:cstheme="minorBidi"/>
+          <w:color w:val="000000" w:themeColor="text1"/>
+          <w:kern w:val="2"/>
+          <w:sz w:val="22"/>
+          <w:szCs w:val="22"/>
+          <w14:ligatures w14:val="standardContextual"/>
+        </w:rPr>
+        <w:t xml:space="preserve"> </w:t>
+      </w:r>
+      <w:proofErr w:type="spellStart"/>
+      <w:proofErr w:type="gramStart"/>
+      <w:r>
+        <w:rPr>
+          <w:rFonts w:asciiTheme="minorHAnsi" w:eastAsiaTheme="minorHAnsi" w:hAnsiTheme="minorHAnsi" w:cstheme="minorBidi"/>
+          <w:color w:val="000000" w:themeColor="text1"/>
+          <w:kern w:val="2"/>
+          <w:sz w:val="22"/>
+          <w:szCs w:val="22"/>
+          <w14:ligatures w14:val="standardContextual"/>
+        </w:rPr>
+        <w:t>template.yaml</w:t>
+      </w:r>
+      <w:proofErr w:type="spellEnd"/>
+      <w:proofErr w:type="gramEnd"/>
+      <w:r>
+        <w:rPr>
+          <w:rFonts w:asciiTheme="minorHAnsi" w:eastAsiaTheme="minorHAnsi" w:hAnsiTheme="minorHAnsi" w:cstheme="minorBidi"/>
+          <w:color w:val="000000" w:themeColor="text1"/>
+          <w:kern w:val="2"/>
+          <w:sz w:val="22"/>
+          <w:szCs w:val="22"/>
+          <w14:ligatures w14:val="standardContextual"/>
+        </w:rPr>
+        <w:t xml:space="preserve"> </w:t>
+      </w:r>
+      <w:r>
+        <w:rPr>
+          <w:rFonts w:ascii="MS Gothic" w:eastAsia="MS Gothic" w:hAnsi="MS Gothic" w:cs="MS Gothic" w:hint="eastAsia"/>
+          <w:color w:val="000000" w:themeColor="text1"/>
+          <w:kern w:val="2"/>
+          <w:sz w:val="22"/>
+          <w:szCs w:val="22"/>
+          <w14:ligatures w14:val="standardContextual"/>
+        </w:rPr>
+        <w:t>├</w:t>
+      </w:r>
+      <w:r>
+        <w:rPr>
+          <w:rFonts w:ascii="Aptos" w:eastAsiaTheme="minorHAnsi" w:hAnsi="Aptos" w:cs="Aptos"/>
+          <w:color w:val="000000" w:themeColor="text1"/>
+          <w:kern w:val="2"/>
+          <w:sz w:val="22"/>
+          <w:szCs w:val="22"/>
+          <w14:ligatures w14:val="standardContextual"/>
+        </w:rPr>
+        <w:t>──</w:t>
+      </w:r>
+      <w:r>
+        <w:rPr>
+          <w:rFonts w:asciiTheme="minorHAnsi" w:eastAsiaTheme="minorHAnsi" w:hAnsiTheme="minorHAnsi" w:cstheme="minorBidi"/>
+          <w:color w:val="000000" w:themeColor="text1"/>
+          <w:kern w:val="2"/>
+          <w:sz w:val="22"/>
+          <w:szCs w:val="22"/>
+          <w14:ligatures w14:val="standardContextual"/>
+        </w:rPr>
+        <w:t xml:space="preserve"> </w:t>
+      </w:r>
+      <w:proofErr w:type="spellStart"/>
+      <w:proofErr w:type="gramStart"/>
+      <w:r>
+        <w:rPr>
+          <w:rFonts w:asciiTheme="minorHAnsi" w:eastAsiaTheme="minorHAnsi" w:hAnsiTheme="minorHAnsi" w:cstheme="minorBidi"/>
+          <w:color w:val="000000" w:themeColor="text1"/>
+          <w:kern w:val="2"/>
+          <w:sz w:val="22"/>
+          <w:szCs w:val="22"/>
+          <w14:ligatures w14:val="standardContextual"/>
+        </w:rPr>
+        <w:t>samconfig.toml</w:t>
+      </w:r>
+      <w:proofErr w:type="spellEnd"/>
+      <w:proofErr w:type="gramEnd"/>
+      <w:r>
+        <w:rPr>
+          <w:rFonts w:asciiTheme="minorHAnsi" w:eastAsiaTheme="minorHAnsi" w:hAnsiTheme="minorHAnsi" w:cstheme="minorBidi"/>
+          <w:color w:val="000000" w:themeColor="text1"/>
+          <w:kern w:val="2"/>
+          <w:sz w:val="22"/>
+          <w:szCs w:val="22"/>
+          <w14:ligatures w14:val="standardContextual"/>
+        </w:rPr>
+        <w:t xml:space="preserve"> </w:t>
+      </w:r>
+      <w:r>
+        <w:rPr>
+          <w:rFonts w:ascii="MS Gothic" w:eastAsia="MS Gothic" w:hAnsi="MS Gothic" w:cs="MS Gothic" w:hint="eastAsia"/>
+          <w:color w:val="000000" w:themeColor="text1"/>
+          <w:kern w:val="2"/>
+          <w:sz w:val="22"/>
+          <w:szCs w:val="22"/>
+          <w14:ligatures w14:val="standardContextual"/>
+        </w:rPr>
+        <w:t>├</w:t>
+      </w:r>
+      <w:r>
+        <w:rPr>
+          <w:rFonts w:ascii="Aptos" w:eastAsiaTheme="minorHAnsi" w:hAnsi="Aptos" w:cs="Aptos"/>
+          <w:color w:val="000000" w:themeColor="text1"/>
+          <w:kern w:val="2"/>
+          <w:sz w:val="22"/>
+          <w:szCs w:val="22"/>
+          <w14:ligatures w14:val="standardContextual"/>
+        </w:rPr>
+        <w:t>──</w:t>
+      </w:r>
+      <w:r>
+        <w:rPr>
+          <w:rFonts w:asciiTheme="minorHAnsi" w:eastAsiaTheme="minorHAnsi" w:hAnsiTheme="minorHAnsi" w:cstheme="minorBidi"/>
+          <w:color w:val="000000" w:themeColor="text1"/>
+          <w:kern w:val="2"/>
+          <w:sz w:val="22"/>
+          <w:szCs w:val="22"/>
+          <w14:ligatures w14:val="standardContextual"/>
+        </w:rPr>
+        <w:t xml:space="preserve"> </w:t>
+      </w:r>
+      <w:proofErr w:type="spellStart"/>
+      <w:r>
+        <w:rPr>
+          <w:rFonts w:asciiTheme="minorHAnsi" w:eastAsiaTheme="minorHAnsi" w:hAnsiTheme="minorHAnsi" w:cstheme="minorBidi"/>
+          <w:color w:val="000000" w:themeColor="text1"/>
+          <w:kern w:val="2"/>
+          <w:sz w:val="22"/>
+          <w:szCs w:val="22"/>
+          <w14:ligatures w14:val="standardContextual"/>
+        </w:rPr>
+        <w:t>hello_world</w:t>
+      </w:r>
+      <w:proofErr w:type="spellEnd"/>
+      <w:r>
+        <w:rPr>
+          <w:rFonts w:asciiTheme="minorHAnsi" w:eastAsiaTheme="minorHAnsi" w:hAnsiTheme="minorHAnsi" w:cstheme="minorBidi"/>
+          <w:color w:val="000000" w:themeColor="text1"/>
+          <w:kern w:val="2"/>
+          <w:sz w:val="22"/>
+          <w:szCs w:val="22"/>
+          <w14:ligatures w14:val="standardContextual"/>
+        </w:rPr>
+        <w:t xml:space="preserve">/ </w:t>
+      </w:r>
+      <w:r>
+        <w:rPr>
+          <w:rFonts w:ascii="Aptos" w:eastAsiaTheme="minorHAnsi" w:hAnsi="Aptos" w:cs="Aptos"/>
+          <w:color w:val="000000" w:themeColor="text1"/>
+          <w:kern w:val="2"/>
+          <w:sz w:val="22"/>
+          <w:szCs w:val="22"/>
+          <w14:ligatures w14:val="standardContextual"/>
+        </w:rPr>
+        <w:t>│</w:t>
+      </w:r>
+      <w:r>
+        <w:rPr>
+          <w:rFonts w:asciiTheme="minorHAnsi" w:eastAsiaTheme="minorHAnsi" w:hAnsiTheme="minorHAnsi" w:cstheme="minorBidi"/>
+          <w:color w:val="000000" w:themeColor="text1"/>
+          <w:kern w:val="2"/>
+          <w:sz w:val="22"/>
+          <w:szCs w:val="22"/>
+          <w14:ligatures w14:val="standardContextual"/>
+        </w:rPr>
+        <w:t xml:space="preserve"> </w:t>
+      </w:r>
+      <w:r>
+        <w:rPr>
+          <w:rFonts w:ascii="MS Gothic" w:eastAsia="MS Gothic" w:hAnsi="MS Gothic" w:cs="MS Gothic" w:hint="eastAsia"/>
+          <w:color w:val="000000" w:themeColor="text1"/>
+          <w:kern w:val="2"/>
+          <w:sz w:val="22"/>
+          <w:szCs w:val="22"/>
+          <w14:ligatures w14:val="standardContextual"/>
+        </w:rPr>
+        <w:t>├</w:t>
+      </w:r>
+      <w:r>
+        <w:rPr>
+          <w:rFonts w:ascii="Aptos" w:eastAsiaTheme="minorHAnsi" w:hAnsi="Aptos" w:cs="Aptos"/>
+          <w:color w:val="000000" w:themeColor="text1"/>
+          <w:kern w:val="2"/>
+          <w:sz w:val="22"/>
+          <w:szCs w:val="22"/>
+          <w14:ligatures w14:val="standardContextual"/>
+        </w:rPr>
+        <w:t>──</w:t>
+      </w:r>
+      <w:r>
+        <w:rPr>
+          <w:rFonts w:asciiTheme="minorHAnsi" w:eastAsiaTheme="minorHAnsi" w:hAnsiTheme="minorHAnsi" w:cstheme="minorBidi"/>
+          <w:color w:val="000000" w:themeColor="text1"/>
+          <w:kern w:val="2"/>
+          <w:sz w:val="22"/>
+          <w:szCs w:val="22"/>
+          <w14:ligatures w14:val="standardContextual"/>
+        </w:rPr>
+        <w:t xml:space="preserve"> app.py </w:t>
+      </w:r>
+      <w:r>
+        <w:rPr>
+          <w:rFonts w:ascii="Aptos" w:eastAsiaTheme="minorHAnsi" w:hAnsi="Aptos" w:cs="Aptos"/>
+          <w:color w:val="000000" w:themeColor="text1"/>
+          <w:kern w:val="2"/>
+          <w:sz w:val="22"/>
+          <w:szCs w:val="22"/>
+          <w14:ligatures w14:val="standardContextual"/>
+        </w:rPr>
+        <w:t>│</w:t>
+      </w:r>
+      <w:r>
+        <w:rPr>
+          <w:rFonts w:asciiTheme="minorHAnsi" w:eastAsiaTheme="minorHAnsi" w:hAnsiTheme="minorHAnsi" w:cstheme="minorBidi"/>
+          <w:color w:val="000000" w:themeColor="text1"/>
+          <w:kern w:val="2"/>
+          <w:sz w:val="22"/>
+          <w:szCs w:val="22"/>
+          <w14:ligatures w14:val="standardContextual"/>
+        </w:rPr>
+        <w:t xml:space="preserve"> </w:t>
+      </w:r>
+      <w:r>
+        <w:rPr>
+          <w:rFonts w:ascii="Aptos" w:eastAsiaTheme="minorHAnsi" w:hAnsi="Aptos" w:cs="Aptos"/>
+          <w:color w:val="000000" w:themeColor="text1"/>
+          <w:kern w:val="2"/>
+          <w:sz w:val="22"/>
+          <w:szCs w:val="22"/>
+          <w14:ligatures w14:val="standardContextual"/>
+        </w:rPr>
+        <w:t>└──</w:t>
+      </w:r>
+      <w:r>
+        <w:rPr>
+          <w:rFonts w:asciiTheme="minorHAnsi" w:eastAsiaTheme="minorHAnsi" w:hAnsiTheme="minorHAnsi" w:cstheme="minorBidi"/>
+          <w:color w:val="000000" w:themeColor="text1"/>
+          <w:kern w:val="2"/>
+          <w:sz w:val="22"/>
+          <w:szCs w:val="22"/>
+          <w14:ligatures w14:val="standardContextual"/>
+        </w:rPr>
+        <w:t xml:space="preserve"> __init__.py </w:t>
+      </w:r>
+      <w:r>
+        <w:rPr>
+          <w:rFonts w:ascii="Aptos" w:eastAsiaTheme="minorHAnsi" w:hAnsi="Aptos" w:cs="Aptos"/>
+          <w:color w:val="000000" w:themeColor="text1"/>
+          <w:kern w:val="2"/>
+          <w:sz w:val="22"/>
+          <w:szCs w:val="22"/>
+          <w14:ligatures w14:val="standardContextual"/>
+        </w:rPr>
+        <w:t>└──</w:t>
+      </w:r>
+      <w:r>
+        <w:rPr>
+          <w:rFonts w:asciiTheme="minorHAnsi" w:eastAsiaTheme="minorHAnsi" w:hAnsiTheme="minorHAnsi" w:cstheme="minorBidi"/>
+          <w:color w:val="000000" w:themeColor="text1"/>
+          <w:kern w:val="2"/>
+          <w:sz w:val="22"/>
+          <w:szCs w:val="22"/>
+          <w14:ligatures w14:val="standardContextual"/>
+        </w:rPr>
+        <w:t xml:space="preserve"> tests/ </w:t>
+      </w:r>
+      <w:r>
+        <w:rPr>
+          <w:rFonts w:ascii="Aptos" w:eastAsiaTheme="minorHAnsi" w:hAnsi="Aptos" w:cs="Aptos"/>
+          <w:color w:val="000000" w:themeColor="text1"/>
+          <w:kern w:val="2"/>
+          <w:sz w:val="22"/>
+          <w:szCs w:val="22"/>
+          <w14:ligatures w14:val="standardContextual"/>
+        </w:rPr>
+        <w:t>└──</w:t>
+      </w:r>
+      <w:r>
+        <w:rPr>
+          <w:rFonts w:asciiTheme="minorHAnsi" w:eastAsiaTheme="minorHAnsi" w:hAnsiTheme="minorHAnsi" w:cstheme="minorBidi"/>
+          <w:color w:val="000000" w:themeColor="text1"/>
+          <w:kern w:val="2"/>
+          <w:sz w:val="22"/>
+          <w:szCs w:val="22"/>
+          <w14:ligatures w14:val="standardContextual"/>
+        </w:rPr>
+        <w:t xml:space="preserve"> unit/</w:t>
+      </w:r>
+    </w:p>
+    <w:p>
+      <w:pPr>
+        <w:pStyle w:val="NormalWeb"/>
+        <w:numPr>
+          <w:ilvl w:val="0"/>
+          <w:numId w:val="15"/>
+        </w:numPr>
+        <w:rPr>
+          <w:rFonts w:asciiTheme="minorHAnsi" w:eastAsiaTheme="minorHAnsi" w:hAnsiTheme="minorHAnsi" w:cstheme="minorBidi"/>
+          <w:color w:val="000000" w:themeColor="text1"/>
+          <w:kern w:val="2"/>
+          <w:sz w:val="22"/>
+          <w:szCs w:val="22"/>
+          <w14:ligatures w14:val="standardContextual"/>
+        </w:rPr>
+      </w:pPr>
+      <w:r>
+        <w:rPr>
+          <w:rFonts w:asciiTheme="minorHAnsi" w:eastAsiaTheme="minorHAnsi" w:hAnsiTheme="minorHAnsi" w:cstheme="minorBidi"/>
+          <w:color w:val="000000" w:themeColor="text1"/>
+          <w:kern w:val="2"/>
+          <w:sz w:val="22"/>
+          <w:szCs w:val="22"/>
+          <w14:ligatures w14:val="standardContextual"/>
+        </w:rPr>
+        <w:t xml:space="preserve">with the </w:t>
+      </w:r>
+      <w:proofErr w:type="spellStart"/>
+      <w:proofErr w:type="gramStart"/>
+      <w:r>
+        <w:rPr>
+          <w:rFonts w:asciiTheme="minorHAnsi" w:eastAsiaTheme="minorHAnsi" w:hAnsiTheme="minorHAnsi" w:cstheme="minorBidi"/>
+          <w:color w:val="000000" w:themeColor="text1"/>
+          <w:kern w:val="2"/>
+          <w:sz w:val="22"/>
+          <w:szCs w:val="22"/>
+          <w14:ligatures w14:val="standardContextual"/>
+        </w:rPr>
+        <w:t>template.yaml</w:t>
+      </w:r>
+      <w:proofErr w:type="spellEnd"/>
+      <w:proofErr w:type="gramEnd"/>
+      <w:r>
+        <w:rPr>
+          <w:rFonts w:asciiTheme="minorHAnsi" w:eastAsiaTheme="minorHAnsi" w:hAnsiTheme="minorHAnsi" w:cstheme="minorBidi"/>
+          <w:color w:val="000000" w:themeColor="text1"/>
+          <w:kern w:val="2"/>
+          <w:sz w:val="22"/>
+          <w:szCs w:val="22"/>
+          <w14:ligatures w14:val="standardContextual"/>
+        </w:rPr>
+        <w:t xml:space="preserve"> as the most important part since </w:t>
+      </w:r>
+      <w:proofErr w:type="gramStart"/>
+      <w:r>
+        <w:rPr>
+          <w:rFonts w:asciiTheme="minorHAnsi" w:eastAsiaTheme="minorHAnsi" w:hAnsiTheme="minorHAnsi" w:cstheme="minorBidi"/>
+          <w:color w:val="000000" w:themeColor="text1"/>
+          <w:kern w:val="2"/>
+          <w:sz w:val="22"/>
+          <w:szCs w:val="22"/>
+          <w14:ligatures w14:val="standardContextual"/>
+        </w:rPr>
+        <w:t>its</w:t>
+      </w:r>
+      <w:proofErr w:type="gramEnd"/>
+      <w:r>
+        <w:rPr>
+          <w:rFonts w:asciiTheme="minorHAnsi" w:eastAsiaTheme="minorHAnsi" w:hAnsiTheme="minorHAnsi" w:cstheme="minorBidi"/>
+          <w:color w:val="000000" w:themeColor="text1"/>
+          <w:kern w:val="2"/>
+          <w:sz w:val="22"/>
+          <w:szCs w:val="22"/>
+          <w14:ligatures w14:val="standardContextual"/>
+        </w:rPr>
+        <w:t xml:space="preserve"> where our </w:t>
+      </w:r>
+      <w:proofErr w:type="spellStart"/>
+      <w:r>
+        <w:rPr>
+          <w:rFonts w:asciiTheme="minorHAnsi" w:eastAsiaTheme="minorHAnsi" w:hAnsiTheme="minorHAnsi" w:cstheme="minorBidi"/>
+          <w:color w:val="000000" w:themeColor="text1"/>
+          <w:kern w:val="2"/>
+          <w:sz w:val="22"/>
+          <w:szCs w:val="22"/>
+          <w14:ligatures w14:val="standardContextual"/>
+        </w:rPr>
+        <w:t>cloudformation</w:t>
+      </w:r>
+      <w:proofErr w:type="spellEnd"/>
+      <w:r>
+        <w:rPr>
+          <w:rFonts w:asciiTheme="minorHAnsi" w:eastAsiaTheme="minorHAnsi" w:hAnsiTheme="minorHAnsi" w:cstheme="minorBidi"/>
+          <w:color w:val="000000" w:themeColor="text1"/>
+          <w:kern w:val="2"/>
+          <w:sz w:val="22"/>
+          <w:szCs w:val="22"/>
+          <w14:ligatures w14:val="standardContextual"/>
+        </w:rPr>
+        <w:t xml:space="preserve"> infrastructure is defined</w:t>
+      </w:r>
+    </w:p>
+    <w:p>
+      <w:pPr>
+        <w:pStyle w:val="NormalWeb"/>
+        <w:numPr>
+          <w:ilvl w:val="0"/>
+          <w:numId w:val="15"/>
+        </w:numPr>
+        <w:rPr>
+          <w:rFonts w:asciiTheme="minorHAnsi" w:eastAsiaTheme="minorHAnsi" w:hAnsiTheme="minorHAnsi" w:cstheme="minorBidi"/>
+          <w:color w:val="000000" w:themeColor="text1"/>
+          <w:kern w:val="2"/>
+          <w:sz w:val="22"/>
+          <w:szCs w:val="22"/>
+          <w14:ligatures w14:val="standardContextual"/>
+        </w:rPr>
+      </w:pPr>
+      <w:proofErr w:type="spellStart"/>
+      <w:r>
+        <w:rPr>
+          <w:rFonts w:asciiTheme="minorHAnsi" w:eastAsiaTheme="minorHAnsi" w:hAnsiTheme="minorHAnsi" w:cstheme="minorBidi"/>
+          <w:color w:val="000000" w:themeColor="text1"/>
+          <w:kern w:val="2"/>
+          <w:sz w:val="22"/>
+          <w:szCs w:val="22"/>
+          <w14:ligatures w14:val="standardContextual"/>
+        </w:rPr>
+        <w:t>sam</w:t>
+      </w:r>
+      <w:proofErr w:type="spellEnd"/>
+      <w:r>
+        <w:rPr>
+          <w:rFonts w:asciiTheme="minorHAnsi" w:eastAsiaTheme="minorHAnsi" w:hAnsiTheme="minorHAnsi" w:cstheme="minorBidi"/>
+          <w:color w:val="000000" w:themeColor="text1"/>
+          <w:kern w:val="2"/>
+          <w:sz w:val="22"/>
+          <w:szCs w:val="22"/>
+          <w14:ligatures w14:val="standardContextual"/>
+        </w:rPr>
+        <w:t xml:space="preserve"> </w:t>
+      </w:r>
+      <w:proofErr w:type="spellStart"/>
+      <w:r>
+        <w:rPr>
+          <w:rFonts w:asciiTheme="minorHAnsi" w:eastAsiaTheme="minorHAnsi" w:hAnsiTheme="minorHAnsi" w:cstheme="minorBidi"/>
+          <w:color w:val="000000" w:themeColor="text1"/>
+          <w:kern w:val="2"/>
+          <w:sz w:val="22"/>
+          <w:szCs w:val="22"/>
+          <w14:ligatures w14:val="standardContextual"/>
+        </w:rPr>
+        <w:t>init</w:t>
+      </w:r>
+      <w:proofErr w:type="spellEnd"/>
+      <w:r>
+        <w:rPr>
+          <w:rFonts w:asciiTheme="minorHAnsi" w:eastAsiaTheme="minorHAnsi" w:hAnsiTheme="minorHAnsi" w:cstheme="minorBidi"/>
+          <w:color w:val="000000" w:themeColor="text1"/>
+          <w:kern w:val="2"/>
+          <w:sz w:val="22"/>
+          <w:szCs w:val="22"/>
+          <w14:ligatures w14:val="standardContextual"/>
+        </w:rPr>
+        <w:t xml:space="preserve"> → Create a new SAM project → Write/change your code + </w:t>
+      </w:r>
+      <w:proofErr w:type="spellStart"/>
+      <w:proofErr w:type="gramStart"/>
+      <w:r>
+        <w:rPr>
+          <w:rFonts w:asciiTheme="minorHAnsi" w:eastAsiaTheme="minorHAnsi" w:hAnsiTheme="minorHAnsi" w:cstheme="minorBidi"/>
+          <w:color w:val="000000" w:themeColor="text1"/>
+          <w:kern w:val="2"/>
+          <w:sz w:val="22"/>
+          <w:szCs w:val="22"/>
+          <w14:ligatures w14:val="standardContextual"/>
+        </w:rPr>
+        <w:t>template.yaml</w:t>
+      </w:r>
+      <w:proofErr w:type="spellEnd"/>
+      <w:proofErr w:type="gramEnd"/>
+      <w:r>
+        <w:rPr>
+          <w:rFonts w:asciiTheme="minorHAnsi" w:eastAsiaTheme="minorHAnsi" w:hAnsiTheme="minorHAnsi" w:cstheme="minorBidi"/>
+          <w:color w:val="000000" w:themeColor="text1"/>
+          <w:kern w:val="2"/>
+          <w:sz w:val="22"/>
+          <w:szCs w:val="22"/>
+          <w14:ligatures w14:val="standardContextual"/>
+        </w:rPr>
+        <w:t xml:space="preserve"> → </w:t>
+      </w:r>
+      <w:proofErr w:type="spellStart"/>
+      <w:r>
+        <w:rPr>
+          <w:rFonts w:asciiTheme="minorHAnsi" w:eastAsiaTheme="minorHAnsi" w:hAnsiTheme="minorHAnsi" w:cstheme="minorBidi"/>
+          <w:color w:val="000000" w:themeColor="text1"/>
+          <w:kern w:val="2"/>
+          <w:sz w:val="22"/>
+          <w:szCs w:val="22"/>
+          <w14:ligatures w14:val="standardContextual"/>
+        </w:rPr>
+        <w:t>sam</w:t>
+      </w:r>
+      <w:proofErr w:type="spellEnd"/>
+      <w:r>
+        <w:rPr>
+          <w:rFonts w:asciiTheme="minorHAnsi" w:eastAsiaTheme="minorHAnsi" w:hAnsiTheme="minorHAnsi" w:cstheme="minorBidi"/>
+          <w:color w:val="000000" w:themeColor="text1"/>
+          <w:kern w:val="2"/>
+          <w:sz w:val="22"/>
+          <w:szCs w:val="22"/>
+          <w14:ligatures w14:val="standardContextual"/>
+        </w:rPr>
+        <w:t xml:space="preserve"> build → Build/package the application → </w:t>
+      </w:r>
+      <w:proofErr w:type="spellStart"/>
+      <w:r>
+        <w:rPr>
+          <w:rFonts w:asciiTheme="minorHAnsi" w:eastAsiaTheme="minorHAnsi" w:hAnsiTheme="minorHAnsi" w:cstheme="minorBidi"/>
+          <w:color w:val="000000" w:themeColor="text1"/>
+          <w:kern w:val="2"/>
+          <w:sz w:val="22"/>
+          <w:szCs w:val="22"/>
+          <w14:ligatures w14:val="standardContextual"/>
+        </w:rPr>
+        <w:t>sam</w:t>
+      </w:r>
+      <w:proofErr w:type="spellEnd"/>
+      <w:r>
+        <w:rPr>
+          <w:rFonts w:asciiTheme="minorHAnsi" w:eastAsiaTheme="minorHAnsi" w:hAnsiTheme="minorHAnsi" w:cstheme="minorBidi"/>
+          <w:color w:val="000000" w:themeColor="text1"/>
+          <w:kern w:val="2"/>
+          <w:sz w:val="22"/>
+          <w:szCs w:val="22"/>
+          <w14:ligatures w14:val="standardContextual"/>
+        </w:rPr>
+        <w:t xml:space="preserve"> deploy → Deploy it to AWS</w:t>
       </w:r>
     </w:p>
     <w:p>
@@ -2228,9 +3994,8 @@
           <w:u w:val="single"/>
           <w14:ligatures w14:val="standardContextual"/>
         </w:rPr>
-        <w:t xml:space="preserve">SAM </w:t>
-      </w:r>
-      <w:proofErr w:type="spellStart"/>
+        <w:t>SAM build</w:t>
+      </w:r>
       <w:r>
         <w:rPr>
           <w:rFonts w:asciiTheme="minorHAnsi" w:eastAsiaTheme="minorHAnsi" w:hAnsiTheme="minorHAnsi" w:cstheme="minorBidi"/>
@@ -2241,9 +4006,242 @@
           <w:u w:val="single"/>
           <w14:ligatures w14:val="standardContextual"/>
         </w:rPr>
-        <w:t>init</w:t>
+        <w:t>:</w:t>
+      </w:r>
+    </w:p>
+    <w:p>
+      <w:pPr>
+        <w:pStyle w:val="NormalWeb"/>
+        <w:numPr>
+          <w:ilvl w:val="0"/>
+          <w:numId w:val="20"/>
+        </w:numPr>
+        <w:rPr>
+          <w:rFonts w:asciiTheme="minorHAnsi" w:eastAsiaTheme="minorHAnsi" w:hAnsiTheme="minorHAnsi" w:cstheme="minorBidi"/>
+          <w:color w:val="000000" w:themeColor="text1"/>
+          <w:kern w:val="2"/>
+          <w:sz w:val="22"/>
+          <w:szCs w:val="22"/>
+          <w14:ligatures w14:val="standardContextual"/>
+        </w:rPr>
+      </w:pPr>
+      <w:proofErr w:type="spellStart"/>
+      <w:r>
+        <w:rPr>
+          <w:rFonts w:asciiTheme="minorHAnsi" w:eastAsiaTheme="minorHAnsi" w:hAnsiTheme="minorHAnsi" w:cstheme="minorBidi"/>
+          <w:color w:val="000000" w:themeColor="text1"/>
+          <w:kern w:val="2"/>
+          <w:sz w:val="22"/>
+          <w:szCs w:val="22"/>
+          <w14:ligatures w14:val="standardContextual"/>
+        </w:rPr>
+        <w:t>sam</w:t>
       </w:r>
       <w:proofErr w:type="spellEnd"/>
+      <w:r>
+        <w:rPr>
+          <w:rFonts w:asciiTheme="minorHAnsi" w:eastAsiaTheme="minorHAnsi" w:hAnsiTheme="minorHAnsi" w:cstheme="minorBidi"/>
+          <w:color w:val="000000" w:themeColor="text1"/>
+          <w:kern w:val="2"/>
+          <w:sz w:val="22"/>
+          <w:szCs w:val="22"/>
+          <w14:ligatures w14:val="standardContextual"/>
+        </w:rPr>
+        <w:t xml:space="preserve"> build prepares your SAM application so it is ready to be deployed to AWS.</w:t>
+      </w:r>
+    </w:p>
+    <w:p>
+      <w:pPr>
+        <w:pStyle w:val="NormalWeb"/>
+        <w:numPr>
+          <w:ilvl w:val="0"/>
+          <w:numId w:val="20"/>
+        </w:numPr>
+        <w:rPr>
+          <w:rFonts w:asciiTheme="minorHAnsi" w:eastAsiaTheme="minorHAnsi" w:hAnsiTheme="minorHAnsi" w:cstheme="minorBidi"/>
+          <w:color w:val="000000" w:themeColor="text1"/>
+          <w:kern w:val="2"/>
+          <w:sz w:val="22"/>
+          <w:szCs w:val="22"/>
+          <w14:ligatures w14:val="standardContextual"/>
+        </w:rPr>
+      </w:pPr>
+      <w:proofErr w:type="spellStart"/>
+      <w:r>
+        <w:rPr>
+          <w:rFonts w:asciiTheme="minorHAnsi" w:eastAsiaTheme="minorHAnsi" w:hAnsiTheme="minorHAnsi" w:cstheme="minorBidi"/>
+          <w:color w:val="000000" w:themeColor="text1"/>
+          <w:kern w:val="2"/>
+          <w:sz w:val="22"/>
+          <w:szCs w:val="22"/>
+          <w14:ligatures w14:val="standardContextual"/>
+        </w:rPr>
+        <w:t>sam</w:t>
+      </w:r>
+      <w:proofErr w:type="spellEnd"/>
+      <w:r>
+        <w:rPr>
+          <w:rFonts w:asciiTheme="minorHAnsi" w:eastAsiaTheme="minorHAnsi" w:hAnsiTheme="minorHAnsi" w:cstheme="minorBidi"/>
+          <w:color w:val="000000" w:themeColor="text1"/>
+          <w:kern w:val="2"/>
+          <w:sz w:val="22"/>
+          <w:szCs w:val="22"/>
+          <w14:ligatures w14:val="standardContextual"/>
+        </w:rPr>
+        <w:t xml:space="preserve"> build applies to dev, staging, and production</w:t>
+      </w:r>
+    </w:p>
+    <w:p>
+      <w:pPr>
+        <w:pStyle w:val="pdq2pgselectionanchorcontainer"/>
+        <w:numPr>
+          <w:ilvl w:val="0"/>
+          <w:numId w:val="20"/>
+        </w:numPr>
+        <w:rPr>
+          <w:rFonts w:asciiTheme="minorHAnsi" w:eastAsiaTheme="minorHAnsi" w:hAnsiTheme="minorHAnsi" w:cstheme="minorBidi"/>
+          <w:color w:val="000000" w:themeColor="text1"/>
+          <w:kern w:val="2"/>
+          <w:sz w:val="22"/>
+          <w:szCs w:val="22"/>
+          <w14:ligatures w14:val="standardContextual"/>
+        </w:rPr>
+      </w:pPr>
+      <w:r>
+        <w:rPr>
+          <w:rFonts w:asciiTheme="minorHAnsi" w:eastAsiaTheme="minorHAnsi" w:hAnsiTheme="minorHAnsi" w:cstheme="minorBidi"/>
+          <w:color w:val="000000" w:themeColor="text1"/>
+          <w:kern w:val="2"/>
+          <w:sz w:val="22"/>
+          <w:szCs w:val="22"/>
+          <w14:ligatures w14:val="standardContextual"/>
+        </w:rPr>
+        <w:t xml:space="preserve">SAM looks at your </w:t>
+      </w:r>
+      <w:proofErr w:type="spellStart"/>
+      <w:proofErr w:type="gramStart"/>
+      <w:r>
+        <w:rPr>
+          <w:rFonts w:asciiTheme="minorHAnsi" w:eastAsiaTheme="minorHAnsi" w:hAnsiTheme="minorHAnsi" w:cstheme="minorBidi"/>
+          <w:color w:val="000000" w:themeColor="text1"/>
+          <w:kern w:val="2"/>
+          <w:sz w:val="22"/>
+          <w:szCs w:val="22"/>
+          <w14:ligatures w14:val="standardContextual"/>
+        </w:rPr>
+        <w:t>template.yaml</w:t>
+      </w:r>
+      <w:proofErr w:type="spellEnd"/>
+      <w:proofErr w:type="gramEnd"/>
+      <w:r>
+        <w:rPr>
+          <w:rFonts w:asciiTheme="minorHAnsi" w:eastAsiaTheme="minorHAnsi" w:hAnsiTheme="minorHAnsi" w:cstheme="minorBidi"/>
+          <w:color w:val="000000" w:themeColor="text1"/>
+          <w:kern w:val="2"/>
+          <w:sz w:val="22"/>
+          <w:szCs w:val="22"/>
+          <w14:ligatures w14:val="standardContextual"/>
+        </w:rPr>
+        <w:t xml:space="preserve"> and figures out:</w:t>
+      </w:r>
+      <w:r>
+        <w:rPr>
+          <w:rFonts w:asciiTheme="minorHAnsi" w:eastAsiaTheme="minorHAnsi" w:hAnsiTheme="minorHAnsi" w:cstheme="minorBidi"/>
+          <w:color w:val="000000" w:themeColor="text1"/>
+          <w:kern w:val="2"/>
+          <w:sz w:val="22"/>
+          <w:szCs w:val="22"/>
+          <w14:ligatures w14:val="standardContextual"/>
+        </w:rPr>
+        <w:t xml:space="preserve"> </w:t>
+      </w:r>
+      <w:r>
+        <w:rPr>
+          <w:rFonts w:asciiTheme="minorHAnsi" w:eastAsiaTheme="minorHAnsi" w:hAnsiTheme="minorHAnsi" w:cstheme="minorBidi"/>
+          <w:color w:val="000000" w:themeColor="text1"/>
+          <w:kern w:val="2"/>
+          <w:sz w:val="22"/>
+          <w:szCs w:val="22"/>
+          <w14:ligatures w14:val="standardContextual"/>
+        </w:rPr>
+        <w:t>"What Lambda functions and other serverless resources does this application have, and what do I need to package for them?"</w:t>
+      </w:r>
+    </w:p>
+    <w:p>
+      <w:pPr>
+        <w:pStyle w:val="HTMLPreformatted"/>
+        <w:numPr>
+          <w:ilvl w:val="0"/>
+          <w:numId w:val="20"/>
+        </w:numPr>
+        <w:rPr>
+          <w:rFonts w:asciiTheme="minorHAnsi" w:eastAsiaTheme="minorHAnsi" w:hAnsiTheme="minorHAnsi" w:cstheme="minorBidi"/>
+          <w:color w:val="000000" w:themeColor="text1"/>
+          <w:kern w:val="2"/>
+          <w:sz w:val="22"/>
+          <w:szCs w:val="22"/>
+          <w14:ligatures w14:val="standardContextual"/>
+        </w:rPr>
+      </w:pPr>
+      <w:proofErr w:type="spellStart"/>
+      <w:r>
+        <w:rPr>
+          <w:rFonts w:asciiTheme="minorHAnsi" w:eastAsiaTheme="minorHAnsi" w:hAnsiTheme="minorHAnsi" w:cstheme="minorBidi"/>
+          <w:color w:val="000000" w:themeColor="text1"/>
+          <w:kern w:val="2"/>
+          <w:sz w:val="22"/>
+          <w:szCs w:val="22"/>
+          <w14:ligatures w14:val="standardContextual"/>
+        </w:rPr>
+        <w:t>aws-sam</w:t>
+      </w:r>
+      <w:proofErr w:type="spellEnd"/>
+      <w:r>
+        <w:rPr>
+          <w:rFonts w:asciiTheme="minorHAnsi" w:eastAsiaTheme="minorHAnsi" w:hAnsiTheme="minorHAnsi" w:cstheme="minorBidi"/>
+          <w:color w:val="000000" w:themeColor="text1"/>
+          <w:kern w:val="2"/>
+          <w:sz w:val="22"/>
+          <w:szCs w:val="22"/>
+          <w14:ligatures w14:val="standardContextual"/>
+        </w:rPr>
+        <w:t>/build/</w:t>
+      </w:r>
+      <w:proofErr w:type="gramStart"/>
+      <w:r>
+        <w:rPr>
+          <w:rFonts w:asciiTheme="minorHAnsi" w:eastAsiaTheme="minorHAnsi" w:hAnsiTheme="minorHAnsi" w:cstheme="minorBidi"/>
+          <w:color w:val="000000" w:themeColor="text1"/>
+          <w:kern w:val="2"/>
+          <w:sz w:val="22"/>
+          <w:szCs w:val="22"/>
+          <w14:ligatures w14:val="standardContextual"/>
+        </w:rPr>
+        <w:t xml:space="preserve">:  </w:t>
+      </w:r>
+      <w:r>
+        <w:rPr>
+          <w:rFonts w:asciiTheme="minorHAnsi" w:eastAsiaTheme="minorHAnsi" w:hAnsiTheme="minorHAnsi" w:cstheme="minorBidi"/>
+          <w:color w:val="000000" w:themeColor="text1"/>
+          <w:kern w:val="2"/>
+          <w:sz w:val="22"/>
+          <w:szCs w:val="22"/>
+          <w14:ligatures w14:val="standardContextual"/>
+        </w:rPr>
+        <w:t>That's</w:t>
+      </w:r>
+      <w:proofErr w:type="gramEnd"/>
+      <w:r>
+        <w:rPr>
+          <w:rFonts w:asciiTheme="minorHAnsi" w:eastAsiaTheme="minorHAnsi" w:hAnsiTheme="minorHAnsi" w:cstheme="minorBidi"/>
+          <w:color w:val="000000" w:themeColor="text1"/>
+          <w:kern w:val="2"/>
+          <w:sz w:val="22"/>
+          <w:szCs w:val="22"/>
+          <w14:ligatures w14:val="standardContextual"/>
+        </w:rPr>
+        <w:t xml:space="preserve"> where SAM puts the </w:t>
+      </w:r>
       <w:r>
         <w:rPr>
           <w:rFonts w:asciiTheme="minorHAnsi" w:eastAsiaTheme="minorHAnsi" w:hAnsiTheme="minorHAnsi" w:cstheme="minorBidi"/>
@@ -2251,10 +4249,139 @@
           <w:bCs/>
           <w:color w:val="000000" w:themeColor="text1"/>
           <w:kern w:val="2"/>
-          <w:u w:val="single"/>
-          <w14:ligatures w14:val="standardContextual"/>
-        </w:rPr>
-        <w:t>:</w:t>
+          <w:sz w:val="22"/>
+          <w:szCs w:val="22"/>
+          <w14:ligatures w14:val="standardContextual"/>
+        </w:rPr>
+        <w:t>built/packaged version</w:t>
+      </w:r>
+      <w:r>
+        <w:rPr>
+          <w:rFonts w:asciiTheme="minorHAnsi" w:eastAsiaTheme="minorHAnsi" w:hAnsiTheme="minorHAnsi" w:cstheme="minorBidi"/>
+          <w:color w:val="000000" w:themeColor="text1"/>
+          <w:kern w:val="2"/>
+          <w:sz w:val="22"/>
+          <w:szCs w:val="22"/>
+          <w14:ligatures w14:val="standardContextual"/>
+        </w:rPr>
+        <w:t xml:space="preserve"> of your application.</w:t>
+      </w:r>
+    </w:p>
+    <w:p>
+      <w:pPr>
+        <w:pStyle w:val="NormalWeb"/>
+        <w:numPr>
+          <w:ilvl w:val="0"/>
+          <w:numId w:val="20"/>
+        </w:numPr>
+        <w:rPr>
+          <w:rFonts w:asciiTheme="minorHAnsi" w:eastAsiaTheme="minorHAnsi" w:hAnsiTheme="minorHAnsi" w:cstheme="minorBidi"/>
+          <w:color w:val="000000" w:themeColor="text1"/>
+          <w:kern w:val="2"/>
+          <w14:ligatures w14:val="standardContextual"/>
+        </w:rPr>
+      </w:pPr>
+      <w:proofErr w:type="spellStart"/>
+      <w:r>
+        <w:rPr>
+          <w:rFonts w:asciiTheme="minorHAnsi" w:eastAsiaTheme="minorHAnsi" w:hAnsiTheme="minorHAnsi" w:cstheme="minorBidi"/>
+          <w:color w:val="000000" w:themeColor="text1"/>
+          <w:kern w:val="2"/>
+          <w14:ligatures w14:val="standardContextual"/>
+        </w:rPr>
+        <w:t>sam</w:t>
+      </w:r>
+      <w:proofErr w:type="spellEnd"/>
+      <w:r>
+        <w:rPr>
+          <w:rFonts w:asciiTheme="minorHAnsi" w:eastAsiaTheme="minorHAnsi" w:hAnsiTheme="minorHAnsi" w:cstheme="minorBidi"/>
+          <w:color w:val="000000" w:themeColor="text1"/>
+          <w:kern w:val="2"/>
+          <w14:ligatures w14:val="standardContextual"/>
+        </w:rPr>
+        <w:t xml:space="preserve"> </w:t>
+      </w:r>
+      <w:proofErr w:type="spellStart"/>
+      <w:r>
+        <w:rPr>
+          <w:rFonts w:asciiTheme="minorHAnsi" w:eastAsiaTheme="minorHAnsi" w:hAnsiTheme="minorHAnsi" w:cstheme="minorBidi"/>
+          <w:color w:val="000000" w:themeColor="text1"/>
+          <w:kern w:val="2"/>
+          <w14:ligatures w14:val="standardContextual"/>
+        </w:rPr>
+        <w:t>init</w:t>
+      </w:r>
+      <w:proofErr w:type="spellEnd"/>
+      <w:r>
+        <w:rPr>
+          <w:rFonts w:asciiTheme="minorHAnsi" w:eastAsiaTheme="minorHAnsi" w:hAnsiTheme="minorHAnsi" w:cstheme="minorBidi"/>
+          <w:color w:val="000000" w:themeColor="text1"/>
+          <w:kern w:val="2"/>
+          <w14:ligatures w14:val="standardContextual"/>
+        </w:rPr>
+        <w:t xml:space="preserve"> → Create project locally → Write/change code + </w:t>
+      </w:r>
+      <w:proofErr w:type="spellStart"/>
+      <w:proofErr w:type="gramStart"/>
+      <w:r>
+        <w:rPr>
+          <w:rFonts w:asciiTheme="minorHAnsi" w:eastAsiaTheme="minorHAnsi" w:hAnsiTheme="minorHAnsi" w:cstheme="minorBidi"/>
+          <w:color w:val="000000" w:themeColor="text1"/>
+          <w:kern w:val="2"/>
+          <w14:ligatures w14:val="standardContextual"/>
+        </w:rPr>
+        <w:t>template.yaml</w:t>
+      </w:r>
+      <w:proofErr w:type="spellEnd"/>
+      <w:proofErr w:type="gramEnd"/>
+      <w:r>
+        <w:rPr>
+          <w:rFonts w:asciiTheme="minorHAnsi" w:eastAsiaTheme="minorHAnsi" w:hAnsiTheme="minorHAnsi" w:cstheme="minorBidi"/>
+          <w:color w:val="000000" w:themeColor="text1"/>
+          <w:kern w:val="2"/>
+          <w14:ligatures w14:val="standardContextual"/>
+        </w:rPr>
+        <w:t xml:space="preserve"> → </w:t>
+      </w:r>
+      <w:proofErr w:type="spellStart"/>
+      <w:r>
+        <w:rPr>
+          <w:rFonts w:asciiTheme="minorHAnsi" w:eastAsiaTheme="minorHAnsi" w:hAnsiTheme="minorHAnsi" w:cstheme="minorBidi"/>
+          <w:color w:val="000000" w:themeColor="text1"/>
+          <w:kern w:val="2"/>
+          <w14:ligatures w14:val="standardContextual"/>
+        </w:rPr>
+        <w:t>sam</w:t>
+      </w:r>
+      <w:proofErr w:type="spellEnd"/>
+      <w:r>
+        <w:rPr>
+          <w:rFonts w:asciiTheme="minorHAnsi" w:eastAsiaTheme="minorHAnsi" w:hAnsiTheme="minorHAnsi" w:cstheme="minorBidi"/>
+          <w:color w:val="000000" w:themeColor="text1"/>
+          <w:kern w:val="2"/>
+          <w14:ligatures w14:val="standardContextual"/>
+        </w:rPr>
+        <w:t xml:space="preserve"> build → Prepare application → </w:t>
+      </w:r>
+      <w:proofErr w:type="spellStart"/>
+      <w:r>
+        <w:rPr>
+          <w:rFonts w:asciiTheme="minorHAnsi" w:eastAsiaTheme="minorHAnsi" w:hAnsiTheme="minorHAnsi" w:cstheme="minorBidi"/>
+          <w:color w:val="000000" w:themeColor="text1"/>
+          <w:kern w:val="2"/>
+          <w14:ligatures w14:val="standardContextual"/>
+        </w:rPr>
+        <w:t>sam</w:t>
+      </w:r>
+      <w:proofErr w:type="spellEnd"/>
+      <w:r>
+        <w:rPr>
+          <w:rFonts w:asciiTheme="minorHAnsi" w:eastAsiaTheme="minorHAnsi" w:hAnsiTheme="minorHAnsi" w:cstheme="minorBidi"/>
+          <w:color w:val="000000" w:themeColor="text1"/>
+          <w:kern w:val="2"/>
+          <w14:ligatures w14:val="standardContextual"/>
+        </w:rPr>
+        <w:t xml:space="preserve"> deploy → AWS DEV environment</w:t>
       </w:r>
     </w:p>
     <w:p>
@@ -2281,7 +4408,7 @@
           <w:u w:val="single"/>
           <w14:ligatures w14:val="standardContextual"/>
         </w:rPr>
-        <w:t>SAM build</w:t>
+        <w:t>SAM package</w:t>
       </w:r>
       <w:r>
         <w:rPr>
@@ -2320,7 +4447,7 @@
           <w:u w:val="single"/>
           <w14:ligatures w14:val="standardContextual"/>
         </w:rPr>
-        <w:t>SAM package</w:t>
+        <w:t>SAM deploy</w:t>
       </w:r>
       <w:r>
         <w:rPr>
@@ -2359,7 +4486,7 @@
           <w:u w:val="single"/>
           <w14:ligatures w14:val="standardContextual"/>
         </w:rPr>
-        <w:t>SAM deploy</w:t>
+        <w:t>SAM local</w:t>
       </w:r>
       <w:r>
         <w:rPr>
@@ -2398,8 +4525,10 @@
           <w:u w:val="single"/>
           <w14:ligatures w14:val="standardContextual"/>
         </w:rPr>
-        <w:t>SAM local</w:t>
-      </w:r>
+        <w:lastRenderedPageBreak/>
+        <w:t xml:space="preserve">SAM </w:t>
+      </w:r>
+      <w:proofErr w:type="gramStart"/>
       <w:r>
         <w:rPr>
           <w:rFonts w:asciiTheme="minorHAnsi" w:eastAsiaTheme="minorHAnsi" w:hAnsiTheme="minorHAnsi" w:cstheme="minorBidi"/>
@@ -2410,7 +4539,20 @@
           <w:u w:val="single"/>
           <w14:ligatures w14:val="standardContextual"/>
         </w:rPr>
-        <w:t>:</w:t>
+        <w:t>local</w:t>
+      </w:r>
+      <w:proofErr w:type="gramEnd"/>
+      <w:r>
+        <w:rPr>
+          <w:rFonts w:asciiTheme="minorHAnsi" w:eastAsiaTheme="minorHAnsi" w:hAnsiTheme="minorHAnsi" w:cstheme="minorBidi"/>
+          <w:b/>
+          <w:bCs/>
+          <w:color w:val="000000" w:themeColor="text1"/>
+          <w:kern w:val="2"/>
+          <w:u w:val="single"/>
+          <w14:ligatures w14:val="standardContextual"/>
+        </w:rPr>
+        <w:t xml:space="preserve"> generate Events</w:t>
       </w:r>
     </w:p>
     <w:p>
@@ -2437,8 +4579,22 @@
           <w:u w:val="single"/>
           <w14:ligatures w14:val="standardContextual"/>
         </w:rPr>
-        <w:t>SAM local generate Events</w:t>
-      </w:r>
+        <w:t>SAM local start-</w:t>
+      </w:r>
+      <w:proofErr w:type="spellStart"/>
+      <w:r>
+        <w:rPr>
+          <w:rFonts w:asciiTheme="minorHAnsi" w:eastAsiaTheme="minorHAnsi" w:hAnsiTheme="minorHAnsi" w:cstheme="minorBidi"/>
+          <w:b/>
+          <w:bCs/>
+          <w:color w:val="000000" w:themeColor="text1"/>
+          <w:kern w:val="2"/>
+          <w:u w:val="single"/>
+          <w14:ligatures w14:val="standardContextual"/>
+        </w:rPr>
+        <w:t>api</w:t>
+      </w:r>
+      <w:proofErr w:type="spellEnd"/>
     </w:p>
     <w:p>
       <w:pPr>
@@ -2464,10 +4620,13 @@
           <w:u w:val="single"/>
           <w14:ligatures w14:val="standardContextual"/>
         </w:rPr>
-        <w:t>SAM local start-</w:t>
-      </w:r>
-      <w:proofErr w:type="spellStart"/>
-      <w:r>
+        <w:t>SAM local start-lambda</w:t>
+      </w:r>
+    </w:p>
+    <w:p>
+      <w:pPr>
+        <w:pStyle w:val="NormalWeb"/>
+        <w:ind w:left="360"/>
         <w:rPr>
           <w:rFonts w:asciiTheme="minorHAnsi" w:eastAsiaTheme="minorHAnsi" w:hAnsiTheme="minorHAnsi" w:cstheme="minorBidi"/>
           <w:b/>
@@ -2477,14 +4636,8 @@
           <w:u w:val="single"/>
           <w14:ligatures w14:val="standardContextual"/>
         </w:rPr>
-        <w:t>api</w:t>
-      </w:r>
-      <w:proofErr w:type="spellEnd"/>
-    </w:p>
-    <w:p>
-      <w:pPr>
-        <w:pStyle w:val="NormalWeb"/>
-        <w:ind w:left="360"/>
+      </w:pPr>
+      <w:r>
         <w:rPr>
           <w:rFonts w:asciiTheme="minorHAnsi" w:eastAsiaTheme="minorHAnsi" w:hAnsiTheme="minorHAnsi" w:cstheme="minorBidi"/>
           <w:b/>
@@ -2494,7 +4647,9 @@
           <w:u w:val="single"/>
           <w14:ligatures w14:val="standardContextual"/>
         </w:rPr>
-      </w:pPr>
+        <w:t xml:space="preserve">SAM </w:t>
+      </w:r>
+      <w:proofErr w:type="gramStart"/>
       <w:r>
         <w:rPr>
           <w:rFonts w:asciiTheme="minorHAnsi" w:eastAsiaTheme="minorHAnsi" w:hAnsiTheme="minorHAnsi" w:cstheme="minorBidi"/>
@@ -2505,13 +4660,10 @@
           <w:u w:val="single"/>
           <w14:ligatures w14:val="standardContextual"/>
         </w:rPr>
-        <w:t>SAM local start-lambda</w:t>
-      </w:r>
-    </w:p>
-    <w:p>
-      <w:pPr>
-        <w:pStyle w:val="NormalWeb"/>
-        <w:ind w:left="360"/>
+        <w:t>local</w:t>
+      </w:r>
+      <w:proofErr w:type="gramEnd"/>
+      <w:r>
         <w:rPr>
           <w:rFonts w:asciiTheme="minorHAnsi" w:eastAsiaTheme="minorHAnsi" w:hAnsiTheme="minorHAnsi" w:cstheme="minorBidi"/>
           <w:b/>
@@ -2521,18 +4673,7 @@
           <w:u w:val="single"/>
           <w14:ligatures w14:val="standardContextual"/>
         </w:rPr>
-      </w:pPr>
-      <w:r>
-        <w:rPr>
-          <w:rFonts w:asciiTheme="minorHAnsi" w:eastAsiaTheme="minorHAnsi" w:hAnsiTheme="minorHAnsi" w:cstheme="minorBidi"/>
-          <w:b/>
-          <w:bCs/>
-          <w:color w:val="000000" w:themeColor="text1"/>
-          <w:kern w:val="2"/>
-          <w:u w:val="single"/>
-          <w14:ligatures w14:val="standardContextual"/>
-        </w:rPr>
-        <w:t>SAM local invoke-lambda</w:t>
+        <w:t xml:space="preserve"> invoke-lambda</w:t>
       </w:r>
     </w:p>
     <w:p>
@@ -2852,6 +4993,232 @@
     </w:lvl>
   </w:abstractNum>
   <w:abstractNum w:abstractNumId="2" w15:restartNumberingAfterBreak="0">
+    <w:nsid w:val="1A8C3251"/>
+    <w:multiLevelType w:val="hybridMultilevel"/>
+    <w:tmpl w:val="FA9CB710"/>
+    <w:lvl w:ilvl="0" w:tplc="04090001">
+      <w:start w:val="1"/>
+      <w:numFmt w:val="bullet"/>
+      <w:lvlText w:val=""/>
+      <w:lvlJc w:val="left"/>
+      <w:pPr>
+        <w:ind w:left="1080" w:hanging="360"/>
+      </w:pPr>
+      <w:rPr>
+        <w:rFonts w:ascii="Symbol" w:hAnsi="Symbol" w:hint="default"/>
+      </w:rPr>
+    </w:lvl>
+    <w:lvl w:ilvl="1" w:tplc="04090003" w:tentative="1">
+      <w:start w:val="1"/>
+      <w:numFmt w:val="bullet"/>
+      <w:lvlText w:val="o"/>
+      <w:lvlJc w:val="left"/>
+      <w:pPr>
+        <w:ind w:left="1800" w:hanging="360"/>
+      </w:pPr>
+      <w:rPr>
+        <w:rFonts w:ascii="Courier New" w:hAnsi="Courier New" w:cs="Courier New" w:hint="default"/>
+      </w:rPr>
+    </w:lvl>
+    <w:lvl w:ilvl="2" w:tplc="04090005" w:tentative="1">
+      <w:start w:val="1"/>
+      <w:numFmt w:val="bullet"/>
+      <w:lvlText w:val=""/>
+      <w:lvlJc w:val="left"/>
+      <w:pPr>
+        <w:ind w:left="2520" w:hanging="360"/>
+      </w:pPr>
+      <w:rPr>
+        <w:rFonts w:ascii="Wingdings" w:hAnsi="Wingdings" w:hint="default"/>
+      </w:rPr>
+    </w:lvl>
+    <w:lvl w:ilvl="3" w:tplc="04090001" w:tentative="1">
+      <w:start w:val="1"/>
+      <w:numFmt w:val="bullet"/>
+      <w:lvlText w:val=""/>
+      <w:lvlJc w:val="left"/>
+      <w:pPr>
+        <w:ind w:left="3240" w:hanging="360"/>
+      </w:pPr>
+      <w:rPr>
+        <w:rFonts w:ascii="Symbol" w:hAnsi="Symbol" w:hint="default"/>
+      </w:rPr>
+    </w:lvl>
+    <w:lvl w:ilvl="4" w:tplc="04090003" w:tentative="1">
+      <w:start w:val="1"/>
+      <w:numFmt w:val="bullet"/>
+      <w:lvlText w:val="o"/>
+      <w:lvlJc w:val="left"/>
+      <w:pPr>
+        <w:ind w:left="3960" w:hanging="360"/>
+      </w:pPr>
+      <w:rPr>
+        <w:rFonts w:ascii="Courier New" w:hAnsi="Courier New" w:cs="Courier New" w:hint="default"/>
+      </w:rPr>
+    </w:lvl>
+    <w:lvl w:ilvl="5" w:tplc="04090005" w:tentative="1">
+      <w:start w:val="1"/>
+      <w:numFmt w:val="bullet"/>
+      <w:lvlText w:val=""/>
+      <w:lvlJc w:val="left"/>
+      <w:pPr>
+        <w:ind w:left="4680" w:hanging="360"/>
+      </w:pPr>
+      <w:rPr>
+        <w:rFonts w:ascii="Wingdings" w:hAnsi="Wingdings" w:hint="default"/>
+      </w:rPr>
+    </w:lvl>
+    <w:lvl w:ilvl="6" w:tplc="04090001" w:tentative="1">
+      <w:start w:val="1"/>
+      <w:numFmt w:val="bullet"/>
+      <w:lvlText w:val=""/>
+      <w:lvlJc w:val="left"/>
+      <w:pPr>
+        <w:ind w:left="5400" w:hanging="360"/>
+      </w:pPr>
+      <w:rPr>
+        <w:rFonts w:ascii="Symbol" w:hAnsi="Symbol" w:hint="default"/>
+      </w:rPr>
+    </w:lvl>
+    <w:lvl w:ilvl="7" w:tplc="04090003" w:tentative="1">
+      <w:start w:val="1"/>
+      <w:numFmt w:val="bullet"/>
+      <w:lvlText w:val="o"/>
+      <w:lvlJc w:val="left"/>
+      <w:pPr>
+        <w:ind w:left="6120" w:hanging="360"/>
+      </w:pPr>
+      <w:rPr>
+        <w:rFonts w:ascii="Courier New" w:hAnsi="Courier New" w:cs="Courier New" w:hint="default"/>
+      </w:rPr>
+    </w:lvl>
+    <w:lvl w:ilvl="8" w:tplc="04090005" w:tentative="1">
+      <w:start w:val="1"/>
+      <w:numFmt w:val="bullet"/>
+      <w:lvlText w:val=""/>
+      <w:lvlJc w:val="left"/>
+      <w:pPr>
+        <w:ind w:left="6840" w:hanging="360"/>
+      </w:pPr>
+      <w:rPr>
+        <w:rFonts w:ascii="Wingdings" w:hAnsi="Wingdings" w:hint="default"/>
+      </w:rPr>
+    </w:lvl>
+  </w:abstractNum>
+  <w:abstractNum w:abstractNumId="3" w15:restartNumberingAfterBreak="0">
+    <w:nsid w:val="27E77FE5"/>
+    <w:multiLevelType w:val="hybridMultilevel"/>
+    <w:tmpl w:val="834EBD0E"/>
+    <w:lvl w:ilvl="0" w:tplc="04090001">
+      <w:start w:val="1"/>
+      <w:numFmt w:val="bullet"/>
+      <w:lvlText w:val=""/>
+      <w:lvlJc w:val="left"/>
+      <w:pPr>
+        <w:ind w:left="1080" w:hanging="360"/>
+      </w:pPr>
+      <w:rPr>
+        <w:rFonts w:ascii="Symbol" w:hAnsi="Symbol" w:hint="default"/>
+      </w:rPr>
+    </w:lvl>
+    <w:lvl w:ilvl="1" w:tplc="04090003" w:tentative="1">
+      <w:start w:val="1"/>
+      <w:numFmt w:val="bullet"/>
+      <w:lvlText w:val="o"/>
+      <w:lvlJc w:val="left"/>
+      <w:pPr>
+        <w:ind w:left="1800" w:hanging="360"/>
+      </w:pPr>
+      <w:rPr>
+        <w:rFonts w:ascii="Courier New" w:hAnsi="Courier New" w:cs="Courier New" w:hint="default"/>
+      </w:rPr>
+    </w:lvl>
+    <w:lvl w:ilvl="2" w:tplc="04090005" w:tentative="1">
+      <w:start w:val="1"/>
+      <w:numFmt w:val="bullet"/>
+      <w:lvlText w:val=""/>
+      <w:lvlJc w:val="left"/>
+      <w:pPr>
+        <w:ind w:left="2520" w:hanging="360"/>
+      </w:pPr>
+      <w:rPr>
+        <w:rFonts w:ascii="Wingdings" w:hAnsi="Wingdings" w:hint="default"/>
+      </w:rPr>
+    </w:lvl>
+    <w:lvl w:ilvl="3" w:tplc="04090001" w:tentative="1">
+      <w:start w:val="1"/>
+      <w:numFmt w:val="bullet"/>
+      <w:lvlText w:val=""/>
+      <w:lvlJc w:val="left"/>
+      <w:pPr>
+        <w:ind w:left="3240" w:hanging="360"/>
+      </w:pPr>
+      <w:rPr>
+        <w:rFonts w:ascii="Symbol" w:hAnsi="Symbol" w:hint="default"/>
+      </w:rPr>
+    </w:lvl>
+    <w:lvl w:ilvl="4" w:tplc="04090003" w:tentative="1">
+      <w:start w:val="1"/>
+      <w:numFmt w:val="bullet"/>
+      <w:lvlText w:val="o"/>
+      <w:lvlJc w:val="left"/>
+      <w:pPr>
+        <w:ind w:left="3960" w:hanging="360"/>
+      </w:pPr>
+      <w:rPr>
+        <w:rFonts w:ascii="Courier New" w:hAnsi="Courier New" w:cs="Courier New" w:hint="default"/>
+      </w:rPr>
+    </w:lvl>
+    <w:lvl w:ilvl="5" w:tplc="04090005" w:tentative="1">
+      <w:start w:val="1"/>
+      <w:numFmt w:val="bullet"/>
+      <w:lvlText w:val=""/>
+      <w:lvlJc w:val="left"/>
+      <w:pPr>
+        <w:ind w:left="4680" w:hanging="360"/>
+      </w:pPr>
+      <w:rPr>
+        <w:rFonts w:ascii="Wingdings" w:hAnsi="Wingdings" w:hint="default"/>
+      </w:rPr>
+    </w:lvl>
+    <w:lvl w:ilvl="6" w:tplc="04090001" w:tentative="1">
+      <w:start w:val="1"/>
+      <w:numFmt w:val="bullet"/>
+      <w:lvlText w:val=""/>
+      <w:lvlJc w:val="left"/>
+      <w:pPr>
+        <w:ind w:left="5400" w:hanging="360"/>
+      </w:pPr>
+      <w:rPr>
+        <w:rFonts w:ascii="Symbol" w:hAnsi="Symbol" w:hint="default"/>
+      </w:rPr>
+    </w:lvl>
+    <w:lvl w:ilvl="7" w:tplc="04090003" w:tentative="1">
+      <w:start w:val="1"/>
+      <w:numFmt w:val="bullet"/>
+      <w:lvlText w:val="o"/>
+      <w:lvlJc w:val="left"/>
+      <w:pPr>
+        <w:ind w:left="6120" w:hanging="360"/>
+      </w:pPr>
+      <w:rPr>
+        <w:rFonts w:ascii="Courier New" w:hAnsi="Courier New" w:cs="Courier New" w:hint="default"/>
+      </w:rPr>
+    </w:lvl>
+    <w:lvl w:ilvl="8" w:tplc="04090005" w:tentative="1">
+      <w:start w:val="1"/>
+      <w:numFmt w:val="bullet"/>
+      <w:lvlText w:val=""/>
+      <w:lvlJc w:val="left"/>
+      <w:pPr>
+        <w:ind w:left="6840" w:hanging="360"/>
+      </w:pPr>
+      <w:rPr>
+        <w:rFonts w:ascii="Wingdings" w:hAnsi="Wingdings" w:hint="default"/>
+      </w:rPr>
+    </w:lvl>
+  </w:abstractNum>
+  <w:abstractNum w:abstractNumId="4" w15:restartNumberingAfterBreak="0">
     <w:nsid w:val="2ADD0BC0"/>
     <w:multiLevelType w:val="hybridMultilevel"/>
     <w:tmpl w:val="DF08CDB2"/>
@@ -2964,7 +5331,7 @@
       </w:rPr>
     </w:lvl>
   </w:abstractNum>
-  <w:abstractNum w:abstractNumId="3" w15:restartNumberingAfterBreak="0">
+  <w:abstractNum w:abstractNumId="5" w15:restartNumberingAfterBreak="0">
     <w:nsid w:val="2C61381D"/>
     <w:multiLevelType w:val="hybridMultilevel"/>
     <w:tmpl w:val="D4A6A160"/>
@@ -3077,7 +5444,346 @@
       </w:rPr>
     </w:lvl>
   </w:abstractNum>
-  <w:abstractNum w:abstractNumId="4" w15:restartNumberingAfterBreak="0">
+  <w:abstractNum w:abstractNumId="6" w15:restartNumberingAfterBreak="0">
+    <w:nsid w:val="30F558FB"/>
+    <w:multiLevelType w:val="hybridMultilevel"/>
+    <w:tmpl w:val="0130CB3A"/>
+    <w:lvl w:ilvl="0" w:tplc="04090003">
+      <w:start w:val="1"/>
+      <w:numFmt w:val="bullet"/>
+      <w:lvlText w:val="o"/>
+      <w:lvlJc w:val="left"/>
+      <w:pPr>
+        <w:ind w:left="1080" w:hanging="360"/>
+      </w:pPr>
+      <w:rPr>
+        <w:rFonts w:ascii="Courier New" w:hAnsi="Courier New" w:cs="Courier New" w:hint="default"/>
+      </w:rPr>
+    </w:lvl>
+    <w:lvl w:ilvl="1" w:tplc="04090003" w:tentative="1">
+      <w:start w:val="1"/>
+      <w:numFmt w:val="bullet"/>
+      <w:lvlText w:val="o"/>
+      <w:lvlJc w:val="left"/>
+      <w:pPr>
+        <w:ind w:left="1800" w:hanging="360"/>
+      </w:pPr>
+      <w:rPr>
+        <w:rFonts w:ascii="Courier New" w:hAnsi="Courier New" w:cs="Courier New" w:hint="default"/>
+      </w:rPr>
+    </w:lvl>
+    <w:lvl w:ilvl="2" w:tplc="04090005" w:tentative="1">
+      <w:start w:val="1"/>
+      <w:numFmt w:val="bullet"/>
+      <w:lvlText w:val=""/>
+      <w:lvlJc w:val="left"/>
+      <w:pPr>
+        <w:ind w:left="2520" w:hanging="360"/>
+      </w:pPr>
+      <w:rPr>
+        <w:rFonts w:ascii="Wingdings" w:hAnsi="Wingdings" w:hint="default"/>
+      </w:rPr>
+    </w:lvl>
+    <w:lvl w:ilvl="3" w:tplc="04090001" w:tentative="1">
+      <w:start w:val="1"/>
+      <w:numFmt w:val="bullet"/>
+      <w:lvlText w:val=""/>
+      <w:lvlJc w:val="left"/>
+      <w:pPr>
+        <w:ind w:left="3240" w:hanging="360"/>
+      </w:pPr>
+      <w:rPr>
+        <w:rFonts w:ascii="Symbol" w:hAnsi="Symbol" w:hint="default"/>
+      </w:rPr>
+    </w:lvl>
+    <w:lvl w:ilvl="4" w:tplc="04090003" w:tentative="1">
+      <w:start w:val="1"/>
+      <w:numFmt w:val="bullet"/>
+      <w:lvlText w:val="o"/>
+      <w:lvlJc w:val="left"/>
+      <w:pPr>
+        <w:ind w:left="3960" w:hanging="360"/>
+      </w:pPr>
+      <w:rPr>
+        <w:rFonts w:ascii="Courier New" w:hAnsi="Courier New" w:cs="Courier New" w:hint="default"/>
+      </w:rPr>
+    </w:lvl>
+    <w:lvl w:ilvl="5" w:tplc="04090005" w:tentative="1">
+      <w:start w:val="1"/>
+      <w:numFmt w:val="bullet"/>
+      <w:lvlText w:val=""/>
+      <w:lvlJc w:val="left"/>
+      <w:pPr>
+        <w:ind w:left="4680" w:hanging="360"/>
+      </w:pPr>
+      <w:rPr>
+        <w:rFonts w:ascii="Wingdings" w:hAnsi="Wingdings" w:hint="default"/>
+      </w:rPr>
+    </w:lvl>
+    <w:lvl w:ilvl="6" w:tplc="04090001" w:tentative="1">
+      <w:start w:val="1"/>
+      <w:numFmt w:val="bullet"/>
+      <w:lvlText w:val=""/>
+      <w:lvlJc w:val="left"/>
+      <w:pPr>
+        <w:ind w:left="5400" w:hanging="360"/>
+      </w:pPr>
+      <w:rPr>
+        <w:rFonts w:ascii="Symbol" w:hAnsi="Symbol" w:hint="default"/>
+      </w:rPr>
+    </w:lvl>
+    <w:lvl w:ilvl="7" w:tplc="04090003" w:tentative="1">
+      <w:start w:val="1"/>
+      <w:numFmt w:val="bullet"/>
+      <w:lvlText w:val="o"/>
+      <w:lvlJc w:val="left"/>
+      <w:pPr>
+        <w:ind w:left="6120" w:hanging="360"/>
+      </w:pPr>
+      <w:rPr>
+        <w:rFonts w:ascii="Courier New" w:hAnsi="Courier New" w:cs="Courier New" w:hint="default"/>
+      </w:rPr>
+    </w:lvl>
+    <w:lvl w:ilvl="8" w:tplc="04090005" w:tentative="1">
+      <w:start w:val="1"/>
+      <w:numFmt w:val="bullet"/>
+      <w:lvlText w:val=""/>
+      <w:lvlJc w:val="left"/>
+      <w:pPr>
+        <w:ind w:left="6840" w:hanging="360"/>
+      </w:pPr>
+      <w:rPr>
+        <w:rFonts w:ascii="Wingdings" w:hAnsi="Wingdings" w:hint="default"/>
+      </w:rPr>
+    </w:lvl>
+  </w:abstractNum>
+  <w:abstractNum w:abstractNumId="7" w15:restartNumberingAfterBreak="0">
+    <w:nsid w:val="462C3A11"/>
+    <w:multiLevelType w:val="hybridMultilevel"/>
+    <w:tmpl w:val="DBC81914"/>
+    <w:lvl w:ilvl="0" w:tplc="04090003">
+      <w:start w:val="1"/>
+      <w:numFmt w:val="bullet"/>
+      <w:lvlText w:val="o"/>
+      <w:lvlJc w:val="left"/>
+      <w:pPr>
+        <w:ind w:left="1080" w:hanging="360"/>
+      </w:pPr>
+      <w:rPr>
+        <w:rFonts w:ascii="Courier New" w:hAnsi="Courier New" w:cs="Courier New" w:hint="default"/>
+      </w:rPr>
+    </w:lvl>
+    <w:lvl w:ilvl="1" w:tplc="04090003" w:tentative="1">
+      <w:start w:val="1"/>
+      <w:numFmt w:val="bullet"/>
+      <w:lvlText w:val="o"/>
+      <w:lvlJc w:val="left"/>
+      <w:pPr>
+        <w:ind w:left="1800" w:hanging="360"/>
+      </w:pPr>
+      <w:rPr>
+        <w:rFonts w:ascii="Courier New" w:hAnsi="Courier New" w:cs="Courier New" w:hint="default"/>
+      </w:rPr>
+    </w:lvl>
+    <w:lvl w:ilvl="2" w:tplc="04090005" w:tentative="1">
+      <w:start w:val="1"/>
+      <w:numFmt w:val="bullet"/>
+      <w:lvlText w:val=""/>
+      <w:lvlJc w:val="left"/>
+      <w:pPr>
+        <w:ind w:left="2520" w:hanging="360"/>
+      </w:pPr>
+      <w:rPr>
+        <w:rFonts w:ascii="Wingdings" w:hAnsi="Wingdings" w:hint="default"/>
+      </w:rPr>
+    </w:lvl>
+    <w:lvl w:ilvl="3" w:tplc="04090001" w:tentative="1">
+      <w:start w:val="1"/>
+      <w:numFmt w:val="bullet"/>
+      <w:lvlText w:val=""/>
+      <w:lvlJc w:val="left"/>
+      <w:pPr>
+        <w:ind w:left="3240" w:hanging="360"/>
+      </w:pPr>
+      <w:rPr>
+        <w:rFonts w:ascii="Symbol" w:hAnsi="Symbol" w:hint="default"/>
+      </w:rPr>
+    </w:lvl>
+    <w:lvl w:ilvl="4" w:tplc="04090003" w:tentative="1">
+      <w:start w:val="1"/>
+      <w:numFmt w:val="bullet"/>
+      <w:lvlText w:val="o"/>
+      <w:lvlJc w:val="left"/>
+      <w:pPr>
+        <w:ind w:left="3960" w:hanging="360"/>
+      </w:pPr>
+      <w:rPr>
+        <w:rFonts w:ascii="Courier New" w:hAnsi="Courier New" w:cs="Courier New" w:hint="default"/>
+      </w:rPr>
+    </w:lvl>
+    <w:lvl w:ilvl="5" w:tplc="04090005" w:tentative="1">
+      <w:start w:val="1"/>
+      <w:numFmt w:val="bullet"/>
+      <w:lvlText w:val=""/>
+      <w:lvlJc w:val="left"/>
+      <w:pPr>
+        <w:ind w:left="4680" w:hanging="360"/>
+      </w:pPr>
+      <w:rPr>
+        <w:rFonts w:ascii="Wingdings" w:hAnsi="Wingdings" w:hint="default"/>
+      </w:rPr>
+    </w:lvl>
+    <w:lvl w:ilvl="6" w:tplc="04090001" w:tentative="1">
+      <w:start w:val="1"/>
+      <w:numFmt w:val="bullet"/>
+      <w:lvlText w:val=""/>
+      <w:lvlJc w:val="left"/>
+      <w:pPr>
+        <w:ind w:left="5400" w:hanging="360"/>
+      </w:pPr>
+      <w:rPr>
+        <w:rFonts w:ascii="Symbol" w:hAnsi="Symbol" w:hint="default"/>
+      </w:rPr>
+    </w:lvl>
+    <w:lvl w:ilvl="7" w:tplc="04090003" w:tentative="1">
+      <w:start w:val="1"/>
+      <w:numFmt w:val="bullet"/>
+      <w:lvlText w:val="o"/>
+      <w:lvlJc w:val="left"/>
+      <w:pPr>
+        <w:ind w:left="6120" w:hanging="360"/>
+      </w:pPr>
+      <w:rPr>
+        <w:rFonts w:ascii="Courier New" w:hAnsi="Courier New" w:cs="Courier New" w:hint="default"/>
+      </w:rPr>
+    </w:lvl>
+    <w:lvl w:ilvl="8" w:tplc="04090005" w:tentative="1">
+      <w:start w:val="1"/>
+      <w:numFmt w:val="bullet"/>
+      <w:lvlText w:val=""/>
+      <w:lvlJc w:val="left"/>
+      <w:pPr>
+        <w:ind w:left="6840" w:hanging="360"/>
+      </w:pPr>
+      <w:rPr>
+        <w:rFonts w:ascii="Wingdings" w:hAnsi="Wingdings" w:hint="default"/>
+      </w:rPr>
+    </w:lvl>
+  </w:abstractNum>
+  <w:abstractNum w:abstractNumId="8" w15:restartNumberingAfterBreak="0">
+    <w:nsid w:val="47095ACD"/>
+    <w:multiLevelType w:val="hybridMultilevel"/>
+    <w:tmpl w:val="35ECE6BE"/>
+    <w:lvl w:ilvl="0" w:tplc="04090001">
+      <w:start w:val="1"/>
+      <w:numFmt w:val="bullet"/>
+      <w:lvlText w:val=""/>
+      <w:lvlJc w:val="left"/>
+      <w:pPr>
+        <w:ind w:left="1080" w:hanging="360"/>
+      </w:pPr>
+      <w:rPr>
+        <w:rFonts w:ascii="Symbol" w:hAnsi="Symbol" w:hint="default"/>
+      </w:rPr>
+    </w:lvl>
+    <w:lvl w:ilvl="1" w:tplc="04090003">
+      <w:start w:val="1"/>
+      <w:numFmt w:val="bullet"/>
+      <w:lvlText w:val="o"/>
+      <w:lvlJc w:val="left"/>
+      <w:pPr>
+        <w:ind w:left="1800" w:hanging="360"/>
+      </w:pPr>
+      <w:rPr>
+        <w:rFonts w:ascii="Courier New" w:hAnsi="Courier New" w:cs="Courier New" w:hint="default"/>
+      </w:rPr>
+    </w:lvl>
+    <w:lvl w:ilvl="2" w:tplc="04090005" w:tentative="1">
+      <w:start w:val="1"/>
+      <w:numFmt w:val="bullet"/>
+      <w:lvlText w:val=""/>
+      <w:lvlJc w:val="left"/>
+      <w:pPr>
+        <w:ind w:left="2520" w:hanging="360"/>
+      </w:pPr>
+      <w:rPr>
+        <w:rFonts w:ascii="Wingdings" w:hAnsi="Wingdings" w:hint="default"/>
+      </w:rPr>
+    </w:lvl>
+    <w:lvl w:ilvl="3" w:tplc="04090001" w:tentative="1">
+      <w:start w:val="1"/>
+      <w:numFmt w:val="bullet"/>
+      <w:lvlText w:val=""/>
+      <w:lvlJc w:val="left"/>
+      <w:pPr>
+        <w:ind w:left="3240" w:hanging="360"/>
+      </w:pPr>
+      <w:rPr>
+        <w:rFonts w:ascii="Symbol" w:hAnsi="Symbol" w:hint="default"/>
+      </w:rPr>
+    </w:lvl>
+    <w:lvl w:ilvl="4" w:tplc="04090003" w:tentative="1">
+      <w:start w:val="1"/>
+      <w:numFmt w:val="bullet"/>
+      <w:lvlText w:val="o"/>
+      <w:lvlJc w:val="left"/>
+      <w:pPr>
+        <w:ind w:left="3960" w:hanging="360"/>
+      </w:pPr>
+      <w:rPr>
+        <w:rFonts w:ascii="Courier New" w:hAnsi="Courier New" w:cs="Courier New" w:hint="default"/>
+      </w:rPr>
+    </w:lvl>
+    <w:lvl w:ilvl="5" w:tplc="04090005" w:tentative="1">
+      <w:start w:val="1"/>
+      <w:numFmt w:val="bullet"/>
+      <w:lvlText w:val=""/>
+      <w:lvlJc w:val="left"/>
+      <w:pPr>
+        <w:ind w:left="4680" w:hanging="360"/>
+      </w:pPr>
+      <w:rPr>
+        <w:rFonts w:ascii="Wingdings" w:hAnsi="Wingdings" w:hint="default"/>
+      </w:rPr>
+    </w:lvl>
+    <w:lvl w:ilvl="6" w:tplc="04090001" w:tentative="1">
+      <w:start w:val="1"/>
+      <w:numFmt w:val="bullet"/>
+      <w:lvlText w:val=""/>
+      <w:lvlJc w:val="left"/>
+      <w:pPr>
+        <w:ind w:left="5400" w:hanging="360"/>
+      </w:pPr>
+      <w:rPr>
+        <w:rFonts w:ascii="Symbol" w:hAnsi="Symbol" w:hint="default"/>
+      </w:rPr>
+    </w:lvl>
+    <w:lvl w:ilvl="7" w:tplc="04090003" w:tentative="1">
+      <w:start w:val="1"/>
+      <w:numFmt w:val="bullet"/>
+      <w:lvlText w:val="o"/>
+      <w:lvlJc w:val="left"/>
+      <w:pPr>
+        <w:ind w:left="6120" w:hanging="360"/>
+      </w:pPr>
+      <w:rPr>
+        <w:rFonts w:ascii="Courier New" w:hAnsi="Courier New" w:cs="Courier New" w:hint="default"/>
+      </w:rPr>
+    </w:lvl>
+    <w:lvl w:ilvl="8" w:tplc="04090005" w:tentative="1">
+      <w:start w:val="1"/>
+      <w:numFmt w:val="bullet"/>
+      <w:lvlText w:val=""/>
+      <w:lvlJc w:val="left"/>
+      <w:pPr>
+        <w:ind w:left="6840" w:hanging="360"/>
+      </w:pPr>
+      <w:rPr>
+        <w:rFonts w:ascii="Wingdings" w:hAnsi="Wingdings" w:hint="default"/>
+      </w:rPr>
+    </w:lvl>
+  </w:abstractNum>
+  <w:abstractNum w:abstractNumId="9" w15:restartNumberingAfterBreak="0">
     <w:nsid w:val="4951601C"/>
     <w:multiLevelType w:val="hybridMultilevel"/>
     <w:tmpl w:val="D9902C00"/>
@@ -3190,7 +5896,120 @@
       </w:rPr>
     </w:lvl>
   </w:abstractNum>
-  <w:abstractNum w:abstractNumId="5" w15:restartNumberingAfterBreak="0">
+  <w:abstractNum w:abstractNumId="10" w15:restartNumberingAfterBreak="0">
+    <w:nsid w:val="49615371"/>
+    <w:multiLevelType w:val="hybridMultilevel"/>
+    <w:tmpl w:val="DDE425D2"/>
+    <w:lvl w:ilvl="0" w:tplc="04090003">
+      <w:start w:val="1"/>
+      <w:numFmt w:val="bullet"/>
+      <w:lvlText w:val="o"/>
+      <w:lvlJc w:val="left"/>
+      <w:pPr>
+        <w:ind w:left="1080" w:hanging="360"/>
+      </w:pPr>
+      <w:rPr>
+        <w:rFonts w:ascii="Courier New" w:hAnsi="Courier New" w:cs="Courier New" w:hint="default"/>
+      </w:rPr>
+    </w:lvl>
+    <w:lvl w:ilvl="1" w:tplc="04090003" w:tentative="1">
+      <w:start w:val="1"/>
+      <w:numFmt w:val="bullet"/>
+      <w:lvlText w:val="o"/>
+      <w:lvlJc w:val="left"/>
+      <w:pPr>
+        <w:ind w:left="1800" w:hanging="360"/>
+      </w:pPr>
+      <w:rPr>
+        <w:rFonts w:ascii="Courier New" w:hAnsi="Courier New" w:cs="Courier New" w:hint="default"/>
+      </w:rPr>
+    </w:lvl>
+    <w:lvl w:ilvl="2" w:tplc="04090005" w:tentative="1">
+      <w:start w:val="1"/>
+      <w:numFmt w:val="bullet"/>
+      <w:lvlText w:val=""/>
+      <w:lvlJc w:val="left"/>
+      <w:pPr>
+        <w:ind w:left="2520" w:hanging="360"/>
+      </w:pPr>
+      <w:rPr>
+        <w:rFonts w:ascii="Wingdings" w:hAnsi="Wingdings" w:hint="default"/>
+      </w:rPr>
+    </w:lvl>
+    <w:lvl w:ilvl="3" w:tplc="04090001" w:tentative="1">
+      <w:start w:val="1"/>
+      <w:numFmt w:val="bullet"/>
+      <w:lvlText w:val=""/>
+      <w:lvlJc w:val="left"/>
+      <w:pPr>
+        <w:ind w:left="3240" w:hanging="360"/>
+      </w:pPr>
+      <w:rPr>
+        <w:rFonts w:ascii="Symbol" w:hAnsi="Symbol" w:hint="default"/>
+      </w:rPr>
+    </w:lvl>
+    <w:lvl w:ilvl="4" w:tplc="04090003" w:tentative="1">
+      <w:start w:val="1"/>
+      <w:numFmt w:val="bullet"/>
+      <w:lvlText w:val="o"/>
+      <w:lvlJc w:val="left"/>
+      <w:pPr>
+        <w:ind w:left="3960" w:hanging="360"/>
+      </w:pPr>
+      <w:rPr>
+        <w:rFonts w:ascii="Courier New" w:hAnsi="Courier New" w:cs="Courier New" w:hint="default"/>
+      </w:rPr>
+    </w:lvl>
+    <w:lvl w:ilvl="5" w:tplc="04090005" w:tentative="1">
+      <w:start w:val="1"/>
+      <w:numFmt w:val="bullet"/>
+      <w:lvlText w:val=""/>
+      <w:lvlJc w:val="left"/>
+      <w:pPr>
+        <w:ind w:left="4680" w:hanging="360"/>
+      </w:pPr>
+      <w:rPr>
+        <w:rFonts w:ascii="Wingdings" w:hAnsi="Wingdings" w:hint="default"/>
+      </w:rPr>
+    </w:lvl>
+    <w:lvl w:ilvl="6" w:tplc="04090001" w:tentative="1">
+      <w:start w:val="1"/>
+      <w:numFmt w:val="bullet"/>
+      <w:lvlText w:val=""/>
+      <w:lvlJc w:val="left"/>
+      <w:pPr>
+        <w:ind w:left="5400" w:hanging="360"/>
+      </w:pPr>
+      <w:rPr>
+        <w:rFonts w:ascii="Symbol" w:hAnsi="Symbol" w:hint="default"/>
+      </w:rPr>
+    </w:lvl>
+    <w:lvl w:ilvl="7" w:tplc="04090003" w:tentative="1">
+      <w:start w:val="1"/>
+      <w:numFmt w:val="bullet"/>
+      <w:lvlText w:val="o"/>
+      <w:lvlJc w:val="left"/>
+      <w:pPr>
+        <w:ind w:left="6120" w:hanging="360"/>
+      </w:pPr>
+      <w:rPr>
+        <w:rFonts w:ascii="Courier New" w:hAnsi="Courier New" w:cs="Courier New" w:hint="default"/>
+      </w:rPr>
+    </w:lvl>
+    <w:lvl w:ilvl="8" w:tplc="04090005" w:tentative="1">
+      <w:start w:val="1"/>
+      <w:numFmt w:val="bullet"/>
+      <w:lvlText w:val=""/>
+      <w:lvlJc w:val="left"/>
+      <w:pPr>
+        <w:ind w:left="6840" w:hanging="360"/>
+      </w:pPr>
+      <w:rPr>
+        <w:rFonts w:ascii="Wingdings" w:hAnsi="Wingdings" w:hint="default"/>
+      </w:rPr>
+    </w:lvl>
+  </w:abstractNum>
+  <w:abstractNum w:abstractNumId="11" w15:restartNumberingAfterBreak="0">
     <w:nsid w:val="4A265569"/>
     <w:multiLevelType w:val="hybridMultilevel"/>
     <w:tmpl w:val="D68A27CE"/>
@@ -3303,7 +6122,382 @@
       </w:rPr>
     </w:lvl>
   </w:abstractNum>
-  <w:abstractNum w:abstractNumId="6" w15:restartNumberingAfterBreak="0">
+  <w:abstractNum w:abstractNumId="12" w15:restartNumberingAfterBreak="0">
+    <w:nsid w:val="50DD6CE4"/>
+    <w:multiLevelType w:val="hybridMultilevel"/>
+    <w:tmpl w:val="52D40DFA"/>
+    <w:lvl w:ilvl="0" w:tplc="04090001">
+      <w:start w:val="1"/>
+      <w:numFmt w:val="bullet"/>
+      <w:lvlText w:val=""/>
+      <w:lvlJc w:val="left"/>
+      <w:pPr>
+        <w:ind w:left="1080" w:hanging="360"/>
+      </w:pPr>
+      <w:rPr>
+        <w:rFonts w:ascii="Symbol" w:hAnsi="Symbol" w:hint="default"/>
+      </w:rPr>
+    </w:lvl>
+    <w:lvl w:ilvl="1" w:tplc="04090003" w:tentative="1">
+      <w:start w:val="1"/>
+      <w:numFmt w:val="bullet"/>
+      <w:lvlText w:val="o"/>
+      <w:lvlJc w:val="left"/>
+      <w:pPr>
+        <w:ind w:left="1800" w:hanging="360"/>
+      </w:pPr>
+      <w:rPr>
+        <w:rFonts w:ascii="Courier New" w:hAnsi="Courier New" w:cs="Courier New" w:hint="default"/>
+      </w:rPr>
+    </w:lvl>
+    <w:lvl w:ilvl="2" w:tplc="04090005" w:tentative="1">
+      <w:start w:val="1"/>
+      <w:numFmt w:val="bullet"/>
+      <w:lvlText w:val=""/>
+      <w:lvlJc w:val="left"/>
+      <w:pPr>
+        <w:ind w:left="2520" w:hanging="360"/>
+      </w:pPr>
+      <w:rPr>
+        <w:rFonts w:ascii="Wingdings" w:hAnsi="Wingdings" w:hint="default"/>
+      </w:rPr>
+    </w:lvl>
+    <w:lvl w:ilvl="3" w:tplc="04090001" w:tentative="1">
+      <w:start w:val="1"/>
+      <w:numFmt w:val="bullet"/>
+      <w:lvlText w:val=""/>
+      <w:lvlJc w:val="left"/>
+      <w:pPr>
+        <w:ind w:left="3240" w:hanging="360"/>
+      </w:pPr>
+      <w:rPr>
+        <w:rFonts w:ascii="Symbol" w:hAnsi="Symbol" w:hint="default"/>
+      </w:rPr>
+    </w:lvl>
+    <w:lvl w:ilvl="4" w:tplc="04090003" w:tentative="1">
+      <w:start w:val="1"/>
+      <w:numFmt w:val="bullet"/>
+      <w:lvlText w:val="o"/>
+      <w:lvlJc w:val="left"/>
+      <w:pPr>
+        <w:ind w:left="3960" w:hanging="360"/>
+      </w:pPr>
+      <w:rPr>
+        <w:rFonts w:ascii="Courier New" w:hAnsi="Courier New" w:cs="Courier New" w:hint="default"/>
+      </w:rPr>
+    </w:lvl>
+    <w:lvl w:ilvl="5" w:tplc="04090005" w:tentative="1">
+      <w:start w:val="1"/>
+      <w:numFmt w:val="bullet"/>
+      <w:lvlText w:val=""/>
+      <w:lvlJc w:val="left"/>
+      <w:pPr>
+        <w:ind w:left="4680" w:hanging="360"/>
+      </w:pPr>
+      <w:rPr>
+        <w:rFonts w:ascii="Wingdings" w:hAnsi="Wingdings" w:hint="default"/>
+      </w:rPr>
+    </w:lvl>
+    <w:lvl w:ilvl="6" w:tplc="04090001" w:tentative="1">
+      <w:start w:val="1"/>
+      <w:numFmt w:val="bullet"/>
+      <w:lvlText w:val=""/>
+      <w:lvlJc w:val="left"/>
+      <w:pPr>
+        <w:ind w:left="5400" w:hanging="360"/>
+      </w:pPr>
+      <w:rPr>
+        <w:rFonts w:ascii="Symbol" w:hAnsi="Symbol" w:hint="default"/>
+      </w:rPr>
+    </w:lvl>
+    <w:lvl w:ilvl="7" w:tplc="04090003" w:tentative="1">
+      <w:start w:val="1"/>
+      <w:numFmt w:val="bullet"/>
+      <w:lvlText w:val="o"/>
+      <w:lvlJc w:val="left"/>
+      <w:pPr>
+        <w:ind w:left="6120" w:hanging="360"/>
+      </w:pPr>
+      <w:rPr>
+        <w:rFonts w:ascii="Courier New" w:hAnsi="Courier New" w:cs="Courier New" w:hint="default"/>
+      </w:rPr>
+    </w:lvl>
+    <w:lvl w:ilvl="8" w:tplc="04090005" w:tentative="1">
+      <w:start w:val="1"/>
+      <w:numFmt w:val="bullet"/>
+      <w:lvlText w:val=""/>
+      <w:lvlJc w:val="left"/>
+      <w:pPr>
+        <w:ind w:left="6840" w:hanging="360"/>
+      </w:pPr>
+      <w:rPr>
+        <w:rFonts w:ascii="Wingdings" w:hAnsi="Wingdings" w:hint="default"/>
+      </w:rPr>
+    </w:lvl>
+  </w:abstractNum>
+  <w:abstractNum w:abstractNumId="13" w15:restartNumberingAfterBreak="0">
+    <w:nsid w:val="51864EC5"/>
+    <w:multiLevelType w:val="multilevel"/>
+    <w:tmpl w:val="2C84421C"/>
+    <w:lvl w:ilvl="0">
+      <w:start w:val="1"/>
+      <w:numFmt w:val="bullet"/>
+      <w:lvlText w:val=""/>
+      <w:lvlJc w:val="left"/>
+      <w:pPr>
+        <w:tabs>
+          <w:tab w:val="num" w:pos="720"/>
+        </w:tabs>
+        <w:ind w:left="720" w:hanging="360"/>
+      </w:pPr>
+      <w:rPr>
+        <w:rFonts w:ascii="Symbol" w:hAnsi="Symbol" w:hint="default"/>
+        <w:sz w:val="20"/>
+      </w:rPr>
+    </w:lvl>
+    <w:lvl w:ilvl="1" w:tentative="1">
+      <w:start w:val="1"/>
+      <w:numFmt w:val="bullet"/>
+      <w:lvlText w:val="o"/>
+      <w:lvlJc w:val="left"/>
+      <w:pPr>
+        <w:tabs>
+          <w:tab w:val="num" w:pos="1440"/>
+        </w:tabs>
+        <w:ind w:left="1440" w:hanging="360"/>
+      </w:pPr>
+      <w:rPr>
+        <w:rFonts w:ascii="Courier New" w:hAnsi="Courier New" w:hint="default"/>
+        <w:sz w:val="20"/>
+      </w:rPr>
+    </w:lvl>
+    <w:lvl w:ilvl="2" w:tentative="1">
+      <w:start w:val="1"/>
+      <w:numFmt w:val="bullet"/>
+      <w:lvlText w:val=""/>
+      <w:lvlJc w:val="left"/>
+      <w:pPr>
+        <w:tabs>
+          <w:tab w:val="num" w:pos="2160"/>
+        </w:tabs>
+        <w:ind w:left="2160" w:hanging="360"/>
+      </w:pPr>
+      <w:rPr>
+        <w:rFonts w:ascii="Wingdings" w:hAnsi="Wingdings" w:hint="default"/>
+        <w:sz w:val="20"/>
+      </w:rPr>
+    </w:lvl>
+    <w:lvl w:ilvl="3" w:tentative="1">
+      <w:start w:val="1"/>
+      <w:numFmt w:val="bullet"/>
+      <w:lvlText w:val=""/>
+      <w:lvlJc w:val="left"/>
+      <w:pPr>
+        <w:tabs>
+          <w:tab w:val="num" w:pos="2880"/>
+        </w:tabs>
+        <w:ind w:left="2880" w:hanging="360"/>
+      </w:pPr>
+      <w:rPr>
+        <w:rFonts w:ascii="Wingdings" w:hAnsi="Wingdings" w:hint="default"/>
+        <w:sz w:val="20"/>
+      </w:rPr>
+    </w:lvl>
+    <w:lvl w:ilvl="4" w:tentative="1">
+      <w:start w:val="1"/>
+      <w:numFmt w:val="bullet"/>
+      <w:lvlText w:val=""/>
+      <w:lvlJc w:val="left"/>
+      <w:pPr>
+        <w:tabs>
+          <w:tab w:val="num" w:pos="3600"/>
+        </w:tabs>
+        <w:ind w:left="3600" w:hanging="360"/>
+      </w:pPr>
+      <w:rPr>
+        <w:rFonts w:ascii="Wingdings" w:hAnsi="Wingdings" w:hint="default"/>
+        <w:sz w:val="20"/>
+      </w:rPr>
+    </w:lvl>
+    <w:lvl w:ilvl="5" w:tentative="1">
+      <w:start w:val="1"/>
+      <w:numFmt w:val="bullet"/>
+      <w:lvlText w:val=""/>
+      <w:lvlJc w:val="left"/>
+      <w:pPr>
+        <w:tabs>
+          <w:tab w:val="num" w:pos="4320"/>
+        </w:tabs>
+        <w:ind w:left="4320" w:hanging="360"/>
+      </w:pPr>
+      <w:rPr>
+        <w:rFonts w:ascii="Wingdings" w:hAnsi="Wingdings" w:hint="default"/>
+        <w:sz w:val="20"/>
+      </w:rPr>
+    </w:lvl>
+    <w:lvl w:ilvl="6" w:tentative="1">
+      <w:start w:val="1"/>
+      <w:numFmt w:val="bullet"/>
+      <w:lvlText w:val=""/>
+      <w:lvlJc w:val="left"/>
+      <w:pPr>
+        <w:tabs>
+          <w:tab w:val="num" w:pos="5040"/>
+        </w:tabs>
+        <w:ind w:left="5040" w:hanging="360"/>
+      </w:pPr>
+      <w:rPr>
+        <w:rFonts w:ascii="Wingdings" w:hAnsi="Wingdings" w:hint="default"/>
+        <w:sz w:val="20"/>
+      </w:rPr>
+    </w:lvl>
+    <w:lvl w:ilvl="7" w:tentative="1">
+      <w:start w:val="1"/>
+      <w:numFmt w:val="bullet"/>
+      <w:lvlText w:val=""/>
+      <w:lvlJc w:val="left"/>
+      <w:pPr>
+        <w:tabs>
+          <w:tab w:val="num" w:pos="5760"/>
+        </w:tabs>
+        <w:ind w:left="5760" w:hanging="360"/>
+      </w:pPr>
+      <w:rPr>
+        <w:rFonts w:ascii="Wingdings" w:hAnsi="Wingdings" w:hint="default"/>
+        <w:sz w:val="20"/>
+      </w:rPr>
+    </w:lvl>
+    <w:lvl w:ilvl="8" w:tentative="1">
+      <w:start w:val="1"/>
+      <w:numFmt w:val="bullet"/>
+      <w:lvlText w:val=""/>
+      <w:lvlJc w:val="left"/>
+      <w:pPr>
+        <w:tabs>
+          <w:tab w:val="num" w:pos="6480"/>
+        </w:tabs>
+        <w:ind w:left="6480" w:hanging="360"/>
+      </w:pPr>
+      <w:rPr>
+        <w:rFonts w:ascii="Wingdings" w:hAnsi="Wingdings" w:hint="default"/>
+        <w:sz w:val="20"/>
+      </w:rPr>
+    </w:lvl>
+  </w:abstractNum>
+  <w:abstractNum w:abstractNumId="14" w15:restartNumberingAfterBreak="0">
+    <w:nsid w:val="52A53BE4"/>
+    <w:multiLevelType w:val="hybridMultilevel"/>
+    <w:tmpl w:val="C6E26A1E"/>
+    <w:lvl w:ilvl="0" w:tplc="04090001">
+      <w:start w:val="1"/>
+      <w:numFmt w:val="bullet"/>
+      <w:lvlText w:val=""/>
+      <w:lvlJc w:val="left"/>
+      <w:pPr>
+        <w:ind w:left="1080" w:hanging="360"/>
+      </w:pPr>
+      <w:rPr>
+        <w:rFonts w:ascii="Symbol" w:hAnsi="Symbol" w:hint="default"/>
+      </w:rPr>
+    </w:lvl>
+    <w:lvl w:ilvl="1" w:tplc="04090003" w:tentative="1">
+      <w:start w:val="1"/>
+      <w:numFmt w:val="bullet"/>
+      <w:lvlText w:val="o"/>
+      <w:lvlJc w:val="left"/>
+      <w:pPr>
+        <w:ind w:left="1800" w:hanging="360"/>
+      </w:pPr>
+      <w:rPr>
+        <w:rFonts w:ascii="Courier New" w:hAnsi="Courier New" w:cs="Courier New" w:hint="default"/>
+      </w:rPr>
+    </w:lvl>
+    <w:lvl w:ilvl="2" w:tplc="04090005" w:tentative="1">
+      <w:start w:val="1"/>
+      <w:numFmt w:val="bullet"/>
+      <w:lvlText w:val=""/>
+      <w:lvlJc w:val="left"/>
+      <w:pPr>
+        <w:ind w:left="2520" w:hanging="360"/>
+      </w:pPr>
+      <w:rPr>
+        <w:rFonts w:ascii="Wingdings" w:hAnsi="Wingdings" w:hint="default"/>
+      </w:rPr>
+    </w:lvl>
+    <w:lvl w:ilvl="3" w:tplc="04090001" w:tentative="1">
+      <w:start w:val="1"/>
+      <w:numFmt w:val="bullet"/>
+      <w:lvlText w:val=""/>
+      <w:lvlJc w:val="left"/>
+      <w:pPr>
+        <w:ind w:left="3240" w:hanging="360"/>
+      </w:pPr>
+      <w:rPr>
+        <w:rFonts w:ascii="Symbol" w:hAnsi="Symbol" w:hint="default"/>
+      </w:rPr>
+    </w:lvl>
+    <w:lvl w:ilvl="4" w:tplc="04090003" w:tentative="1">
+      <w:start w:val="1"/>
+      <w:numFmt w:val="bullet"/>
+      <w:lvlText w:val="o"/>
+      <w:lvlJc w:val="left"/>
+      <w:pPr>
+        <w:ind w:left="3960" w:hanging="360"/>
+      </w:pPr>
+      <w:rPr>
+        <w:rFonts w:ascii="Courier New" w:hAnsi="Courier New" w:cs="Courier New" w:hint="default"/>
+      </w:rPr>
+    </w:lvl>
+    <w:lvl w:ilvl="5" w:tplc="04090005" w:tentative="1">
+      <w:start w:val="1"/>
+      <w:numFmt w:val="bullet"/>
+      <w:lvlText w:val=""/>
+      <w:lvlJc w:val="left"/>
+      <w:pPr>
+        <w:ind w:left="4680" w:hanging="360"/>
+      </w:pPr>
+      <w:rPr>
+        <w:rFonts w:ascii="Wingdings" w:hAnsi="Wingdings" w:hint="default"/>
+      </w:rPr>
+    </w:lvl>
+    <w:lvl w:ilvl="6" w:tplc="04090001" w:tentative="1">
+      <w:start w:val="1"/>
+      <w:numFmt w:val="bullet"/>
+      <w:lvlText w:val=""/>
+      <w:lvlJc w:val="left"/>
+      <w:pPr>
+        <w:ind w:left="5400" w:hanging="360"/>
+      </w:pPr>
+      <w:rPr>
+        <w:rFonts w:ascii="Symbol" w:hAnsi="Symbol" w:hint="default"/>
+      </w:rPr>
+    </w:lvl>
+    <w:lvl w:ilvl="7" w:tplc="04090003" w:tentative="1">
+      <w:start w:val="1"/>
+      <w:numFmt w:val="bullet"/>
+      <w:lvlText w:val="o"/>
+      <w:lvlJc w:val="left"/>
+      <w:pPr>
+        <w:ind w:left="6120" w:hanging="360"/>
+      </w:pPr>
+      <w:rPr>
+        <w:rFonts w:ascii="Courier New" w:hAnsi="Courier New" w:cs="Courier New" w:hint="default"/>
+      </w:rPr>
+    </w:lvl>
+    <w:lvl w:ilvl="8" w:tplc="04090005" w:tentative="1">
+      <w:start w:val="1"/>
+      <w:numFmt w:val="bullet"/>
+      <w:lvlText w:val=""/>
+      <w:lvlJc w:val="left"/>
+      <w:pPr>
+        <w:ind w:left="6840" w:hanging="360"/>
+      </w:pPr>
+      <w:rPr>
+        <w:rFonts w:ascii="Wingdings" w:hAnsi="Wingdings" w:hint="default"/>
+      </w:rPr>
+    </w:lvl>
+  </w:abstractNum>
+  <w:abstractNum w:abstractNumId="15" w15:restartNumberingAfterBreak="0">
     <w:nsid w:val="57AB13C7"/>
     <w:multiLevelType w:val="hybridMultilevel"/>
     <w:tmpl w:val="F2FA0B7E"/>
@@ -3416,7 +6610,120 @@
       </w:rPr>
     </w:lvl>
   </w:abstractNum>
-  <w:abstractNum w:abstractNumId="7" w15:restartNumberingAfterBreak="0">
+  <w:abstractNum w:abstractNumId="16" w15:restartNumberingAfterBreak="0">
+    <w:nsid w:val="6E2C62E0"/>
+    <w:multiLevelType w:val="hybridMultilevel"/>
+    <w:tmpl w:val="09F0B45C"/>
+    <w:lvl w:ilvl="0" w:tplc="04090001">
+      <w:start w:val="1"/>
+      <w:numFmt w:val="bullet"/>
+      <w:lvlText w:val=""/>
+      <w:lvlJc w:val="left"/>
+      <w:pPr>
+        <w:ind w:left="1080" w:hanging="360"/>
+      </w:pPr>
+      <w:rPr>
+        <w:rFonts w:ascii="Symbol" w:hAnsi="Symbol" w:hint="default"/>
+      </w:rPr>
+    </w:lvl>
+    <w:lvl w:ilvl="1" w:tplc="04090003" w:tentative="1">
+      <w:start w:val="1"/>
+      <w:numFmt w:val="bullet"/>
+      <w:lvlText w:val="o"/>
+      <w:lvlJc w:val="left"/>
+      <w:pPr>
+        <w:ind w:left="1800" w:hanging="360"/>
+      </w:pPr>
+      <w:rPr>
+        <w:rFonts w:ascii="Courier New" w:hAnsi="Courier New" w:cs="Courier New" w:hint="default"/>
+      </w:rPr>
+    </w:lvl>
+    <w:lvl w:ilvl="2" w:tplc="04090005" w:tentative="1">
+      <w:start w:val="1"/>
+      <w:numFmt w:val="bullet"/>
+      <w:lvlText w:val=""/>
+      <w:lvlJc w:val="left"/>
+      <w:pPr>
+        <w:ind w:left="2520" w:hanging="360"/>
+      </w:pPr>
+      <w:rPr>
+        <w:rFonts w:ascii="Wingdings" w:hAnsi="Wingdings" w:hint="default"/>
+      </w:rPr>
+    </w:lvl>
+    <w:lvl w:ilvl="3" w:tplc="04090001" w:tentative="1">
+      <w:start w:val="1"/>
+      <w:numFmt w:val="bullet"/>
+      <w:lvlText w:val=""/>
+      <w:lvlJc w:val="left"/>
+      <w:pPr>
+        <w:ind w:left="3240" w:hanging="360"/>
+      </w:pPr>
+      <w:rPr>
+        <w:rFonts w:ascii="Symbol" w:hAnsi="Symbol" w:hint="default"/>
+      </w:rPr>
+    </w:lvl>
+    <w:lvl w:ilvl="4" w:tplc="04090003" w:tentative="1">
+      <w:start w:val="1"/>
+      <w:numFmt w:val="bullet"/>
+      <w:lvlText w:val="o"/>
+      <w:lvlJc w:val="left"/>
+      <w:pPr>
+        <w:ind w:left="3960" w:hanging="360"/>
+      </w:pPr>
+      <w:rPr>
+        <w:rFonts w:ascii="Courier New" w:hAnsi="Courier New" w:cs="Courier New" w:hint="default"/>
+      </w:rPr>
+    </w:lvl>
+    <w:lvl w:ilvl="5" w:tplc="04090005" w:tentative="1">
+      <w:start w:val="1"/>
+      <w:numFmt w:val="bullet"/>
+      <w:lvlText w:val=""/>
+      <w:lvlJc w:val="left"/>
+      <w:pPr>
+        <w:ind w:left="4680" w:hanging="360"/>
+      </w:pPr>
+      <w:rPr>
+        <w:rFonts w:ascii="Wingdings" w:hAnsi="Wingdings" w:hint="default"/>
+      </w:rPr>
+    </w:lvl>
+    <w:lvl w:ilvl="6" w:tplc="04090001" w:tentative="1">
+      <w:start w:val="1"/>
+      <w:numFmt w:val="bullet"/>
+      <w:lvlText w:val=""/>
+      <w:lvlJc w:val="left"/>
+      <w:pPr>
+        <w:ind w:left="5400" w:hanging="360"/>
+      </w:pPr>
+      <w:rPr>
+        <w:rFonts w:ascii="Symbol" w:hAnsi="Symbol" w:hint="default"/>
+      </w:rPr>
+    </w:lvl>
+    <w:lvl w:ilvl="7" w:tplc="04090003" w:tentative="1">
+      <w:start w:val="1"/>
+      <w:numFmt w:val="bullet"/>
+      <w:lvlText w:val="o"/>
+      <w:lvlJc w:val="left"/>
+      <w:pPr>
+        <w:ind w:left="6120" w:hanging="360"/>
+      </w:pPr>
+      <w:rPr>
+        <w:rFonts w:ascii="Courier New" w:hAnsi="Courier New" w:cs="Courier New" w:hint="default"/>
+      </w:rPr>
+    </w:lvl>
+    <w:lvl w:ilvl="8" w:tplc="04090005" w:tentative="1">
+      <w:start w:val="1"/>
+      <w:numFmt w:val="bullet"/>
+      <w:lvlText w:val=""/>
+      <w:lvlJc w:val="left"/>
+      <w:pPr>
+        <w:ind w:left="6840" w:hanging="360"/>
+      </w:pPr>
+      <w:rPr>
+        <w:rFonts w:ascii="Wingdings" w:hAnsi="Wingdings" w:hint="default"/>
+      </w:rPr>
+    </w:lvl>
+  </w:abstractNum>
+  <w:abstractNum w:abstractNumId="17" w15:restartNumberingAfterBreak="0">
     <w:nsid w:val="721A24C1"/>
     <w:multiLevelType w:val="hybridMultilevel"/>
     <w:tmpl w:val="581A38B8"/>
@@ -3529,7 +6836,7 @@
       </w:rPr>
     </w:lvl>
   </w:abstractNum>
-  <w:abstractNum w:abstractNumId="8" w15:restartNumberingAfterBreak="0">
+  <w:abstractNum w:abstractNumId="18" w15:restartNumberingAfterBreak="0">
     <w:nsid w:val="77C16ED4"/>
     <w:multiLevelType w:val="hybridMultilevel"/>
     <w:tmpl w:val="39304592"/>
@@ -3642,7 +6949,7 @@
       </w:rPr>
     </w:lvl>
   </w:abstractNum>
-  <w:abstractNum w:abstractNumId="9" w15:restartNumberingAfterBreak="0">
+  <w:abstractNum w:abstractNumId="19" w15:restartNumberingAfterBreak="0">
     <w:nsid w:val="79F7437E"/>
     <w:multiLevelType w:val="hybridMultilevel"/>
     <w:tmpl w:val="EA3E0D58"/>
@@ -3756,13 +7063,13 @@
     </w:lvl>
   </w:abstractNum>
   <w:num w:numId="1" w16cid:durableId="2124877233">
-    <w:abstractNumId w:val="7"/>
+    <w:abstractNumId w:val="17"/>
   </w:num>
   <w:num w:numId="2" w16cid:durableId="286358884">
-    <w:abstractNumId w:val="5"/>
+    <w:abstractNumId w:val="11"/>
   </w:num>
   <w:num w:numId="3" w16cid:durableId="865102172">
-    <w:abstractNumId w:val="4"/>
+    <w:abstractNumId w:val="9"/>
   </w:num>
   <w:num w:numId="4" w16cid:durableId="1216503814">
     <w:abstractNumId w:val="1"/>
@@ -3771,19 +7078,49 @@
     <w:abstractNumId w:val="0"/>
   </w:num>
   <w:num w:numId="6" w16cid:durableId="288055700">
+    <w:abstractNumId w:val="4"/>
+  </w:num>
+  <w:num w:numId="7" w16cid:durableId="1693140301">
+    <w:abstractNumId w:val="15"/>
+  </w:num>
+  <w:num w:numId="8" w16cid:durableId="1673292260">
+    <w:abstractNumId w:val="5"/>
+  </w:num>
+  <w:num w:numId="9" w16cid:durableId="858084437">
+    <w:abstractNumId w:val="18"/>
+  </w:num>
+  <w:num w:numId="10" w16cid:durableId="1195970887">
+    <w:abstractNumId w:val="19"/>
+  </w:num>
+  <w:num w:numId="11" w16cid:durableId="1191189422">
     <w:abstractNumId w:val="2"/>
   </w:num>
-  <w:num w:numId="7" w16cid:durableId="1693140301">
+  <w:num w:numId="12" w16cid:durableId="2132361771">
+    <w:abstractNumId w:val="3"/>
+  </w:num>
+  <w:num w:numId="13" w16cid:durableId="1604413879">
+    <w:abstractNumId w:val="12"/>
+  </w:num>
+  <w:num w:numId="14" w16cid:durableId="69355467">
+    <w:abstractNumId w:val="16"/>
+  </w:num>
+  <w:num w:numId="15" w16cid:durableId="1462729824">
+    <w:abstractNumId w:val="8"/>
+  </w:num>
+  <w:num w:numId="16" w16cid:durableId="1342314781">
+    <w:abstractNumId w:val="13"/>
+  </w:num>
+  <w:num w:numId="17" w16cid:durableId="1913008376">
+    <w:abstractNumId w:val="7"/>
+  </w:num>
+  <w:num w:numId="18" w16cid:durableId="147134266">
+    <w:abstractNumId w:val="10"/>
+  </w:num>
+  <w:num w:numId="19" w16cid:durableId="1590651745">
     <w:abstractNumId w:val="6"/>
   </w:num>
-  <w:num w:numId="8" w16cid:durableId="1673292260">
-    <w:abstractNumId w:val="3"/>
-  </w:num>
-  <w:num w:numId="9" w16cid:durableId="858084437">
-    <w:abstractNumId w:val="8"/>
-  </w:num>
-  <w:num w:numId="10" w16cid:durableId="1195970887">
-    <w:abstractNumId w:val="9"/>
+  <w:num w:numId="20" w16cid:durableId="318459590">
+    <w:abstractNumId w:val="14"/>
   </w:num>
 </w:numbering>
 </file>
@@ -4708,7 +8045,6 @@
     <w:name w:val="Normal (Web)"/>
     <w:basedOn w:val="Normal"/>
     <w:uiPriority w:val="99"/>
-    <w:semiHidden/>
     <w:unhideWhenUsed/>
     <w:rsid w:val="003C7E94"/>
     <w:pPr>
@@ -4725,7 +8061,6 @@
     <w:basedOn w:val="Normal"/>
     <w:link w:val="HTMLPreformattedChar"/>
     <w:uiPriority w:val="99"/>
-    <w:semiHidden/>
     <w:unhideWhenUsed/>
     <w:rsid w:val="00D16CB8"/>
     <w:pPr>
@@ -4762,7 +8097,6 @@
     <w:basedOn w:val="DefaultParagraphFont"/>
     <w:link w:val="HTMLPreformatted"/>
     <w:uiPriority w:val="99"/>
-    <w:semiHidden/>
     <w:rsid w:val="00D16CB8"/>
     <w:rPr>
       <w:rFonts w:ascii="Courier New" w:eastAsia="Times New Roman" w:hAnsi="Courier New" w:cs="Courier New"/>

</xml_diff>